<commit_message>
Enforce reference fonts and paragraph-level textboxes
</commit_message>
<xml_diff>
--- a/assets/layout-reference.docx
+++ b/assets/layout-reference.docx
@@ -367,8 +367,8 @@
                             <w:rPr>
                               <w:rFonts w:ascii="Times New Roman" w:hAnsi="Times New Roman" w:eastAsia="KaiTi"/>
                               <w:color w:val="0000FF"/>
-                              <w:sz w:val="22"/>
-                              <w:szCs w:val="22"/>
+                              <w:sz w:val="21"/>
+                              <w:szCs w:val="21"/>
                               <w:u w:val="single"/>
                             </w:rPr>
                             <w:t xml:space="preserve">example.com/github</w:t>
@@ -616,20 +616,15 @@
                     <w:txbxContent>
                       <w:p>
                         <w:pPr>
+                          <w:numPr>
+                            <w:ilvl w:val="0"/>
+                            <w:numId w:val="10"/>
+                          </w:numPr>
                           <w:snapToGrid w:val="0"/>
                           <w:spacing w:before="0" w:after="0" w:line="288" w:lineRule="auto"/>
                           <w:ind w:left="142" w:hanging="142"/>
                           <w:jc w:val="both"/>
                         </w:pPr>
-                        <w:r>
-                          <w:rPr>
-                            <w:rFonts w:ascii="Arial" w:hAnsi="Arial" w:eastAsia="Arial"/>
-                            <w:color w:val="262626"/>
-                            <w:sz w:val="21"/>
-                            <w:szCs w:val="21"/>
-                          </w:rPr>
-                          <w:t xml:space="preserve">• </w:t>
-                        </w:r>
                         <w:r>
                           <w:rPr>
                             <w:rFonts w:ascii="Times New Roman" w:hAnsi="Times New Roman" w:eastAsia="KaiTi"/>
@@ -828,20 +823,15 @@
                     <w:txbxContent>
                       <w:p>
                         <w:pPr>
+                          <w:numPr>
+                            <w:ilvl w:val="0"/>
+                            <w:numId w:val="10"/>
+                          </w:numPr>
                           <w:snapToGrid w:val="0"/>
                           <w:spacing w:before="0" w:after="0" w:line="288" w:lineRule="auto"/>
                           <w:ind w:left="142" w:hanging="142"/>
                           <w:jc w:val="both"/>
                         </w:pPr>
-                        <w:r>
-                          <w:rPr>
-                            <w:rFonts w:ascii="Arial" w:hAnsi="Arial" w:eastAsia="Arial"/>
-                            <w:color w:val="262626"/>
-                            <w:sz w:val="21"/>
-                            <w:szCs w:val="21"/>
-                          </w:rPr>
-                          <w:t xml:space="preserve">• </w:t>
-                        </w:r>
                         <w:r>
                           <w:rPr>
                             <w:rFonts w:ascii="Times New Roman" w:hAnsi="Times New Roman" w:eastAsia="KaiTi"/>
@@ -1165,20 +1155,15 @@
                     <w:txbxContent>
                       <w:p>
                         <w:pPr>
+                          <w:numPr>
+                            <w:ilvl w:val="0"/>
+                            <w:numId w:val="10"/>
+                          </w:numPr>
                           <w:snapToGrid w:val="0"/>
                           <w:spacing w:before="0" w:after="0" w:line="288" w:lineRule="auto"/>
                           <w:ind w:left="142" w:hanging="142"/>
                           <w:jc w:val="both"/>
                         </w:pPr>
-                        <w:r>
-                          <w:rPr>
-                            <w:rFonts w:ascii="Arial" w:hAnsi="Arial" w:eastAsia="Arial"/>
-                            <w:color w:val="262626"/>
-                            <w:sz w:val="21"/>
-                            <w:szCs w:val="21"/>
-                          </w:rPr>
-                          <w:t xml:space="preserve">• </w:t>
-                        </w:r>
                         <w:r>
                           <w:rPr>
                             <w:rFonts w:ascii="Times New Roman" w:hAnsi="Times New Roman" w:eastAsia="KaiTi"/>
@@ -1246,20 +1231,15 @@
                     <w:txbxContent>
                       <w:p>
                         <w:pPr>
+                          <w:numPr>
+                            <w:ilvl w:val="0"/>
+                            <w:numId w:val="10"/>
+                          </w:numPr>
                           <w:snapToGrid w:val="0"/>
                           <w:spacing w:before="0" w:after="0" w:line="288" w:lineRule="auto"/>
                           <w:ind w:left="142" w:hanging="142"/>
                           <w:jc w:val="both"/>
                         </w:pPr>
-                        <w:r>
-                          <w:rPr>
-                            <w:rFonts w:ascii="Arial" w:hAnsi="Arial" w:eastAsia="Arial"/>
-                            <w:color w:val="262626"/>
-                            <w:sz w:val="21"/>
-                            <w:szCs w:val="21"/>
-                          </w:rPr>
-                          <w:t xml:space="preserve">• </w:t>
-                        </w:r>
                         <w:r>
                           <w:rPr>
                             <w:rFonts w:ascii="Times New Roman" w:hAnsi="Times New Roman" w:eastAsia="KaiTi"/>
@@ -1328,20 +1308,15 @@
                     <w:txbxContent>
                       <w:p>
                         <w:pPr>
+                          <w:numPr>
+                            <w:ilvl w:val="1"/>
+                            <w:numId w:val="10"/>
+                          </w:numPr>
                           <w:snapToGrid w:val="0"/>
                           <w:spacing w:before="0" w:after="0" w:line="288" w:lineRule="auto"/>
                           <w:ind w:left="255" w:hanging="142"/>
                           <w:jc w:val="both"/>
                         </w:pPr>
-                        <w:r>
-                          <w:rPr>
-                            <w:rFonts w:ascii="Arial" w:hAnsi="Arial" w:eastAsia="Arial"/>
-                            <w:color w:val="262626"/>
-                            <w:sz w:val="21"/>
-                            <w:szCs w:val="21"/>
-                          </w:rPr>
-                          <w:t xml:space="preserve">○ </w:t>
-                        </w:r>
                         <w:r>
                           <w:rPr>
                             <w:rFonts w:ascii="Times New Roman" w:hAnsi="Times New Roman" w:eastAsia="KaiTi"/>
@@ -1409,20 +1384,15 @@
                     <w:txbxContent>
                       <w:p>
                         <w:pPr>
+                          <w:numPr>
+                            <w:ilvl w:val="1"/>
+                            <w:numId w:val="10"/>
+                          </w:numPr>
                           <w:snapToGrid w:val="0"/>
                           <w:spacing w:before="0" w:after="0" w:line="288" w:lineRule="auto"/>
                           <w:ind w:left="255" w:hanging="142"/>
                           <w:jc w:val="both"/>
                         </w:pPr>
-                        <w:r>
-                          <w:rPr>
-                            <w:rFonts w:ascii="Arial" w:hAnsi="Arial" w:eastAsia="Arial"/>
-                            <w:color w:val="262626"/>
-                            <w:sz w:val="21"/>
-                            <w:szCs w:val="21"/>
-                          </w:rPr>
-                          <w:t xml:space="preserve">○ </w:t>
-                        </w:r>
                         <w:r>
                           <w:rPr>
                             <w:rFonts w:ascii="Times New Roman" w:hAnsi="Times New Roman" w:eastAsia="KaiTi"/>
@@ -1683,20 +1653,15 @@
                     <w:txbxContent>
                       <w:p>
                         <w:pPr>
+                          <w:numPr>
+                            <w:ilvl w:val="0"/>
+                            <w:numId w:val="10"/>
+                          </w:numPr>
                           <w:snapToGrid w:val="0"/>
                           <w:spacing w:before="0" w:after="0" w:line="288" w:lineRule="auto"/>
                           <w:ind w:left="142" w:hanging="142"/>
                           <w:jc w:val="both"/>
                         </w:pPr>
-                        <w:r>
-                          <w:rPr>
-                            <w:rFonts w:ascii="Arial" w:hAnsi="Arial" w:eastAsia="Arial"/>
-                            <w:color w:val="262626"/>
-                            <w:sz w:val="21"/>
-                            <w:szCs w:val="21"/>
-                          </w:rPr>
-                          <w:t xml:space="preserve">• </w:t>
-                        </w:r>
                         <w:r>
                           <w:rPr>
                             <w:rFonts w:ascii="Times New Roman" w:hAnsi="Times New Roman" w:eastAsia="KaiTi"/>
@@ -1764,20 +1729,15 @@
                     <w:txbxContent>
                       <w:p>
                         <w:pPr>
+                          <w:numPr>
+                            <w:ilvl w:val="0"/>
+                            <w:numId w:val="10"/>
+                          </w:numPr>
                           <w:snapToGrid w:val="0"/>
                           <w:spacing w:before="0" w:after="0" w:line="288" w:lineRule="auto"/>
                           <w:ind w:left="142" w:hanging="142"/>
                           <w:jc w:val="both"/>
                         </w:pPr>
-                        <w:r>
-                          <w:rPr>
-                            <w:rFonts w:ascii="Arial" w:hAnsi="Arial" w:eastAsia="Arial"/>
-                            <w:color w:val="262626"/>
-                            <w:sz w:val="21"/>
-                            <w:szCs w:val="21"/>
-                          </w:rPr>
-                          <w:t xml:space="preserve">• </w:t>
-                        </w:r>
                         <w:r>
                           <w:rPr>
                             <w:rFonts w:ascii="Times New Roman" w:hAnsi="Times New Roman" w:eastAsia="KaiTi"/>
@@ -1846,20 +1806,15 @@
                     <w:txbxContent>
                       <w:p>
                         <w:pPr>
+                          <w:numPr>
+                            <w:ilvl w:val="1"/>
+                            <w:numId w:val="10"/>
+                          </w:numPr>
                           <w:snapToGrid w:val="0"/>
                           <w:spacing w:before="0" w:after="0" w:line="288" w:lineRule="auto"/>
                           <w:ind w:left="255" w:hanging="142"/>
                           <w:jc w:val="both"/>
                         </w:pPr>
-                        <w:r>
-                          <w:rPr>
-                            <w:rFonts w:ascii="Arial" w:hAnsi="Arial" w:eastAsia="Arial"/>
-                            <w:color w:val="262626"/>
-                            <w:sz w:val="21"/>
-                            <w:szCs w:val="21"/>
-                          </w:rPr>
-                          <w:t xml:space="preserve">○ </w:t>
-                        </w:r>
                         <w:r>
                           <w:rPr>
                             <w:rFonts w:ascii="Times New Roman" w:hAnsi="Times New Roman" w:eastAsia="KaiTi"/>
@@ -2070,20 +2025,15 @@
                     <w:txbxContent>
                       <w:p>
                         <w:pPr>
+                          <w:numPr>
+                            <w:ilvl w:val="0"/>
+                            <w:numId w:val="10"/>
+                          </w:numPr>
                           <w:snapToGrid w:val="0"/>
                           <w:spacing w:before="0" w:after="0" w:line="288" w:lineRule="auto"/>
                           <w:ind w:left="142" w:hanging="142"/>
                           <w:jc w:val="both"/>
                         </w:pPr>
-                        <w:r>
-                          <w:rPr>
-                            <w:rFonts w:ascii="Arial" w:hAnsi="Arial" w:eastAsia="Arial"/>
-                            <w:color w:val="262626"/>
-                            <w:sz w:val="21"/>
-                            <w:szCs w:val="21"/>
-                          </w:rPr>
-                          <w:t xml:space="preserve">• </w:t>
-                        </w:r>
                         <w:r>
                           <w:rPr>
                             <w:rFonts w:ascii="Times New Roman" w:hAnsi="Times New Roman" w:eastAsia="KaiTi"/>
@@ -2151,20 +2101,15 @@
                     <w:txbxContent>
                       <w:p>
                         <w:pPr>
+                          <w:numPr>
+                            <w:ilvl w:val="0"/>
+                            <w:numId w:val="10"/>
+                          </w:numPr>
                           <w:snapToGrid w:val="0"/>
                           <w:spacing w:before="0" w:after="0" w:line="288" w:lineRule="auto"/>
                           <w:ind w:left="142" w:hanging="142"/>
                           <w:jc w:val="both"/>
                         </w:pPr>
-                        <w:r>
-                          <w:rPr>
-                            <w:rFonts w:ascii="Arial" w:hAnsi="Arial" w:eastAsia="Arial"/>
-                            <w:color w:val="262626"/>
-                            <w:sz w:val="21"/>
-                            <w:szCs w:val="21"/>
-                          </w:rPr>
-                          <w:t xml:space="preserve">• </w:t>
-                        </w:r>
                         <w:r>
                           <w:rPr>
                             <w:rFonts w:ascii="Times New Roman" w:hAnsi="Times New Roman" w:eastAsia="KaiTi"/>
@@ -2232,20 +2177,15 @@
                     <w:txbxContent>
                       <w:p>
                         <w:pPr>
+                          <w:numPr>
+                            <w:ilvl w:val="0"/>
+                            <w:numId w:val="10"/>
+                          </w:numPr>
                           <w:snapToGrid w:val="0"/>
                           <w:spacing w:before="0" w:after="0" w:line="288" w:lineRule="auto"/>
                           <w:ind w:left="142" w:hanging="142"/>
                           <w:jc w:val="both"/>
                         </w:pPr>
-                        <w:r>
-                          <w:rPr>
-                            <w:rFonts w:ascii="Arial" w:hAnsi="Arial" w:eastAsia="Arial"/>
-                            <w:color w:val="262626"/>
-                            <w:sz w:val="21"/>
-                            <w:szCs w:val="21"/>
-                          </w:rPr>
-                          <w:t xml:space="preserve">• </w:t>
-                        </w:r>
                         <w:r>
                           <w:rPr>
                             <w:rFonts w:ascii="Times New Roman" w:hAnsi="Times New Roman" w:eastAsia="KaiTi"/>
@@ -2387,20 +2327,15 @@
                     <w:txbxContent>
                       <w:p>
                         <w:pPr>
+                          <w:numPr>
+                            <w:ilvl w:val="0"/>
+                            <w:numId w:val="10"/>
+                          </w:numPr>
                           <w:snapToGrid w:val="0"/>
                           <w:spacing w:before="0" w:after="0" w:line="288" w:lineRule="auto"/>
                           <w:ind w:left="142" w:hanging="142"/>
                           <w:jc w:val="both"/>
                         </w:pPr>
-                        <w:r>
-                          <w:rPr>
-                            <w:rFonts w:ascii="Arial" w:hAnsi="Arial" w:eastAsia="Arial"/>
-                            <w:color w:val="262626"/>
-                            <w:sz w:val="21"/>
-                            <w:szCs w:val="21"/>
-                          </w:rPr>
-                          <w:t xml:space="preserve">• </w:t>
-                        </w:r>
                         <w:r>
                           <w:rPr>
                             <w:rFonts w:ascii="Times New Roman" w:hAnsi="Times New Roman" w:eastAsia="KaiTi"/>
@@ -2468,20 +2403,15 @@
                     <w:txbxContent>
                       <w:p>
                         <w:pPr>
+                          <w:numPr>
+                            <w:ilvl w:val="0"/>
+                            <w:numId w:val="10"/>
+                          </w:numPr>
                           <w:snapToGrid w:val="0"/>
                           <w:spacing w:before="0" w:after="0" w:line="288" w:lineRule="auto"/>
                           <w:ind w:left="142" w:hanging="142"/>
                           <w:jc w:val="both"/>
                         </w:pPr>
-                        <w:r>
-                          <w:rPr>
-                            <w:rFonts w:ascii="Arial" w:hAnsi="Arial" w:eastAsia="Arial"/>
-                            <w:color w:val="262626"/>
-                            <w:sz w:val="21"/>
-                            <w:szCs w:val="21"/>
-                          </w:rPr>
-                          <w:t xml:space="preserve">• </w:t>
-                        </w:r>
                         <w:r>
                           <w:rPr>
                             <w:rFonts w:ascii="Times New Roman" w:hAnsi="Times New Roman" w:eastAsia="KaiTi"/>
@@ -2549,20 +2479,15 @@
                     <w:txbxContent>
                       <w:p>
                         <w:pPr>
+                          <w:numPr>
+                            <w:ilvl w:val="0"/>
+                            <w:numId w:val="10"/>
+                          </w:numPr>
                           <w:snapToGrid w:val="0"/>
                           <w:spacing w:before="0" w:after="0" w:line="288" w:lineRule="auto"/>
                           <w:ind w:left="142" w:hanging="142"/>
                           <w:jc w:val="both"/>
                         </w:pPr>
-                        <w:r>
-                          <w:rPr>
-                            <w:rFonts w:ascii="Arial" w:hAnsi="Arial" w:eastAsia="Arial"/>
-                            <w:color w:val="262626"/>
-                            <w:sz w:val="21"/>
-                            <w:szCs w:val="21"/>
-                          </w:rPr>
-                          <w:t xml:space="preserve">• </w:t>
-                        </w:r>
                         <w:r>
                           <w:rPr>
                             <w:rFonts w:ascii="Times New Roman" w:hAnsi="Times New Roman" w:eastAsia="KaiTi"/>
@@ -3084,6 +3009,43 @@
       </w:rPr>
     </w:lvl>
   </w:abstractNum>
+  <w:abstractNum w:abstractNumId="9">
+    <w:multiLevelType w:val="multilevel"/>
+    <w:lvl w:ilvl="0">
+      <w:start w:val="1"/>
+      <w:numFmt w:val="bullet"/>
+      <w:lvlText w:val=""/>
+      <w:lvlJc w:val="left"/>
+      <w:pPr>
+        <w:tabs>
+          <w:tab w:val="num" w:pos="142"/>
+        </w:tabs>
+        <w:ind w:left="142" w:hanging="142"/>
+      </w:pPr>
+      <w:rPr>
+        <w:rFonts w:ascii="Wingdings" w:hAnsi="Wingdings" w:hint="default"/>
+        <w:sz w:val="21"/>
+        <w:szCs w:val="21"/>
+      </w:rPr>
+    </w:lvl>
+    <w:lvl w:ilvl="1">
+      <w:start w:val="1"/>
+      <w:numFmt w:val="bullet"/>
+      <w:lvlText w:val="o"/>
+      <w:lvlJc w:val="left"/>
+      <w:pPr>
+        <w:tabs>
+          <w:tab w:val="num" w:pos="255"/>
+        </w:tabs>
+        <w:ind w:left="255" w:hanging="142"/>
+      </w:pPr>
+      <w:rPr>
+        <w:rFonts w:ascii="Courier New" w:hAnsi="Courier New" w:hint="default"/>
+        <w:sz w:val="15"/>
+        <w:szCs w:val="15"/>
+      </w:rPr>
+    </w:lvl>
+  </w:abstractNum>
   <w:num w:numId="1">
     <w:abstractNumId w:val="8"/>
   </w:num>
@@ -3110,6 +3072,9 @@
   </w:num>
   <w:num w:numId="9">
     <w:abstractNumId w:val="0"/>
+  </w:num>
+  <w:num w:numId="10">
+    <w:abstractNumId w:val="9"/>
   </w:num>
 </w:numbering>
 </file>
@@ -3278,9 +3243,8 @@
       <w:spacing w:before="0" w:after="0" w:line="288" w:lineRule="auto"/>
     </w:pPr>
     <w:rPr>
-      <w:rFonts w:ascii="Times New Roman" w:hAnsi="Times New Roman"/>
+      <w:rFonts w:ascii="Times New Roman" w:hAnsi="Times New Roman" w:eastAsia="KaiTi"/>
       <w:sz w:val="21"/>
-      <w:rFonts w:ascii="Times New Roman" w:hAnsi="Times New Roman" w:eastAsia="KaiTi"/>
     </w:rPr>
   </w:style>
   <w:style w:type="paragraph" w:styleId="Header">

</xml_diff>

<commit_message>
Use full-width bold rules under resume section headings
</commit_message>
<xml_diff>
--- a/assets/layout-reference.docx
+++ b/assets/layout-reference.docx
@@ -422,6 +422,9 @@
                     <w:txbxContent>
                       <w:p>
                         <w:pPr>
+                          <w:pBdr>
+                            <w:bottom w:val="single" w:sz="16" w:space="2" w:color="2F6FBA"/>
+                          </w:pBdr>
                           <w:snapToGrid w:val="0"/>
                           <w:spacing w:before="0" w:after="0" w:line="288" w:lineRule="auto"/>
                           <w:jc w:val="left"/>
@@ -433,7 +436,6 @@
                             <w:sz w:val="28"/>
                             <w:szCs w:val="28"/>
                             <w:b/>
-                            <w:u w:val="single"/>
                           </w:rPr>
                           <w:t xml:space="preserve">教育背景</w:t>
                         </w:r>
@@ -899,6 +901,9 @@
                     <w:txbxContent>
                       <w:p>
                         <w:pPr>
+                          <w:pBdr>
+                            <w:bottom w:val="single" w:sz="16" w:space="2" w:color="2F6FBA"/>
+                          </w:pBdr>
                           <w:snapToGrid w:val="0"/>
                           <w:spacing w:before="0" w:after="0" w:line="288" w:lineRule="auto"/>
                           <w:jc w:val="left"/>
@@ -910,7 +915,6 @@
                             <w:sz w:val="28"/>
                             <w:szCs w:val="28"/>
                             <w:b/>
-                            <w:u w:val="single"/>
                           </w:rPr>
                           <w:t xml:space="preserve">实习经历</w:t>
                         </w:r>
@@ -1888,6 +1892,9 @@
                     <w:txbxContent>
                       <w:p>
                         <w:pPr>
+                          <w:pBdr>
+                            <w:bottom w:val="single" w:sz="16" w:space="2" w:color="2F6FBA"/>
+                          </w:pBdr>
                           <w:snapToGrid w:val="0"/>
                           <w:spacing w:before="0" w:after="0" w:line="288" w:lineRule="auto"/>
                           <w:jc w:val="left"/>
@@ -1899,7 +1906,6 @@
                             <w:sz w:val="28"/>
                             <w:szCs w:val="28"/>
                             <w:b/>
-                            <w:u w:val="single"/>
                           </w:rPr>
                           <w:t xml:space="preserve">主要科研经历</w:t>
                         </w:r>
@@ -2555,6 +2561,9 @@
                     <w:txbxContent>
                       <w:p>
                         <w:pPr>
+                          <w:pBdr>
+                            <w:bottom w:val="single" w:sz="16" w:space="2" w:color="2F6FBA"/>
+                          </w:pBdr>
                           <w:snapToGrid w:val="0"/>
                           <w:spacing w:before="0" w:after="0" w:line="288" w:lineRule="auto"/>
                           <w:jc w:val="left"/>
@@ -2566,7 +2575,6 @@
                             <w:sz w:val="28"/>
                             <w:szCs w:val="28"/>
                             <w:b/>
-                            <w:u w:val="single"/>
                           </w:rPr>
                           <w:t xml:space="preserve">其他论文</w:t>
                         </w:r>

</xml_diff>

<commit_message>
Enforce education details, bullet hierarchy, and measured one-page layout
</commit_message>
<xml_diff>
--- a/assets/layout-reference.docx
+++ b/assets/layout-reference.docx
@@ -81,7 +81,7 @@
             <wp:positionV relativeFrom="page">
               <wp:posOffset>368300</wp:posOffset>
             </wp:positionV>
-            <wp:extent cx="969010" cy="1244600"/>
+            <wp:extent cx="969010" cy="990600"/>
             <wp:effectExtent l="0" t="0" r="0" b="0"/>
             <wp:wrapNone/>
             <wp:docPr id="3" name="photo_placeholder-3"/>
@@ -94,7 +94,7 @@
                   <wps:spPr>
                     <a:xfrm>
                       <a:off x="0" y="0"/>
-                      <a:ext cx="969010" cy="1244600"/>
+                      <a:ext cx="969010" cy="990600"/>
                     </a:xfrm>
                     <a:prstGeom prst="rect">
                       <a:avLst/>
@@ -140,7 +140,7 @@
       </w:r>
       <w:r>
         <w:drawing>
-          <wp:anchor distT="0" distB="0" distL="0" distR="0" simplePos="0" relativeHeight="251660009" behindDoc="0" locked="0" layoutInCell="1" allowOverlap="1">
+          <wp:anchor distT="0" distB="0" distL="0" distR="0" simplePos="0" relativeHeight="251660011" behindDoc="0" locked="0" layoutInCell="1" allowOverlap="1">
             <wp:simplePos x="0" y="0"/>
             <wp:positionH relativeFrom="page">
               <wp:posOffset>431800</wp:posOffset>
@@ -151,12 +151,12 @@
             <wp:extent cx="5588000" cy="279400"/>
             <wp:effectExtent l="0" t="0" r="0" b="0"/>
             <wp:wrapNone/>
-            <wp:docPr id="9" name="contact-9"/>
+            <wp:docPr id="11" name="contact-11"/>
             <wp:cNvGraphicFramePr/>
             <a:graphic xmlns:a="http://schemas.openxmlformats.org/drawingml/2006/main">
               <a:graphicData uri="http://schemas.microsoft.com/office/word/2010/wordprocessingShape">
                 <wps:wsp>
-                  <wps:cNvPr id="10" name="contact-9-text"/>
+                  <wps:cNvPr id="12" name="contact-11-text"/>
                   <wps:cNvSpPr txBox="1"/>
                   <wps:spPr>
                     <a:xfrm>
@@ -305,59 +305,18 @@
                             <w:t xml:space="preserve"> lin@example.com</w:t>
                           </w:r>
                         </w:hyperlink>
-                      </w:p>
-                    </w:txbxContent>
-                  </wps:txbx>
-                  <wps:bodyPr rot="0" vert="horz" wrap="square" lIns="0" rIns="0" tIns="25400" bIns="25400" anchor="t">
-                    <a:noAutofit/>
-                  </wps:bodyPr>
-                </wps:wsp>
-              </a:graphicData>
-            </a:graphic>
-          </wp:anchor>
-        </w:drawing>
-      </w:r>
-      <w:r>
-        <w:drawing>
-          <wp:anchor distT="0" distB="0" distL="0" distR="0" simplePos="0" relativeHeight="251660015" behindDoc="0" locked="0" layoutInCell="1" allowOverlap="1">
-            <wp:simplePos x="0" y="0"/>
-            <wp:positionH relativeFrom="page">
-              <wp:posOffset>431800</wp:posOffset>
-            </wp:positionH>
-            <wp:positionV relativeFrom="page">
-              <wp:posOffset>1092200</wp:posOffset>
-            </wp:positionV>
-            <wp:extent cx="5588000" cy="279400"/>
-            <wp:effectExtent l="0" t="0" r="0" b="0"/>
-            <wp:wrapNone/>
-            <wp:docPr id="15" name="contact-15"/>
-            <wp:cNvGraphicFramePr/>
-            <a:graphic xmlns:a="http://schemas.openxmlformats.org/drawingml/2006/main">
-              <a:graphicData uri="http://schemas.microsoft.com/office/word/2010/wordprocessingShape">
-                <wps:wsp>
-                  <wps:cNvPr id="16" name="contact-15-text"/>
-                  <wps:cNvSpPr txBox="1"/>
-                  <wps:spPr>
-                    <a:xfrm>
-                      <a:off x="0" y="0"/>
-                      <a:ext cx="5588000" cy="279400"/>
-                    </a:xfrm>
-                    <a:prstGeom prst="rect">
-                      <a:avLst/>
-                    </a:prstGeom>
-                    <a:noFill/>
-                    <a:ln>
-                      <a:noFill/>
-                    </a:ln>
-                  </wps:spPr>
-                  <wps:txbx>
-                    <w:txbxContent>
-                      <w:p>
-                        <w:pPr>
-                          <w:snapToGrid w:val="0"/>
-                          <w:spacing w:before="0" w:after="0" w:line="360" w:lineRule="exact"/>
-                          <w:jc w:val="left"/>
-                        </w:pPr>
+                        <w:r>
+                          <w:rPr>
+                            <w:b w:val="0"/>
+                            <w:i w:val="0"/>
+                            <w:color w:val="262626"/>
+                            <w:sz w:val="22"/>
+                            <w:u w:val="none"/>
+                            <w:rFonts w:ascii="Times New Roman" w:hAnsi="Times New Roman" w:cs="Times New Roman" w:eastAsia="KaiTi"/>
+                            <w:szCs w:val="22"/>
+                          </w:rPr>
+                          <w:t xml:space="preserve"> ｜ </w:t>
+                        </w:r>
                         <w:r>
                           <w:rPr>
                             <w:b w:val="0"/>
@@ -372,7 +331,7 @@
                           <w:drawing>
                             <wp:inline>
                               <wp:extent cx="139700" cy="139700"/>
-                              <wp:docPr id="12" name="inline-icon"/>
+                              <wp:docPr id="10" name="inline-icon"/>
                               <wp:cNvGraphicFramePr>
                                 <a:graphicFrameLocks noChangeAspect="1"/>
                               </wp:cNvGraphicFramePr>
@@ -380,7 +339,7 @@
                                 <a:graphicData uri="http://schemas.openxmlformats.org/drawingml/2006/picture">
                                   <pic:pic xmlns:pic="http://schemas.openxmlformats.org/drawingml/2006/picture">
                                     <pic:nvPicPr>
-                                      <pic:cNvPr id="11" name="inline-icon-11"/>
+                                      <pic:cNvPr id="9" name="inline-icon-9"/>
                                       <pic:cNvPicPr/>
                                     </pic:nvPicPr>
                                     <pic:blipFill>
@@ -416,76 +375,6 @@
                             <w:t xml:space="preserve"> GitHub</w:t>
                           </w:r>
                         </w:hyperlink>
-                        <w:r>
-                          <w:rPr>
-                            <w:b w:val="0"/>
-                            <w:i w:val="0"/>
-                            <w:color w:val="262626"/>
-                            <w:sz w:val="22"/>
-                            <w:u w:val="none"/>
-                            <w:rFonts w:ascii="Times New Roman" w:hAnsi="Times New Roman" w:cs="Times New Roman" w:eastAsia="KaiTi"/>
-                            <w:szCs w:val="22"/>
-                          </w:rPr>
-                          <w:t xml:space="preserve"> ｜ </w:t>
-                        </w:r>
-                        <w:r>
-                          <w:rPr>
-                            <w:b w:val="0"/>
-                            <w:i w:val="0"/>
-                            <w:color w:val="262626"/>
-                            <w:sz w:val="22"/>
-                            <w:u w:val="none"/>
-                            <w:rFonts w:ascii="Times New Roman" w:hAnsi="Times New Roman" w:cs="Times New Roman" w:eastAsia="KaiTi"/>
-                            <w:szCs w:val="22"/>
-                            <w:position w:val="-2"/>
-                          </w:rPr>
-                          <w:drawing>
-                            <wp:inline>
-                              <wp:extent cx="139700" cy="139700"/>
-                              <wp:docPr id="14" name="inline-icon"/>
-                              <wp:cNvGraphicFramePr>
-                                <a:graphicFrameLocks noChangeAspect="1"/>
-                              </wp:cNvGraphicFramePr>
-                              <a:graphic>
-                                <a:graphicData uri="http://schemas.openxmlformats.org/drawingml/2006/picture">
-                                  <pic:pic xmlns:pic="http://schemas.openxmlformats.org/drawingml/2006/picture">
-                                    <pic:nvPicPr>
-                                      <pic:cNvPr id="13" name="inline-icon-13"/>
-                                      <pic:cNvPicPr/>
-                                    </pic:nvPicPr>
-                                    <pic:blipFill>
-                                      <a:blip r:embed="rId14"/>
-                                      <a:stretch>
-                                        <a:fillRect/>
-                                      </a:stretch>
-                                    </pic:blipFill>
-                                    <pic:spPr>
-                                      <a:xfrm>
-                                        <a:off x="0" y="0"/>
-                                        <a:ext cx="139700" cy="139700"/>
-                                      </a:xfrm>
-                                      <a:prstGeom prst="rect"/>
-                                    </pic:spPr>
-                                  </pic:pic>
-                                </a:graphicData>
-                              </a:graphic>
-                            </wp:inline>
-                          </w:drawing>
-                        </w:r>
-                        <w:hyperlink r:id="rId15">
-                          <w:r>
-                            <w:rPr>
-                              <w:b w:val="0"/>
-                              <w:i w:val="0"/>
-                              <w:color w:val="0000FF"/>
-                              <w:sz w:val="22"/>
-                              <w:u w:val="single"/>
-                              <w:rFonts w:ascii="Times New Roman" w:hAnsi="Times New Roman" w:cs="Times New Roman" w:eastAsia="KaiTi"/>
-                              <w:szCs w:val="22"/>
-                            </w:rPr>
-                            <w:t xml:space="preserve"> Google Scholar</w:t>
-                          </w:r>
-                        </w:hyperlink>
                       </w:p>
                     </w:txbxContent>
                   </wps:txbx>
@@ -500,23 +389,23 @@
       </w:r>
       <w:r>
         <w:drawing>
-          <wp:anchor distT="0" distB="0" distL="0" distR="0" simplePos="0" relativeHeight="251660019" behindDoc="0" locked="0" layoutInCell="1" allowOverlap="1">
+          <wp:anchor distT="0" distB="0" distL="0" distR="0" simplePos="0" relativeHeight="251660015" behindDoc="0" locked="0" layoutInCell="1" allowOverlap="1">
             <wp:simplePos x="0" y="0"/>
             <wp:positionH relativeFrom="page">
               <wp:posOffset>431800</wp:posOffset>
             </wp:positionH>
             <wp:positionV relativeFrom="page">
-              <wp:posOffset>1384300</wp:posOffset>
+              <wp:posOffset>1104900</wp:posOffset>
             </wp:positionV>
             <wp:extent cx="5588000" cy="279400"/>
             <wp:effectExtent l="0" t="0" r="0" b="0"/>
             <wp:wrapNone/>
-            <wp:docPr id="19" name="tech_stack-19"/>
+            <wp:docPr id="15" name="tech_stack-15"/>
             <wp:cNvGraphicFramePr/>
             <a:graphic xmlns:a="http://schemas.openxmlformats.org/drawingml/2006/main">
               <a:graphicData uri="http://schemas.microsoft.com/office/word/2010/wordprocessingShape">
                 <wps:wsp>
-                  <wps:cNvPr id="20" name="tech_stack-19-text"/>
+                  <wps:cNvPr id="16" name="tech_stack-15-text"/>
                   <wps:cNvSpPr txBox="1"/>
                   <wps:spPr>
                     <a:xfrm>
@@ -553,7 +442,7 @@
                           <w:drawing>
                             <wp:inline>
                               <wp:extent cx="139700" cy="139700"/>
-                              <wp:docPr id="18" name="inline-icon"/>
+                              <wp:docPr id="14" name="inline-icon"/>
                               <wp:cNvGraphicFramePr>
                                 <a:graphicFrameLocks noChangeAspect="1"/>
                               </wp:cNvGraphicFramePr>
@@ -561,11 +450,11 @@
                                 <a:graphicData uri="http://schemas.openxmlformats.org/drawingml/2006/picture">
                                   <pic:pic xmlns:pic="http://schemas.openxmlformats.org/drawingml/2006/picture">
                                     <pic:nvPicPr>
-                                      <pic:cNvPr id="17" name="inline-icon-17"/>
+                                      <pic:cNvPr id="13" name="inline-icon-13"/>
                                       <pic:cNvPicPr/>
                                     </pic:nvPicPr>
                                     <pic:blipFill>
-                                      <a:blip r:embed="rId16"/>
+                                      <a:blip r:embed="rId14"/>
                                       <a:stretch>
                                         <a:fillRect/>
                                       </a:stretch>
@@ -633,18 +522,18 @@
       </w:r>
       <w:r>
         <w:drawing>
-          <wp:anchor distT="0" distB="0" distL="0" distR="0" simplePos="0" relativeHeight="251660021" behindDoc="0" locked="0" layoutInCell="1" allowOverlap="1">
+          <wp:anchor distT="0" distB="0" distL="0" distR="0" simplePos="0" relativeHeight="251660017" behindDoc="0" locked="0" layoutInCell="1" allowOverlap="1">
             <wp:simplePos x="0" y="0"/>
             <wp:positionH relativeFrom="page">
               <wp:posOffset>431800</wp:posOffset>
             </wp:positionH>
             <wp:positionV relativeFrom="page">
-              <wp:posOffset>1841500</wp:posOffset>
+              <wp:posOffset>1511300</wp:posOffset>
             </wp:positionV>
             <wp:extent cx="6696710" cy="330200"/>
             <wp:effectExtent l="0" t="0" r="0" b="0"/>
             <wp:wrapNone/>
-            <wp:docPr id="21" name="section-21"/>
+            <wp:docPr id="17" name="section-17"/>
             <wp:cNvGraphicFramePr/>
             <a:graphic xmlns:a="http://schemas.openxmlformats.org/drawingml/2006/main">
               <a:graphicData uri="http://schemas.microsoft.com/office/word/2010/wordprocessingGroup">
@@ -659,7 +548,7 @@
                     </a:xfrm>
                   </wpg:grpSpPr>
                   <wps:wsp>
-                    <wps:cNvPr id="22" name="section-21-title"/>
+                    <wps:cNvPr id="18" name="section-17-title"/>
                     <wps:cNvSpPr txBox="1"/>
                     <wps:spPr>
                       <a:xfrm>
@@ -702,7 +591,7 @@
                     </wps:bodyPr>
                   </wps:wsp>
                   <wps:wsp>
-                    <wps:cNvPr id="23" name="section-21-rule"/>
+                    <wps:cNvPr id="19" name="section-17-rule"/>
                     <wps:cNvSpPr/>
                     <wps:spPr>
                       <a:xfrm>
@@ -729,18 +618,18 @@
       </w:r>
       <w:r>
         <w:drawing>
-          <wp:anchor distT="0" distB="0" distL="0" distR="0" simplePos="0" relativeHeight="251660024" behindDoc="0" locked="0" layoutInCell="1" allowOverlap="1">
+          <wp:anchor distT="0" distB="0" distL="0" distR="0" simplePos="0" relativeHeight="251660020" behindDoc="0" locked="0" layoutInCell="1" allowOverlap="1">
             <wp:simplePos x="0" y="0"/>
             <wp:positionH relativeFrom="page">
               <wp:posOffset>431800</wp:posOffset>
             </wp:positionH>
             <wp:positionV relativeFrom="page">
-              <wp:posOffset>2222500</wp:posOffset>
+              <wp:posOffset>1892300</wp:posOffset>
             </wp:positionV>
             <wp:extent cx="6696710" cy="330200"/>
             <wp:effectExtent l="0" t="0" r="0" b="0"/>
             <wp:wrapNone/>
-            <wp:docPr id="24" name="institution-24"/>
+            <wp:docPr id="20" name="institution-20"/>
             <wp:cNvGraphicFramePr/>
             <a:graphic xmlns:a="http://schemas.openxmlformats.org/drawingml/2006/main">
               <a:graphicData uri="http://schemas.microsoft.com/office/word/2010/wordprocessingGroup">
@@ -755,7 +644,7 @@
                     </a:xfrm>
                   </wpg:grpSpPr>
                   <wps:wsp>
-                    <wps:cNvPr id="25" name="institution-24-background"/>
+                    <wps:cNvPr id="21" name="institution-20-background"/>
                     <wps:cNvSpPr/>
                     <wps:spPr>
                       <a:xfrm>
@@ -778,11 +667,11 @@
                   </wps:wsp>
                   <pic:pic xmlns:pic="http://schemas.openxmlformats.org/drawingml/2006/picture">
                     <pic:nvPicPr>
-                      <pic:cNvPr id="26" name="institution-24-icon"/>
+                      <pic:cNvPr id="22" name="institution-20-icon"/>
                       <pic:cNvPicPr/>
                     </pic:nvPicPr>
                     <pic:blipFill>
-                      <a:blip r:embed="rId17"/>
+                      <a:blip r:embed="rId15"/>
                       <a:stretch>
                         <a:fillRect/>
                       </a:stretch>
@@ -796,7 +685,7 @@
                     </pic:spPr>
                   </pic:pic>
                   <wps:wsp>
-                    <wps:cNvPr id="27" name="institution-24-text"/>
+                    <wps:cNvPr id="23" name="institution-20-text"/>
                     <wps:cNvSpPr txBox="1"/>
                     <wps:spPr>
                       <a:xfrm>
@@ -858,28 +747,28 @@
       </w:r>
       <w:r>
         <w:drawing>
-          <wp:anchor distT="0" distB="0" distL="0" distR="0" simplePos="0" relativeHeight="251660028" behindDoc="0" locked="0" layoutInCell="1" allowOverlap="1">
+          <wp:anchor distT="0" distB="0" distL="0" distR="0" simplePos="0" relativeHeight="251660024" behindDoc="0" locked="0" layoutInCell="1" allowOverlap="1">
             <wp:simplePos x="0" y="0"/>
             <wp:positionH relativeFrom="page">
               <wp:posOffset>431800</wp:posOffset>
             </wp:positionH>
             <wp:positionV relativeFrom="page">
-              <wp:posOffset>2590800</wp:posOffset>
+              <wp:posOffset>2235200</wp:posOffset>
             </wp:positionV>
-            <wp:extent cx="6696710" cy="285750"/>
+            <wp:extent cx="6696710" cy="235821"/>
             <wp:effectExtent l="0" t="0" r="0" b="0"/>
             <wp:wrapNone/>
-            <wp:docPr id="28" name="body-28"/>
+            <wp:docPr id="24" name="body-24"/>
             <wp:cNvGraphicFramePr/>
             <a:graphic xmlns:a="http://schemas.openxmlformats.org/drawingml/2006/main">
               <a:graphicData uri="http://schemas.microsoft.com/office/word/2010/wordprocessingShape">
                 <wps:wsp>
-                  <wps:cNvPr id="29" name="body-28-text"/>
+                  <wps:cNvPr id="25" name="body-24-text"/>
                   <wps:cNvSpPr txBox="1"/>
                   <wps:spPr>
                     <a:xfrm>
                       <a:off x="0" y="0"/>
-                      <a:ext cx="6696710" cy="285750"/>
+                      <a:ext cx="6696710" cy="235821"/>
                     </a:xfrm>
                     <a:prstGeom prst="rect">
                       <a:avLst/>
@@ -894,7 +783,7 @@
                       <w:p>
                         <w:pPr>
                           <w:snapToGrid w:val="0"/>
-                          <w:spacing w:before="0" w:after="0" w:line="288" w:lineRule="auto"/>
+                          <w:spacing w:before="0" w:after="0" w:line="320" w:lineRule="exact"/>
                           <w:jc w:val="both"/>
                         </w:pPr>
                         <w:r>
@@ -907,7 +796,7 @@
                             <w:rFonts w:ascii="Times New Roman" w:hAnsi="Times New Roman" w:cs="Times New Roman" w:eastAsia="KaiTi"/>
                             <w:szCs w:val="21"/>
                           </w:rPr>
-                          <w:t>研究方向：</w:t>
+                          <w:t>导师 / 研究方向：</w:t>
                         </w:r>
                         <w:r>
                           <w:rPr>
@@ -919,12 +808,12 @@
                             <w:rFonts w:ascii="Times New Roman" w:hAnsi="Times New Roman" w:cs="Times New Roman" w:eastAsia="KaiTi"/>
                             <w:szCs w:val="21"/>
                           </w:rPr>
-                          <w:t>面向开发者工具的智能体协作；导师：周知衡教授（虚构）。</w:t>
+                          <w:t xml:space="preserve"> </w:t>
                         </w:r>
                       </w:p>
                     </w:txbxContent>
                   </wps:txbx>
-                  <wps:bodyPr rot="0" vert="horz" wrap="square" lIns="0" rIns="0" tIns="25400" bIns="25400" anchor="t">
+                  <wps:bodyPr rot="0" vert="horz" wrap="square" lIns="0" rIns="0" tIns="25400" bIns="12700" anchor="t">
                     <a:noAutofit/>
                   </wps:bodyPr>
                 </wps:wsp>
@@ -935,18 +824,95 @@
       </w:r>
       <w:r>
         <w:drawing>
-          <wp:anchor distT="0" distB="0" distL="0" distR="0" simplePos="0" relativeHeight="251660030" behindDoc="0" locked="0" layoutInCell="1" allowOverlap="1">
+          <wp:anchor distT="0" distB="0" distL="0" distR="0" simplePos="0" relativeHeight="251660026" behindDoc="0" locked="0" layoutInCell="1" allowOverlap="1">
             <wp:simplePos x="0" y="0"/>
             <wp:positionH relativeFrom="page">
               <wp:posOffset>431800</wp:posOffset>
             </wp:positionH>
             <wp:positionV relativeFrom="page">
-              <wp:posOffset>2965450</wp:posOffset>
+              <wp:posOffset>2477371</wp:posOffset>
+            </wp:positionV>
+            <wp:extent cx="6696710" cy="236220"/>
+            <wp:effectExtent l="0" t="0" r="0" b="0"/>
+            <wp:wrapNone/>
+            <wp:docPr id="26" name="body-26"/>
+            <wp:cNvGraphicFramePr/>
+            <a:graphic xmlns:a="http://schemas.openxmlformats.org/drawingml/2006/main">
+              <a:graphicData uri="http://schemas.microsoft.com/office/word/2010/wordprocessingShape">
+                <wps:wsp>
+                  <wps:cNvPr id="27" name="body-26-text"/>
+                  <wps:cNvSpPr txBox="1"/>
+                  <wps:spPr>
+                    <a:xfrm>
+                      <a:off x="0" y="0"/>
+                      <a:ext cx="6696710" cy="236220"/>
+                    </a:xfrm>
+                    <a:prstGeom prst="rect">
+                      <a:avLst/>
+                    </a:prstGeom>
+                    <a:noFill/>
+                    <a:ln>
+                      <a:noFill/>
+                    </a:ln>
+                  </wps:spPr>
+                  <wps:txbx>
+                    <w:txbxContent>
+                      <w:p>
+                        <w:pPr>
+                          <w:snapToGrid w:val="0"/>
+                          <w:spacing w:before="0" w:after="0" w:line="320" w:lineRule="exact"/>
+                          <w:jc w:val="both"/>
+                        </w:pPr>
+                        <w:r>
+                          <w:rPr>
+                            <w:b/>
+                            <w:i w:val="0"/>
+                            <w:color w:val="262626"/>
+                            <w:sz w:val="21"/>
+                            <w:u w:val="none"/>
+                            <w:rFonts w:ascii="Times New Roman" w:hAnsi="Times New Roman" w:cs="Times New Roman" w:eastAsia="KaiTi"/>
+                            <w:szCs w:val="21"/>
+                          </w:rPr>
+                          <w:t>在校活动 / 荣誉：</w:t>
+                        </w:r>
+                        <w:r>
+                          <w:rPr>
+                            <w:b w:val="0"/>
+                            <w:i w:val="0"/>
+                            <w:color w:val="262626"/>
+                            <w:sz w:val="21"/>
+                            <w:u w:val="none"/>
+                            <w:rFonts w:ascii="Times New Roman" w:hAnsi="Times New Roman" w:cs="Times New Roman" w:eastAsia="KaiTi"/>
+                            <w:szCs w:val="21"/>
+                          </w:rPr>
+                          <w:t xml:space="preserve"> </w:t>
+                        </w:r>
+                      </w:p>
+                    </w:txbxContent>
+                  </wps:txbx>
+                  <wps:bodyPr rot="0" vert="horz" wrap="square" lIns="0" rIns="0" tIns="25400" bIns="12700" anchor="t">
+                    <a:noAutofit/>
+                  </wps:bodyPr>
+                </wps:wsp>
+              </a:graphicData>
+            </a:graphic>
+          </wp:anchor>
+        </w:drawing>
+      </w:r>
+      <w:r>
+        <w:drawing>
+          <wp:anchor distT="0" distB="0" distL="0" distR="0" simplePos="0" relativeHeight="251660028" behindDoc="0" locked="0" layoutInCell="1" allowOverlap="1">
+            <wp:simplePos x="0" y="0"/>
+            <wp:positionH relativeFrom="page">
+              <wp:posOffset>431800</wp:posOffset>
+            </wp:positionH>
+            <wp:positionV relativeFrom="page">
+              <wp:posOffset>2802491</wp:posOffset>
             </wp:positionV>
             <wp:extent cx="6696710" cy="330200"/>
             <wp:effectExtent l="0" t="0" r="0" b="0"/>
             <wp:wrapNone/>
-            <wp:docPr id="30" name="institution-30"/>
+            <wp:docPr id="28" name="institution-28"/>
             <wp:cNvGraphicFramePr/>
             <a:graphic xmlns:a="http://schemas.openxmlformats.org/drawingml/2006/main">
               <a:graphicData uri="http://schemas.microsoft.com/office/word/2010/wordprocessingGroup">
@@ -961,7 +927,7 @@
                     </a:xfrm>
                   </wpg:grpSpPr>
                   <wps:wsp>
-                    <wps:cNvPr id="31" name="institution-30-background"/>
+                    <wps:cNvPr id="29" name="institution-28-background"/>
                     <wps:cNvSpPr/>
                     <wps:spPr>
                       <a:xfrm>
@@ -984,11 +950,11 @@
                   </wps:wsp>
                   <pic:pic xmlns:pic="http://schemas.openxmlformats.org/drawingml/2006/picture">
                     <pic:nvPicPr>
-                      <pic:cNvPr id="32" name="institution-30-icon"/>
+                      <pic:cNvPr id="30" name="institution-28-icon"/>
                       <pic:cNvPicPr/>
                     </pic:nvPicPr>
                     <pic:blipFill>
-                      <a:blip r:embed="rId17"/>
+                      <a:blip r:embed="rId15"/>
                       <a:stretch>
                         <a:fillRect/>
                       </a:stretch>
@@ -1002,7 +968,7 @@
                     </pic:spPr>
                   </pic:pic>
                   <wps:wsp>
-                    <wps:cNvPr id="33" name="institution-30-text"/>
+                    <wps:cNvPr id="31" name="institution-28-text"/>
                     <wps:cNvSpPr txBox="1"/>
                     <wps:spPr>
                       <a:xfrm>
@@ -1064,28 +1030,28 @@
       </w:r>
       <w:r>
         <w:drawing>
-          <wp:anchor distT="0" distB="0" distL="0" distR="0" simplePos="0" relativeHeight="251660034" behindDoc="0" locked="0" layoutInCell="1" allowOverlap="1">
+          <wp:anchor distT="0" distB="0" distL="0" distR="0" simplePos="0" relativeHeight="251660032" behindDoc="0" locked="0" layoutInCell="1" allowOverlap="1">
             <wp:simplePos x="0" y="0"/>
             <wp:positionH relativeFrom="page">
               <wp:posOffset>431800</wp:posOffset>
             </wp:positionH>
             <wp:positionV relativeFrom="page">
-              <wp:posOffset>3333750</wp:posOffset>
+              <wp:posOffset>3145391</wp:posOffset>
             </wp:positionV>
-            <wp:extent cx="6696710" cy="285750"/>
+            <wp:extent cx="6696710" cy="235984"/>
             <wp:effectExtent l="0" t="0" r="0" b="0"/>
             <wp:wrapNone/>
-            <wp:docPr id="34" name="body-34"/>
+            <wp:docPr id="32" name="body-32"/>
             <wp:cNvGraphicFramePr/>
             <a:graphic xmlns:a="http://schemas.openxmlformats.org/drawingml/2006/main">
               <a:graphicData uri="http://schemas.microsoft.com/office/word/2010/wordprocessingShape">
                 <wps:wsp>
-                  <wps:cNvPr id="35" name="body-34-text"/>
+                  <wps:cNvPr id="33" name="body-32-text"/>
                   <wps:cNvSpPr txBox="1"/>
                   <wps:spPr>
                     <a:xfrm>
                       <a:off x="0" y="0"/>
-                      <a:ext cx="6696710" cy="285750"/>
+                      <a:ext cx="6696710" cy="235984"/>
                     </a:xfrm>
                     <a:prstGeom prst="rect">
                       <a:avLst/>
@@ -1100,7 +1066,7 @@
                       <w:p>
                         <w:pPr>
                           <w:snapToGrid w:val="0"/>
-                          <w:spacing w:before="0" w:after="0" w:line="288" w:lineRule="auto"/>
+                          <w:spacing w:before="0" w:after="0" w:line="320" w:lineRule="exact"/>
                           <w:jc w:val="both"/>
                         </w:pPr>
                         <w:r>
@@ -1113,7 +1079,7 @@
                             <w:rFonts w:ascii="Times New Roman" w:hAnsi="Times New Roman" w:cs="Times New Roman" w:eastAsia="KaiTi"/>
                             <w:szCs w:val="21"/>
                           </w:rPr>
-                          <w:t>在校经历：</w:t>
+                          <w:t>毕业设计 / 指导教师：</w:t>
                         </w:r>
                         <w:r>
                           <w:rPr>
@@ -1125,12 +1091,89 @@
                             <w:rFonts w:ascii="Times New Roman" w:hAnsi="Times New Roman" w:cs="Times New Roman" w:eastAsia="KaiTi"/>
                             <w:szCs w:val="21"/>
                           </w:rPr>
-                          <w:t>参与校内开源社团，组织代码阅读与工程实践活动。</w:t>
+                          <w:t xml:space="preserve"> </w:t>
                         </w:r>
                       </w:p>
                     </w:txbxContent>
                   </wps:txbx>
-                  <wps:bodyPr rot="0" vert="horz" wrap="square" lIns="0" rIns="0" tIns="25400" bIns="25400" anchor="t">
+                  <wps:bodyPr rot="0" vert="horz" wrap="square" lIns="0" rIns="0" tIns="25400" bIns="12700" anchor="t">
+                    <a:noAutofit/>
+                  </wps:bodyPr>
+                </wps:wsp>
+              </a:graphicData>
+            </a:graphic>
+          </wp:anchor>
+        </w:drawing>
+      </w:r>
+      <w:r>
+        <w:drawing>
+          <wp:anchor distT="0" distB="0" distL="0" distR="0" simplePos="0" relativeHeight="251660034" behindDoc="0" locked="0" layoutInCell="1" allowOverlap="1">
+            <wp:simplePos x="0" y="0"/>
+            <wp:positionH relativeFrom="page">
+              <wp:posOffset>431800</wp:posOffset>
+            </wp:positionH>
+            <wp:positionV relativeFrom="page">
+              <wp:posOffset>3387725</wp:posOffset>
+            </wp:positionV>
+            <wp:extent cx="6696710" cy="235748"/>
+            <wp:effectExtent l="0" t="0" r="0" b="0"/>
+            <wp:wrapNone/>
+            <wp:docPr id="34" name="body-34"/>
+            <wp:cNvGraphicFramePr/>
+            <a:graphic xmlns:a="http://schemas.openxmlformats.org/drawingml/2006/main">
+              <a:graphicData uri="http://schemas.microsoft.com/office/word/2010/wordprocessingShape">
+                <wps:wsp>
+                  <wps:cNvPr id="35" name="body-34-text"/>
+                  <wps:cNvSpPr txBox="1"/>
+                  <wps:spPr>
+                    <a:xfrm>
+                      <a:off x="0" y="0"/>
+                      <a:ext cx="6696710" cy="235748"/>
+                    </a:xfrm>
+                    <a:prstGeom prst="rect">
+                      <a:avLst/>
+                    </a:prstGeom>
+                    <a:noFill/>
+                    <a:ln>
+                      <a:noFill/>
+                    </a:ln>
+                  </wps:spPr>
+                  <wps:txbx>
+                    <w:txbxContent>
+                      <w:p>
+                        <w:pPr>
+                          <w:snapToGrid w:val="0"/>
+                          <w:spacing w:before="0" w:after="0" w:line="320" w:lineRule="exact"/>
+                          <w:jc w:val="both"/>
+                        </w:pPr>
+                        <w:r>
+                          <w:rPr>
+                            <w:b/>
+                            <w:i w:val="0"/>
+                            <w:color w:val="262626"/>
+                            <w:sz w:val="21"/>
+                            <w:u w:val="none"/>
+                            <w:rFonts w:ascii="Times New Roman" w:hAnsi="Times New Roman" w:cs="Times New Roman" w:eastAsia="KaiTi"/>
+                            <w:szCs w:val="21"/>
+                          </w:rPr>
+                          <w:t>在校活动 / 荣誉：</w:t>
+                        </w:r>
+                        <w:r>
+                          <w:rPr>
+                            <w:b w:val="0"/>
+                            <w:i w:val="0"/>
+                            <w:color w:val="262626"/>
+                            <w:sz w:val="21"/>
+                            <w:u w:val="none"/>
+                            <w:rFonts w:ascii="Times New Roman" w:hAnsi="Times New Roman" w:cs="Times New Roman" w:eastAsia="KaiTi"/>
+                            <w:szCs w:val="21"/>
+                          </w:rPr>
+                          <w:t xml:space="preserve"> </w:t>
+                        </w:r>
+                      </w:p>
+                    </w:txbxContent>
+                  </wps:txbx>
+                  <wps:bodyPr rot="0" vert="horz" wrap="square" lIns="0" rIns="0" tIns="25400" bIns="12700" anchor="t">
                     <a:noAutofit/>
                   </wps:bodyPr>
                 </wps:wsp>
@@ -1147,7 +1190,7 @@
               <wp:posOffset>431800</wp:posOffset>
             </wp:positionH>
             <wp:positionV relativeFrom="page">
-              <wp:posOffset>3771900</wp:posOffset>
+              <wp:posOffset>3750473</wp:posOffset>
             </wp:positionV>
             <wp:extent cx="6696710" cy="330200"/>
             <wp:effectExtent l="0" t="0" r="0" b="0"/>
@@ -1243,7 +1286,7 @@
               <wp:posOffset>431800</wp:posOffset>
             </wp:positionH>
             <wp:positionV relativeFrom="page">
-              <wp:posOffset>4152900</wp:posOffset>
+              <wp:posOffset>4131473</wp:posOffset>
             </wp:positionV>
             <wp:extent cx="6696710" cy="330200"/>
             <wp:effectExtent l="0" t="0" r="0" b="0"/>
@@ -1290,7 +1333,7 @@
                       <pic:cNvPicPr/>
                     </pic:nvPicPr>
                     <pic:blipFill>
-                      <a:blip r:embed="rId18"/>
+                      <a:blip r:embed="rId16"/>
                       <a:stretch>
                         <a:fillRect/>
                       </a:stretch>
@@ -1372,9 +1415,9 @@
               <wp:posOffset>431800</wp:posOffset>
             </wp:positionH>
             <wp:positionV relativeFrom="page">
-              <wp:posOffset>4521200</wp:posOffset>
+              <wp:posOffset>4499773</wp:posOffset>
             </wp:positionV>
-            <wp:extent cx="6696710" cy="304800"/>
+            <wp:extent cx="6696710" cy="279400"/>
             <wp:effectExtent l="0" t="0" r="0" b="0"/>
             <wp:wrapNone/>
             <wp:docPr id="45" name="project_header-45"/>
@@ -1387,7 +1430,7 @@
                   <wps:spPr>
                     <a:xfrm>
                       <a:off x="0" y="0"/>
-                      <a:ext cx="6696710" cy="304800"/>
+                      <a:ext cx="6696710" cy="279400"/>
                     </a:xfrm>
                     <a:prstGeom prst="rect">
                       <a:avLst/>
@@ -1476,7 +1519,7 @@
                             </wp:inline>
                           </w:drawing>
                         </w:r>
-                        <w:hyperlink r:id="rId19">
+                        <w:hyperlink r:id="rId17">
                           <w:r>
                             <w:rPr>
                               <w:b w:val="0"/>
@@ -1510,176 +1553,22 @@
               <wp:posOffset>431800</wp:posOffset>
             </wp:positionH>
             <wp:positionV relativeFrom="page">
-              <wp:posOffset>4826000</wp:posOffset>
+              <wp:posOffset>4785523</wp:posOffset>
             </wp:positionV>
-            <wp:extent cx="6696710" cy="457200"/>
+            <wp:extent cx="6696710" cy="433657"/>
             <wp:effectExtent l="0" t="0" r="0" b="0"/>
             <wp:wrapNone/>
-            <wp:docPr id="47" name="body-47"/>
+            <wp:docPr id="47" name="bullet-47"/>
             <wp:cNvGraphicFramePr/>
             <a:graphic xmlns:a="http://schemas.openxmlformats.org/drawingml/2006/main">
               <a:graphicData uri="http://schemas.microsoft.com/office/word/2010/wordprocessingShape">
                 <wps:wsp>
-                  <wps:cNvPr id="48" name="body-47-text"/>
+                  <wps:cNvPr id="48" name="bullet-47-text"/>
                   <wps:cNvSpPr txBox="1"/>
                   <wps:spPr>
                     <a:xfrm>
                       <a:off x="0" y="0"/>
-                      <a:ext cx="6696710" cy="457200"/>
-                    </a:xfrm>
-                    <a:prstGeom prst="rect">
-                      <a:avLst/>
-                    </a:prstGeom>
-                    <a:noFill/>
-                    <a:ln>
-                      <a:noFill/>
-                    </a:ln>
-                  </wps:spPr>
-                  <wps:txbx>
-                    <w:txbxContent>
-                      <w:p>
-                        <w:pPr>
-                          <w:snapToGrid w:val="0"/>
-                          <w:spacing w:before="0" w:after="0" w:line="288" w:lineRule="auto"/>
-                          <w:jc w:val="both"/>
-                        </w:pPr>
-                        <w:r>
-                          <w:rPr>
-                            <w:b/>
-                            <w:i w:val="0"/>
-                            <w:color w:val="262626"/>
-                            <w:sz w:val="21"/>
-                            <w:u w:val="none"/>
-                            <w:rFonts w:ascii="Times New Roman" w:hAnsi="Times New Roman" w:cs="Times New Roman" w:eastAsia="KaiTi"/>
-                            <w:szCs w:val="21"/>
-                          </w:rPr>
-                          <w:t>项目背景：</w:t>
-                        </w:r>
-                        <w:r>
-                          <w:rPr>
-                            <w:b w:val="0"/>
-                            <w:i w:val="0"/>
-                            <w:color w:val="262626"/>
-                            <w:sz w:val="21"/>
-                            <w:u w:val="none"/>
-                            <w:rFonts w:ascii="Times New Roman" w:hAnsi="Times New Roman" w:cs="Times New Roman" w:eastAsia="KaiTi"/>
-                            <w:szCs w:val="21"/>
-                          </w:rPr>
-                          <w:t>面向多角色研发任务中信息分散与交接成本高的问题，构建任务拆解、执行跟踪和结果归档的一体化工作流。</w:t>
-                        </w:r>
-                      </w:p>
-                    </w:txbxContent>
-                  </wps:txbx>
-                  <wps:bodyPr rot="0" vert="horz" wrap="square" lIns="0" rIns="0" tIns="25400" bIns="25400" anchor="t">
-                    <a:noAutofit/>
-                  </wps:bodyPr>
-                </wps:wsp>
-              </a:graphicData>
-            </a:graphic>
-          </wp:anchor>
-        </w:drawing>
-      </w:r>
-      <w:r>
-        <w:drawing>
-          <wp:anchor distT="0" distB="0" distL="0" distR="0" simplePos="0" relativeHeight="251660049" behindDoc="0" locked="0" layoutInCell="1" allowOverlap="1">
-            <wp:simplePos x="0" y="0"/>
-            <wp:positionH relativeFrom="page">
-              <wp:posOffset>431800</wp:posOffset>
-            </wp:positionH>
-            <wp:positionV relativeFrom="page">
-              <wp:posOffset>5295900</wp:posOffset>
-            </wp:positionV>
-            <wp:extent cx="6696710" cy="457200"/>
-            <wp:effectExtent l="0" t="0" r="0" b="0"/>
-            <wp:wrapNone/>
-            <wp:docPr id="49" name="body-49"/>
-            <wp:cNvGraphicFramePr/>
-            <a:graphic xmlns:a="http://schemas.openxmlformats.org/drawingml/2006/main">
-              <a:graphicData uri="http://schemas.microsoft.com/office/word/2010/wordprocessingShape">
-                <wps:wsp>
-                  <wps:cNvPr id="50" name="body-49-text"/>
-                  <wps:cNvSpPr txBox="1"/>
-                  <wps:spPr>
-                    <a:xfrm>
-                      <a:off x="0" y="0"/>
-                      <a:ext cx="6696710" cy="457200"/>
-                    </a:xfrm>
-                    <a:prstGeom prst="rect">
-                      <a:avLst/>
-                    </a:prstGeom>
-                    <a:noFill/>
-                    <a:ln>
-                      <a:noFill/>
-                    </a:ln>
-                  </wps:spPr>
-                  <wps:txbx>
-                    <w:txbxContent>
-                      <w:p>
-                        <w:pPr>
-                          <w:snapToGrid w:val="0"/>
-                          <w:spacing w:before="0" w:after="0" w:line="288" w:lineRule="auto"/>
-                          <w:jc w:val="both"/>
-                        </w:pPr>
-                        <w:r>
-                          <w:rPr>
-                            <w:b/>
-                            <w:i w:val="0"/>
-                            <w:color w:val="262626"/>
-                            <w:sz w:val="21"/>
-                            <w:u w:val="none"/>
-                            <w:rFonts w:ascii="Times New Roman" w:hAnsi="Times New Roman" w:cs="Times New Roman" w:eastAsia="KaiTi"/>
-                            <w:szCs w:val="21"/>
-                          </w:rPr>
-                          <w:t>项目职责：</w:t>
-                        </w:r>
-                        <w:r>
-                          <w:rPr>
-                            <w:b/>
-                            <w:i w:val="0"/>
-                            <w:color w:val="262626"/>
-                            <w:sz w:val="21"/>
-                            <w:u w:val="none"/>
-                            <w:rFonts w:ascii="Times New Roman" w:hAnsi="Times New Roman" w:cs="Times New Roman" w:eastAsia="KaiTi"/>
-                            <w:szCs w:val="21"/>
-                          </w:rPr>
-                          <w:t>作为项目 Owner，负责已约定范围内的流程建模与服务接口设计，协调客户端和执行服务的联调验证。</w:t>
-                        </w:r>
-                      </w:p>
-                    </w:txbxContent>
-                  </wps:txbx>
-                  <wps:bodyPr rot="0" vert="horz" wrap="square" lIns="0" rIns="0" tIns="25400" bIns="25400" anchor="t">
-                    <a:noAutofit/>
-                  </wps:bodyPr>
-                </wps:wsp>
-              </a:graphicData>
-            </a:graphic>
-          </wp:anchor>
-        </w:drawing>
-      </w:r>
-      <w:r>
-        <w:drawing>
-          <wp:anchor distT="0" distB="0" distL="0" distR="0" simplePos="0" relativeHeight="251660051" behindDoc="0" locked="0" layoutInCell="1" allowOverlap="1">
-            <wp:simplePos x="0" y="0"/>
-            <wp:positionH relativeFrom="page">
-              <wp:posOffset>431800</wp:posOffset>
-            </wp:positionH>
-            <wp:positionV relativeFrom="page">
-              <wp:posOffset>5765800</wp:posOffset>
-            </wp:positionV>
-            <wp:extent cx="6696710" cy="254000"/>
-            <wp:effectExtent l="0" t="0" r="0" b="0"/>
-            <wp:wrapNone/>
-            <wp:docPr id="51" name="bullet-51"/>
-            <wp:cNvGraphicFramePr/>
-            <a:graphic xmlns:a="http://schemas.openxmlformats.org/drawingml/2006/main">
-              <a:graphicData uri="http://schemas.microsoft.com/office/word/2010/wordprocessingShape">
-                <wps:wsp>
-                  <wps:cNvPr id="52" name="bullet-51-text"/>
-                  <wps:cNvSpPr txBox="1"/>
-                  <wps:spPr>
-                    <a:xfrm>
-                      <a:off x="0" y="0"/>
-                      <a:ext cx="6696710" cy="254000"/>
+                      <a:ext cx="6696710" cy="433657"/>
                     </a:xfrm>
                     <a:prstGeom prst="rect">
                       <a:avLst/>
@@ -1712,7 +1601,7 @@
                             <w:rFonts w:ascii="Times New Roman" w:hAnsi="Times New Roman" w:cs="Times New Roman" w:eastAsia="KaiTi"/>
                             <w:szCs w:val="21"/>
                           </w:rPr>
-                          <w:t>执行编排：</w:t>
+                          <w:t>项目背景：</w:t>
                         </w:r>
                         <w:r>
                           <w:rPr>
@@ -1724,12 +1613,12 @@
                             <w:rFonts w:ascii="Times New Roman" w:hAnsi="Times New Roman" w:cs="Times New Roman" w:eastAsia="KaiTi"/>
                             <w:szCs w:val="21"/>
                           </w:rPr>
-                          <w:t>将任务状态、工具调用和异常恢复组织为可追踪流程，通过消息事件连接执行服务与结果存储。</w:t>
+                          <w:t>面向跨角色研发任务中信息分散、状态难以同步和交接成本高的问题，构建连接任务拆解、执行跟踪与结果归档的协作工作流。</w:t>
                         </w:r>
                       </w:p>
                     </w:txbxContent>
                   </wps:txbx>
-                  <wps:bodyPr rot="0" vert="horz" wrap="square" lIns="0" rIns="0" tIns="25400" bIns="25400" anchor="t">
+                  <wps:bodyPr rot="0" vert="horz" wrap="square" lIns="0" rIns="0" tIns="25400" bIns="12700" anchor="t">
                     <a:noAutofit/>
                   </wps:bodyPr>
                 </wps:wsp>
@@ -1740,28 +1629,28 @@
       </w:r>
       <w:r>
         <w:drawing>
-          <wp:anchor distT="0" distB="0" distL="0" distR="0" simplePos="0" relativeHeight="251660053" behindDoc="0" locked="0" layoutInCell="1" allowOverlap="1">
+          <wp:anchor distT="0" distB="0" distL="0" distR="0" simplePos="0" relativeHeight="251660049" behindDoc="0" locked="0" layoutInCell="1" allowOverlap="1">
             <wp:simplePos x="0" y="0"/>
             <wp:positionH relativeFrom="page">
               <wp:posOffset>431800</wp:posOffset>
             </wp:positionH>
             <wp:positionV relativeFrom="page">
-              <wp:posOffset>6032500</wp:posOffset>
+              <wp:posOffset>5225530</wp:posOffset>
             </wp:positionV>
-            <wp:extent cx="6696710" cy="457200"/>
+            <wp:extent cx="6696710" cy="434031"/>
             <wp:effectExtent l="0" t="0" r="0" b="0"/>
             <wp:wrapNone/>
-            <wp:docPr id="53" name="bullet-53"/>
+            <wp:docPr id="49" name="bullet-49"/>
             <wp:cNvGraphicFramePr/>
             <a:graphic xmlns:a="http://schemas.openxmlformats.org/drawingml/2006/main">
               <a:graphicData uri="http://schemas.microsoft.com/office/word/2010/wordprocessingShape">
                 <wps:wsp>
-                  <wps:cNvPr id="54" name="bullet-53-text"/>
+                  <wps:cNvPr id="50" name="bullet-49-text"/>
                   <wps:cNvSpPr txBox="1"/>
                   <wps:spPr>
                     <a:xfrm>
                       <a:off x="0" y="0"/>
-                      <a:ext cx="6696710" cy="457200"/>
+                      <a:ext cx="6696710" cy="434031"/>
                     </a:xfrm>
                     <a:prstGeom prst="rect">
                       <a:avLst/>
@@ -1794,7 +1683,89 @@
                             <w:rFonts w:ascii="Times New Roman" w:hAnsi="Times New Roman" w:cs="Times New Roman" w:eastAsia="KaiTi"/>
                             <w:szCs w:val="21"/>
                           </w:rPr>
-                          <w:t>质量验证：</w:t>
+                          <w:t>项目职责：</w:t>
+                        </w:r>
+                        <w:r>
+                          <w:rPr>
+                            <w:b/>
+                            <w:i w:val="0"/>
+                            <w:color w:val="262626"/>
+                            <w:sz w:val="21"/>
+                            <w:u w:val="none"/>
+                            <w:rFonts w:ascii="Times New Roman" w:hAnsi="Times New Roman" w:cs="Times New Roman" w:eastAsia="KaiTi"/>
+                            <w:szCs w:val="21"/>
+                          </w:rPr>
+                          <w:t>作为项目 Owner，负责流程建模与服务接口设计，拆解客户端和执行服务的接口边界，组织联调与异常场景验收。</w:t>
+                        </w:r>
+                      </w:p>
+                    </w:txbxContent>
+                  </wps:txbx>
+                  <wps:bodyPr rot="0" vert="horz" wrap="square" lIns="0" rIns="0" tIns="25400" bIns="12700" anchor="t">
+                    <a:noAutofit/>
+                  </wps:bodyPr>
+                </wps:wsp>
+              </a:graphicData>
+            </a:graphic>
+          </wp:anchor>
+        </w:drawing>
+      </w:r>
+      <w:r>
+        <w:drawing>
+          <wp:anchor distT="0" distB="0" distL="0" distR="0" simplePos="0" relativeHeight="251660051" behindDoc="0" locked="0" layoutInCell="1" allowOverlap="1">
+            <wp:simplePos x="0" y="0"/>
+            <wp:positionH relativeFrom="page">
+              <wp:posOffset>431800</wp:posOffset>
+            </wp:positionH>
+            <wp:positionV relativeFrom="page">
+              <wp:posOffset>5665911</wp:posOffset>
+            </wp:positionV>
+            <wp:extent cx="6696710" cy="434405"/>
+            <wp:effectExtent l="0" t="0" r="0" b="0"/>
+            <wp:wrapNone/>
+            <wp:docPr id="51" name="bullet-51"/>
+            <wp:cNvGraphicFramePr/>
+            <a:graphic xmlns:a="http://schemas.openxmlformats.org/drawingml/2006/main">
+              <a:graphicData uri="http://schemas.microsoft.com/office/word/2010/wordprocessingShape">
+                <wps:wsp>
+                  <wps:cNvPr id="52" name="bullet-51-text"/>
+                  <wps:cNvSpPr txBox="1"/>
+                  <wps:spPr>
+                    <a:xfrm>
+                      <a:off x="0" y="0"/>
+                      <a:ext cx="6696710" cy="434405"/>
+                    </a:xfrm>
+                    <a:prstGeom prst="rect">
+                      <a:avLst/>
+                    </a:prstGeom>
+                    <a:noFill/>
+                    <a:ln>
+                      <a:noFill/>
+                    </a:ln>
+                  </wps:spPr>
+                  <wps:txbx>
+                    <w:txbxContent>
+                      <w:p>
+                        <w:pPr>
+                          <w:numPr>
+                            <w:ilvl w:val="1"/>
+                            <w:numId w:val="10"/>
+                          </w:numPr>
+                          <w:snapToGrid w:val="0"/>
+                          <w:spacing w:before="0" w:after="0" w:line="288" w:lineRule="auto"/>
+                          <w:ind w:left="255" w:hanging="142"/>
+                          <w:jc w:val="both"/>
+                        </w:pPr>
+                        <w:r>
+                          <w:rPr>
+                            <w:b/>
+                            <w:i w:val="0"/>
+                            <w:color w:val="262626"/>
+                            <w:sz w:val="21"/>
+                            <w:u w:val="none"/>
+                            <w:rFonts w:ascii="Times New Roman" w:hAnsi="Times New Roman" w:cs="Times New Roman" w:eastAsia="KaiTi"/>
+                            <w:szCs w:val="21"/>
+                          </w:rPr>
+                          <w:t>执行编排：</w:t>
                         </w:r>
                         <w:r>
                           <w:rPr>
@@ -1806,12 +1777,94 @@
                             <w:rFonts w:ascii="Times New Roman" w:hAnsi="Times New Roman" w:cs="Times New Roman" w:eastAsia="KaiTi"/>
                             <w:szCs w:val="21"/>
                           </w:rPr>
-                          <w:t>建立固定样例与失败分类，检查超时重试、重复事件和中断恢复，并以执行日志定位交接环节的问题。</w:t>
+                          <w:t>以任务状态机串联规划、执行和复核环节，通过消息事件传递进度与执行结果；对中断任务保留检查点，支持恢复后继续执行。</w:t>
                         </w:r>
                       </w:p>
                     </w:txbxContent>
                   </wps:txbx>
-                  <wps:bodyPr rot="0" vert="horz" wrap="square" lIns="0" rIns="0" tIns="25400" bIns="25400" anchor="t">
+                  <wps:bodyPr rot="0" vert="horz" wrap="square" lIns="0" rIns="0" tIns="25400" bIns="12700" anchor="t">
+                    <a:noAutofit/>
+                  </wps:bodyPr>
+                </wps:wsp>
+              </a:graphicData>
+            </a:graphic>
+          </wp:anchor>
+        </w:drawing>
+      </w:r>
+      <w:r>
+        <w:drawing>
+          <wp:anchor distT="0" distB="0" distL="0" distR="0" simplePos="0" relativeHeight="251660053" behindDoc="0" locked="0" layoutInCell="1" allowOverlap="1">
+            <wp:simplePos x="0" y="0"/>
+            <wp:positionH relativeFrom="page">
+              <wp:posOffset>431800</wp:posOffset>
+            </wp:positionH>
+            <wp:positionV relativeFrom="page">
+              <wp:posOffset>6106666</wp:posOffset>
+            </wp:positionV>
+            <wp:extent cx="6696710" cy="434144"/>
+            <wp:effectExtent l="0" t="0" r="0" b="0"/>
+            <wp:wrapNone/>
+            <wp:docPr id="53" name="bullet-53"/>
+            <wp:cNvGraphicFramePr/>
+            <a:graphic xmlns:a="http://schemas.openxmlformats.org/drawingml/2006/main">
+              <a:graphicData uri="http://schemas.microsoft.com/office/word/2010/wordprocessingShape">
+                <wps:wsp>
+                  <wps:cNvPr id="54" name="bullet-53-text"/>
+                  <wps:cNvSpPr txBox="1"/>
+                  <wps:spPr>
+                    <a:xfrm>
+                      <a:off x="0" y="0"/>
+                      <a:ext cx="6696710" cy="434144"/>
+                    </a:xfrm>
+                    <a:prstGeom prst="rect">
+                      <a:avLst/>
+                    </a:prstGeom>
+                    <a:noFill/>
+                    <a:ln>
+                      <a:noFill/>
+                    </a:ln>
+                  </wps:spPr>
+                  <wps:txbx>
+                    <w:txbxContent>
+                      <w:p>
+                        <w:pPr>
+                          <w:numPr>
+                            <w:ilvl w:val="1"/>
+                            <w:numId w:val="10"/>
+                          </w:numPr>
+                          <w:snapToGrid w:val="0"/>
+                          <w:spacing w:before="0" w:after="0" w:line="288" w:lineRule="auto"/>
+                          <w:ind w:left="255" w:hanging="142"/>
+                          <w:jc w:val="both"/>
+                        </w:pPr>
+                        <w:r>
+                          <w:rPr>
+                            <w:b/>
+                            <w:i w:val="0"/>
+                            <w:color w:val="262626"/>
+                            <w:sz w:val="21"/>
+                            <w:u w:val="none"/>
+                            <w:rFonts w:ascii="Times New Roman" w:hAnsi="Times New Roman" w:cs="Times New Roman" w:eastAsia="KaiTi"/>
+                            <w:szCs w:val="21"/>
+                          </w:rPr>
+                          <w:t>接口设计：</w:t>
+                        </w:r>
+                        <w:r>
+                          <w:rPr>
+                            <w:b w:val="0"/>
+                            <w:i w:val="0"/>
+                            <w:color w:val="262626"/>
+                            <w:sz w:val="21"/>
+                            <w:u w:val="none"/>
+                            <w:rFonts w:ascii="Times New Roman" w:hAnsi="Times New Roman" w:cs="Times New Roman" w:eastAsia="KaiTi"/>
+                            <w:szCs w:val="21"/>
+                          </w:rPr>
+                          <w:t>使用 Python 与 FastAPI 封装任务及工具接口，以统一标识关联输入、执行日志和产物；为客户端提供状态查询及结果回溯能力。</w:t>
+                        </w:r>
+                      </w:p>
+                    </w:txbxContent>
+                  </wps:txbx>
+                  <wps:bodyPr rot="0" vert="horz" wrap="square" lIns="0" rIns="0" tIns="25400" bIns="12700" anchor="t">
                     <a:noAutofit/>
                   </wps:bodyPr>
                 </wps:wsp>
@@ -1828,22 +1881,22 @@
               <wp:posOffset>431800</wp:posOffset>
             </wp:positionH>
             <wp:positionV relativeFrom="page">
-              <wp:posOffset>6502400</wp:posOffset>
+              <wp:posOffset>6547160</wp:posOffset>
             </wp:positionV>
-            <wp:extent cx="6696710" cy="254000"/>
+            <wp:extent cx="6696710" cy="433883"/>
             <wp:effectExtent l="0" t="0" r="0" b="0"/>
             <wp:wrapNone/>
-            <wp:docPr id="55" name="body-55"/>
+            <wp:docPr id="55" name="bullet-55"/>
             <wp:cNvGraphicFramePr/>
             <a:graphic xmlns:a="http://schemas.openxmlformats.org/drawingml/2006/main">
               <a:graphicData uri="http://schemas.microsoft.com/office/word/2010/wordprocessingShape">
                 <wps:wsp>
-                  <wps:cNvPr id="56" name="body-55-text"/>
+                  <wps:cNvPr id="56" name="bullet-55-text"/>
                   <wps:cNvSpPr txBox="1"/>
                   <wps:spPr>
                     <a:xfrm>
                       <a:off x="0" y="0"/>
-                      <a:ext cx="6696710" cy="254000"/>
+                      <a:ext cx="6696710" cy="433883"/>
                     </a:xfrm>
                     <a:prstGeom prst="rect">
                       <a:avLst/>
@@ -1857,8 +1910,95 @@
                     <w:txbxContent>
                       <w:p>
                         <w:pPr>
+                          <w:numPr>
+                            <w:ilvl w:val="1"/>
+                            <w:numId w:val="10"/>
+                          </w:numPr>
                           <w:snapToGrid w:val="0"/>
                           <w:spacing w:before="0" w:after="0" w:line="288" w:lineRule="auto"/>
+                          <w:ind w:left="255" w:hanging="142"/>
+                          <w:jc w:val="both"/>
+                        </w:pPr>
+                        <w:r>
+                          <w:rPr>
+                            <w:b/>
+                            <w:i w:val="0"/>
+                            <w:color w:val="262626"/>
+                            <w:sz w:val="21"/>
+                            <w:u w:val="none"/>
+                            <w:rFonts w:ascii="Times New Roman" w:hAnsi="Times New Roman" w:cs="Times New Roman" w:eastAsia="KaiTi"/>
+                            <w:szCs w:val="21"/>
+                          </w:rPr>
+                          <w:t>质量验证：</w:t>
+                        </w:r>
+                        <w:r>
+                          <w:rPr>
+                            <w:b w:val="0"/>
+                            <w:i w:val="0"/>
+                            <w:color w:val="262626"/>
+                            <w:sz w:val="21"/>
+                            <w:u w:val="none"/>
+                            <w:rFonts w:ascii="Times New Roman" w:hAnsi="Times New Roman" w:cs="Times New Roman" w:eastAsia="KaiTi"/>
+                            <w:szCs w:val="21"/>
+                          </w:rPr>
+                          <w:t>建立固定任务集与失败分类，覆盖超时重试、重复事件和中断恢复；对照预期状态检查执行链路，并以日志定位交接环节的问题。</w:t>
+                        </w:r>
+                      </w:p>
+                    </w:txbxContent>
+                  </wps:txbx>
+                  <wps:bodyPr rot="0" vert="horz" wrap="square" lIns="0" rIns="0" tIns="25400" bIns="12700" anchor="t">
+                    <a:noAutofit/>
+                  </wps:bodyPr>
+                </wps:wsp>
+              </a:graphicData>
+            </a:graphic>
+          </wp:anchor>
+        </w:drawing>
+      </w:r>
+      <w:r>
+        <w:drawing>
+          <wp:anchor distT="0" distB="0" distL="0" distR="0" simplePos="0" relativeHeight="251660057" behindDoc="0" locked="0" layoutInCell="1" allowOverlap="1">
+            <wp:simplePos x="0" y="0"/>
+            <wp:positionH relativeFrom="page">
+              <wp:posOffset>431800</wp:posOffset>
+            </wp:positionH>
+            <wp:positionV relativeFrom="page">
+              <wp:posOffset>6987393</wp:posOffset>
+            </wp:positionV>
+            <wp:extent cx="6696710" cy="434257"/>
+            <wp:effectExtent l="0" t="0" r="0" b="0"/>
+            <wp:wrapNone/>
+            <wp:docPr id="57" name="bullet-57"/>
+            <wp:cNvGraphicFramePr/>
+            <a:graphic xmlns:a="http://schemas.openxmlformats.org/drawingml/2006/main">
+              <a:graphicData uri="http://schemas.microsoft.com/office/word/2010/wordprocessingShape">
+                <wps:wsp>
+                  <wps:cNvPr id="58" name="bullet-57-text"/>
+                  <wps:cNvSpPr txBox="1"/>
+                  <wps:spPr>
+                    <a:xfrm>
+                      <a:off x="0" y="0"/>
+                      <a:ext cx="6696710" cy="434257"/>
+                    </a:xfrm>
+                    <a:prstGeom prst="rect">
+                      <a:avLst/>
+                    </a:prstGeom>
+                    <a:noFill/>
+                    <a:ln>
+                      <a:noFill/>
+                    </a:ln>
+                  </wps:spPr>
+                  <wps:txbx>
+                    <w:txbxContent>
+                      <w:p>
+                        <w:pPr>
+                          <w:numPr>
+                            <w:ilvl w:val="0"/>
+                            <w:numId w:val="10"/>
+                          </w:numPr>
+                          <w:snapToGrid w:val="0"/>
+                          <w:spacing w:before="0" w:after="0" w:line="288" w:lineRule="auto"/>
+                          <w:ind w:left="142" w:hanging="142"/>
                           <w:jc w:val="both"/>
                         </w:pPr>
                         <w:r>
@@ -1883,12 +2023,12 @@
                             <w:rFonts w:ascii="Times New Roman" w:hAnsi="Times New Roman" w:cs="Times New Roman" w:eastAsia="KaiTi"/>
                             <w:szCs w:val="21"/>
                           </w:rPr>
-                          <w:t>交付接口说明、复现脚本和验收样例，形成可继续扩展的任务执行原型。</w:t>
+                          <w:t>交付可运行原型、接口说明与复现脚本；将联调中的失败样例沉淀为回归用例，为接入新工具和迭代流程提供可重复的验收基线。</w:t>
                         </w:r>
                       </w:p>
                     </w:txbxContent>
                   </wps:txbx>
-                  <wps:bodyPr rot="0" vert="horz" wrap="square" lIns="0" rIns="0" tIns="25400" bIns="25400" anchor="t">
+                  <wps:bodyPr rot="0" vert="horz" wrap="square" lIns="0" rIns="0" tIns="25400" bIns="12700" anchor="t">
                     <a:noAutofit/>
                   </wps:bodyPr>
                 </wps:wsp>
@@ -1899,28 +2039,28 @@
       </w:r>
       <w:r>
         <w:drawing>
-          <wp:anchor distT="0" distB="0" distL="0" distR="0" simplePos="0" relativeHeight="251660059" behindDoc="0" locked="0" layoutInCell="1" allowOverlap="1">
+          <wp:anchor distT="0" distB="0" distL="0" distR="0" simplePos="0" relativeHeight="251660061" behindDoc="0" locked="0" layoutInCell="1" allowOverlap="1">
             <wp:simplePos x="0" y="0"/>
             <wp:positionH relativeFrom="page">
               <wp:posOffset>431800</wp:posOffset>
             </wp:positionH>
             <wp:positionV relativeFrom="page">
-              <wp:posOffset>6870700</wp:posOffset>
+              <wp:posOffset>7510550</wp:posOffset>
             </wp:positionV>
-            <wp:extent cx="6696710" cy="304800"/>
+            <wp:extent cx="6696710" cy="279400"/>
             <wp:effectExtent l="0" t="0" r="0" b="0"/>
             <wp:wrapNone/>
-            <wp:docPr id="59" name="project_header-59"/>
+            <wp:docPr id="61" name="project_header-61"/>
             <wp:cNvGraphicFramePr/>
             <a:graphic xmlns:a="http://schemas.openxmlformats.org/drawingml/2006/main">
               <a:graphicData uri="http://schemas.microsoft.com/office/word/2010/wordprocessingShape">
                 <wps:wsp>
-                  <wps:cNvPr id="60" name="project_header-59-text"/>
+                  <wps:cNvPr id="62" name="project_header-61-text"/>
                   <wps:cNvSpPr txBox="1"/>
                   <wps:spPr>
                     <a:xfrm>
                       <a:off x="0" y="0"/>
-                      <a:ext cx="6696710" cy="304800"/>
+                      <a:ext cx="6696710" cy="279400"/>
                     </a:xfrm>
                     <a:prstGeom prst="rect">
                       <a:avLst/>
@@ -1979,7 +2119,7 @@
                           <w:drawing>
                             <wp:inline>
                               <wp:extent cx="139700" cy="139700"/>
-                              <wp:docPr id="58" name="inline-icon"/>
+                              <wp:docPr id="60" name="inline-icon"/>
                               <wp:cNvGraphicFramePr>
                                 <a:graphicFrameLocks noChangeAspect="1"/>
                               </wp:cNvGraphicFramePr>
@@ -1987,7 +2127,7 @@
                                 <a:graphicData uri="http://schemas.openxmlformats.org/drawingml/2006/picture">
                                   <pic:pic xmlns:pic="http://schemas.openxmlformats.org/drawingml/2006/picture">
                                     <pic:nvPicPr>
-                                      <pic:cNvPr id="57" name="inline-icon-57"/>
+                                      <pic:cNvPr id="59" name="inline-icon-59"/>
                                       <pic:cNvPicPr/>
                                     </pic:nvPicPr>
                                     <pic:blipFill>
@@ -2009,7 +2149,7 @@
                             </wp:inline>
                           </w:drawing>
                         </w:r>
-                        <w:hyperlink r:id="rId20">
+                        <w:hyperlink r:id="rId18">
                           <w:r>
                             <w:rPr>
                               <w:b w:val="0"/>
@@ -2037,182 +2177,28 @@
       </w:r>
       <w:r>
         <w:drawing>
-          <wp:anchor distT="0" distB="0" distL="0" distR="0" simplePos="0" relativeHeight="251660061" behindDoc="0" locked="0" layoutInCell="1" allowOverlap="1">
-            <wp:simplePos x="0" y="0"/>
-            <wp:positionH relativeFrom="page">
-              <wp:posOffset>431800</wp:posOffset>
-            </wp:positionH>
-            <wp:positionV relativeFrom="page">
-              <wp:posOffset>7175500</wp:posOffset>
-            </wp:positionV>
-            <wp:extent cx="6696710" cy="457200"/>
-            <wp:effectExtent l="0" t="0" r="0" b="0"/>
-            <wp:wrapNone/>
-            <wp:docPr id="61" name="body-61"/>
-            <wp:cNvGraphicFramePr/>
-            <a:graphic xmlns:a="http://schemas.openxmlformats.org/drawingml/2006/main">
-              <a:graphicData uri="http://schemas.microsoft.com/office/word/2010/wordprocessingShape">
-                <wps:wsp>
-                  <wps:cNvPr id="62" name="body-61-text"/>
-                  <wps:cNvSpPr txBox="1"/>
-                  <wps:spPr>
-                    <a:xfrm>
-                      <a:off x="0" y="0"/>
-                      <a:ext cx="6696710" cy="457200"/>
-                    </a:xfrm>
-                    <a:prstGeom prst="rect">
-                      <a:avLst/>
-                    </a:prstGeom>
-                    <a:noFill/>
-                    <a:ln>
-                      <a:noFill/>
-                    </a:ln>
-                  </wps:spPr>
-                  <wps:txbx>
-                    <w:txbxContent>
-                      <w:p>
-                        <w:pPr>
-                          <w:snapToGrid w:val="0"/>
-                          <w:spacing w:before="0" w:after="0" w:line="288" w:lineRule="auto"/>
-                          <w:jc w:val="both"/>
-                        </w:pPr>
-                        <w:r>
-                          <w:rPr>
-                            <w:b/>
-                            <w:i w:val="0"/>
-                            <w:color w:val="262626"/>
-                            <w:sz w:val="21"/>
-                            <w:u w:val="none"/>
-                            <w:rFonts w:ascii="Times New Roman" w:hAnsi="Times New Roman" w:cs="Times New Roman" w:eastAsia="KaiTi"/>
-                            <w:szCs w:val="21"/>
-                          </w:rPr>
-                          <w:t>项目背景：</w:t>
-                        </w:r>
-                        <w:r>
-                          <w:rPr>
-                            <w:b w:val="0"/>
-                            <w:i w:val="0"/>
-                            <w:color w:val="262626"/>
-                            <w:sz w:val="21"/>
-                            <w:u w:val="none"/>
-                            <w:rFonts w:ascii="Times New Roman" w:hAnsi="Times New Roman" w:cs="Times New Roman" w:eastAsia="KaiTi"/>
-                            <w:szCs w:val="21"/>
-                          </w:rPr>
-                          <w:t>针对告警上下文分散、人工排查重复的问题，聚合主机与网络事件，为分析人员提供可追溯的事件视图。</w:t>
-                        </w:r>
-                      </w:p>
-                    </w:txbxContent>
-                  </wps:txbx>
-                  <wps:bodyPr rot="0" vert="horz" wrap="square" lIns="0" rIns="0" tIns="25400" bIns="25400" anchor="t">
-                    <a:noAutofit/>
-                  </wps:bodyPr>
-                </wps:wsp>
-              </a:graphicData>
-            </a:graphic>
-          </wp:anchor>
-        </w:drawing>
-      </w:r>
-      <w:r>
-        <w:drawing>
           <wp:anchor distT="0" distB="0" distL="0" distR="0" simplePos="0" relativeHeight="251660063" behindDoc="0" locked="0" layoutInCell="1" allowOverlap="1">
             <wp:simplePos x="0" y="0"/>
             <wp:positionH relativeFrom="page">
               <wp:posOffset>431800</wp:posOffset>
             </wp:positionH>
             <wp:positionV relativeFrom="page">
-              <wp:posOffset>7645400</wp:posOffset>
+              <wp:posOffset>7796300</wp:posOffset>
             </wp:positionV>
-            <wp:extent cx="6696710" cy="254000"/>
+            <wp:extent cx="6696710" cy="434257"/>
             <wp:effectExtent l="0" t="0" r="0" b="0"/>
             <wp:wrapNone/>
-            <wp:docPr id="63" name="body-63"/>
+            <wp:docPr id="63" name="bullet-63"/>
             <wp:cNvGraphicFramePr/>
             <a:graphic xmlns:a="http://schemas.openxmlformats.org/drawingml/2006/main">
               <a:graphicData uri="http://schemas.microsoft.com/office/word/2010/wordprocessingShape">
                 <wps:wsp>
-                  <wps:cNvPr id="64" name="body-63-text"/>
+                  <wps:cNvPr id="64" name="bullet-63-text"/>
                   <wps:cNvSpPr txBox="1"/>
                   <wps:spPr>
                     <a:xfrm>
                       <a:off x="0" y="0"/>
-                      <a:ext cx="6696710" cy="254000"/>
-                    </a:xfrm>
-                    <a:prstGeom prst="rect">
-                      <a:avLst/>
-                    </a:prstGeom>
-                    <a:noFill/>
-                    <a:ln>
-                      <a:noFill/>
-                    </a:ln>
-                  </wps:spPr>
-                  <wps:txbx>
-                    <w:txbxContent>
-                      <w:p>
-                        <w:pPr>
-                          <w:snapToGrid w:val="0"/>
-                          <w:spacing w:before="0" w:after="0" w:line="288" w:lineRule="auto"/>
-                          <w:jc w:val="both"/>
-                        </w:pPr>
-                        <w:r>
-                          <w:rPr>
-                            <w:b/>
-                            <w:i w:val="0"/>
-                            <w:color w:val="262626"/>
-                            <w:sz w:val="21"/>
-                            <w:u w:val="none"/>
-                            <w:rFonts w:ascii="Times New Roman" w:hAnsi="Times New Roman" w:cs="Times New Roman" w:eastAsia="KaiTi"/>
-                            <w:szCs w:val="21"/>
-                          </w:rPr>
-                          <w:t>项目职责：</w:t>
-                        </w:r>
-                        <w:r>
-                          <w:rPr>
-                            <w:b/>
-                            <w:i w:val="0"/>
-                            <w:color w:val="262626"/>
-                            <w:sz w:val="21"/>
-                            <w:u w:val="none"/>
-                            <w:rFonts w:ascii="Times New Roman" w:hAnsi="Times New Roman" w:cs="Times New Roman" w:eastAsia="KaiTi"/>
-                            <w:szCs w:val="21"/>
-                          </w:rPr>
-                          <w:t>作为项目 Owner，负责事件模型、关联接口和验证样例；将分析结论与对应证据一并保留。</w:t>
-                        </w:r>
-                      </w:p>
-                    </w:txbxContent>
-                  </wps:txbx>
-                  <wps:bodyPr rot="0" vert="horz" wrap="square" lIns="0" rIns="0" tIns="25400" bIns="25400" anchor="t">
-                    <a:noAutofit/>
-                  </wps:bodyPr>
-                </wps:wsp>
-              </a:graphicData>
-            </a:graphic>
-          </wp:anchor>
-        </w:drawing>
-      </w:r>
-      <w:r>
-        <w:drawing>
-          <wp:anchor distT="0" distB="0" distL="0" distR="0" simplePos="0" relativeHeight="251660065" behindDoc="0" locked="0" layoutInCell="1" allowOverlap="1">
-            <wp:simplePos x="0" y="0"/>
-            <wp:positionH relativeFrom="page">
-              <wp:posOffset>431800</wp:posOffset>
-            </wp:positionH>
-            <wp:positionV relativeFrom="page">
-              <wp:posOffset>7912100</wp:posOffset>
-            </wp:positionV>
-            <wp:extent cx="6696710" cy="457200"/>
-            <wp:effectExtent l="0" t="0" r="0" b="0"/>
-            <wp:wrapNone/>
-            <wp:docPr id="65" name="bullet-65"/>
-            <wp:cNvGraphicFramePr/>
-            <a:graphic xmlns:a="http://schemas.openxmlformats.org/drawingml/2006/main">
-              <a:graphicData uri="http://schemas.microsoft.com/office/word/2010/wordprocessingShape">
-                <wps:wsp>
-                  <wps:cNvPr id="66" name="bullet-65-text"/>
-                  <wps:cNvSpPr txBox="1"/>
-                  <wps:spPr>
-                    <a:xfrm>
-                      <a:off x="0" y="0"/>
-                      <a:ext cx="6696710" cy="457200"/>
+                      <a:ext cx="6696710" cy="434257"/>
                     </a:xfrm>
                     <a:prstGeom prst="rect">
                       <a:avLst/>
@@ -2245,7 +2231,7 @@
                             <w:rFonts w:ascii="Times New Roman" w:hAnsi="Times New Roman" w:cs="Times New Roman" w:eastAsia="KaiTi"/>
                             <w:szCs w:val="21"/>
                           </w:rPr>
-                          <w:t>工程实现：</w:t>
+                          <w:t>项目背景：</w:t>
                         </w:r>
                         <w:r>
                           <w:rPr>
@@ -2257,12 +2243,12 @@
                             <w:rFonts w:ascii="Times New Roman" w:hAnsi="Times New Roman" w:cs="Times New Roman" w:eastAsia="KaiTi"/>
                             <w:szCs w:val="21"/>
                           </w:rPr>
-                          <w:t>使用 Go 接入事件流，结合 Kafka 处理异步消息；通过统一字段和关联标识连接检索结果与分析页面。</w:t>
+                          <w:t>针对告警上下文分散、重复人工检索和证据交接困难的问题，聚合主机与网络事件，为分析人员提供可追溯的事件调查视图。</w:t>
                         </w:r>
                       </w:p>
                     </w:txbxContent>
                   </wps:txbx>
-                  <wps:bodyPr rot="0" vert="horz" wrap="square" lIns="0" rIns="0" tIns="25400" bIns="25400" anchor="t">
+                  <wps:bodyPr rot="0" vert="horz" wrap="square" lIns="0" rIns="0" tIns="25400" bIns="12700" anchor="t">
                     <a:noAutofit/>
                   </wps:bodyPr>
                 </wps:wsp>
@@ -2273,628 +2259,28 @@
       </w:r>
       <w:r>
         <w:drawing>
-          <wp:anchor distT="0" distB="0" distL="0" distR="0" simplePos="0" relativeHeight="251660067" behindDoc="0" locked="0" layoutInCell="1" allowOverlap="1">
+          <wp:anchor distT="0" distB="0" distL="0" distR="0" simplePos="0" relativeHeight="251660065" behindDoc="0" locked="0" layoutInCell="1" allowOverlap="1">
             <wp:simplePos x="0" y="0"/>
             <wp:positionH relativeFrom="page">
               <wp:posOffset>431800</wp:posOffset>
             </wp:positionH>
             <wp:positionV relativeFrom="page">
-              <wp:posOffset>8382000</wp:posOffset>
+              <wp:posOffset>8236907</wp:posOffset>
             </wp:positionV>
-            <wp:extent cx="6696710" cy="254000"/>
+            <wp:extent cx="6696710" cy="433996"/>
             <wp:effectExtent l="0" t="0" r="0" b="0"/>
             <wp:wrapNone/>
-            <wp:docPr id="67" name="body-67"/>
+            <wp:docPr id="65" name="bullet-65"/>
             <wp:cNvGraphicFramePr/>
             <a:graphic xmlns:a="http://schemas.openxmlformats.org/drawingml/2006/main">
               <a:graphicData uri="http://schemas.microsoft.com/office/word/2010/wordprocessingShape">
                 <wps:wsp>
-                  <wps:cNvPr id="68" name="body-67-text"/>
+                  <wps:cNvPr id="66" name="bullet-65-text"/>
                   <wps:cNvSpPr txBox="1"/>
                   <wps:spPr>
                     <a:xfrm>
                       <a:off x="0" y="0"/>
-                      <a:ext cx="6696710" cy="254000"/>
-                    </a:xfrm>
-                    <a:prstGeom prst="rect">
-                      <a:avLst/>
-                    </a:prstGeom>
-                    <a:noFill/>
-                    <a:ln>
-                      <a:noFill/>
-                    </a:ln>
-                  </wps:spPr>
-                  <wps:txbx>
-                    <w:txbxContent>
-                      <w:p>
-                        <w:pPr>
-                          <w:snapToGrid w:val="0"/>
-                          <w:spacing w:before="0" w:after="0" w:line="288" w:lineRule="auto"/>
-                          <w:jc w:val="both"/>
-                        </w:pPr>
-                        <w:r>
-                          <w:rPr>
-                            <w:b/>
-                            <w:i w:val="0"/>
-                            <w:color w:val="262626"/>
-                            <w:sz w:val="21"/>
-                            <w:u w:val="none"/>
-                            <w:rFonts w:ascii="Times New Roman" w:hAnsi="Times New Roman" w:cs="Times New Roman" w:eastAsia="KaiTi"/>
-                            <w:szCs w:val="21"/>
-                          </w:rPr>
-                          <w:t>项目产出：</w:t>
-                        </w:r>
-                        <w:r>
-                          <w:rPr>
-                            <w:b w:val="0"/>
-                            <w:i w:val="0"/>
-                            <w:color w:val="262626"/>
-                            <w:sz w:val="21"/>
-                            <w:u w:val="none"/>
-                            <w:rFonts w:ascii="Times New Roman" w:hAnsi="Times New Roman" w:cs="Times New Roman" w:eastAsia="KaiTi"/>
-                            <w:szCs w:val="21"/>
-                          </w:rPr>
-                          <w:t>形成事件检索与证据回溯原型，并整理边界条件与复现步骤。</w:t>
-                        </w:r>
-                      </w:p>
-                    </w:txbxContent>
-                  </wps:txbx>
-                  <wps:bodyPr rot="0" vert="horz" wrap="square" lIns="0" rIns="0" tIns="25400" bIns="25400" anchor="t">
-                    <a:noAutofit/>
-                  </wps:bodyPr>
-                </wps:wsp>
-              </a:graphicData>
-            </a:graphic>
-          </wp:anchor>
-        </w:drawing>
-      </w:r>
-    </w:p>
-    <w:p>
-      <w:pPr>
-        <w:pageBreakBefore/>
-        <w:spacing w:before="0" w:after="0" w:line="20" w:lineRule="exact"/>
-      </w:pPr>
-      <w:r>
-        <w:drawing>
-          <wp:anchor distT="0" distB="0" distL="0" distR="0" simplePos="0" relativeHeight="251660069" behindDoc="0" locked="0" layoutInCell="1" allowOverlap="1">
-            <wp:simplePos x="0" y="0"/>
-            <wp:positionH relativeFrom="page">
-              <wp:posOffset>431800</wp:posOffset>
-            </wp:positionH>
-            <wp:positionV relativeFrom="page">
-              <wp:posOffset>381000</wp:posOffset>
-            </wp:positionV>
-            <wp:extent cx="6696710" cy="330200"/>
-            <wp:effectExtent l="0" t="0" r="0" b="0"/>
-            <wp:wrapNone/>
-            <wp:docPr id="69" name="section-69"/>
-            <wp:cNvGraphicFramePr/>
-            <a:graphic xmlns:a="http://schemas.openxmlformats.org/drawingml/2006/main">
-              <a:graphicData uri="http://schemas.microsoft.com/office/word/2010/wordprocessingGroup">
-                <wpg:wgp>
-                  <wpg:cNvGrpSpPr/>
-                  <wpg:grpSpPr>
-                    <a:xfrm>
-                      <a:off x="0" y="0"/>
-                      <a:ext cx="6696710" cy="330200"/>
-                      <a:chOff x="0" y="0"/>
-                      <a:chExt cx="6696710" cy="330200"/>
-                    </a:xfrm>
-                  </wpg:grpSpPr>
-                  <wps:wsp>
-                    <wps:cNvPr id="70" name="section-69-title"/>
-                    <wps:cNvSpPr txBox="1"/>
-                    <wps:spPr>
-                      <a:xfrm>
-                        <a:off x="0" y="0"/>
-                        <a:ext cx="6696710" cy="330200"/>
-                      </a:xfrm>
-                      <a:prstGeom prst="rect">
-                        <a:avLst/>
-                      </a:prstGeom>
-                      <a:noFill/>
-                      <a:ln>
-                        <a:noFill/>
-                      </a:ln>
-                    </wps:spPr>
-                    <wps:txbx>
-                      <w:txbxContent>
-                        <w:p>
-                          <w:pPr>
-                            <w:snapToGrid w:val="0"/>
-                            <w:spacing w:before="0" w:after="0" w:line="360" w:lineRule="exact"/>
-                            <w:jc w:val="left"/>
-                          </w:pPr>
-                          <w:r>
-                            <w:rPr>
-                              <w:b/>
-                              <w:i w:val="0"/>
-                              <w:color w:val="2F6FBA"/>
-                              <w:sz w:val="28"/>
-                              <w:u w:val="none"/>
-                              <w:rFonts w:ascii="Times New Roman" w:hAnsi="Times New Roman" w:cs="Times New Roman" w:eastAsia="KaiTi"/>
-                              <w:szCs w:val="28"/>
-                            </w:rPr>
-                            <w:t>科研经历</w:t>
-                          </w:r>
-                        </w:p>
-                      </w:txbxContent>
-                    </wps:txbx>
-                    <wps:bodyPr rot="0" vert="horz" wrap="square" lIns="0" rIns="0" tIns="25400" bIns="25400" anchor="t">
-                      <a:noAutofit/>
-                    </wps:bodyPr>
-                  </wps:wsp>
-                  <wps:wsp>
-                    <wps:cNvPr id="71" name="section-69-rule"/>
-                    <wps:cNvSpPr/>
-                    <wps:spPr>
-                      <a:xfrm>
-                        <a:off x="0" y="234950"/>
-                        <a:ext cx="6696710" cy="19050"/>
-                      </a:xfrm>
-                      <a:prstGeom prst="rect">
-                        <a:avLst/>
-                      </a:prstGeom>
-                      <a:solidFill>
-                        <a:srgbClr val="2F6FBA"/>
-                      </a:solidFill>
-                      <a:ln>
-                        <a:noFill/>
-                      </a:ln>
-                    </wps:spPr>
-                    <wps:bodyPr/>
-                  </wps:wsp>
-                </wpg:wgp>
-              </a:graphicData>
-            </a:graphic>
-          </wp:anchor>
-        </w:drawing>
-      </w:r>
-      <w:r>
-        <w:drawing>
-          <wp:anchor distT="0" distB="0" distL="0" distR="0" simplePos="0" relativeHeight="251660072" behindDoc="0" locked="0" layoutInCell="1" allowOverlap="1">
-            <wp:simplePos x="0" y="0"/>
-            <wp:positionH relativeFrom="page">
-              <wp:posOffset>431800</wp:posOffset>
-            </wp:positionH>
-            <wp:positionV relativeFrom="page">
-              <wp:posOffset>762000</wp:posOffset>
-            </wp:positionV>
-            <wp:extent cx="6696710" cy="330200"/>
-            <wp:effectExtent l="0" t="0" r="0" b="0"/>
-            <wp:wrapNone/>
-            <wp:docPr id="72" name="institution-72"/>
-            <wp:cNvGraphicFramePr/>
-            <a:graphic xmlns:a="http://schemas.openxmlformats.org/drawingml/2006/main">
-              <a:graphicData uri="http://schemas.microsoft.com/office/word/2010/wordprocessingGroup">
-                <wpg:wgp>
-                  <wpg:cNvGrpSpPr/>
-                  <wpg:grpSpPr>
-                    <a:xfrm>
-                      <a:off x="0" y="0"/>
-                      <a:ext cx="6696710" cy="330200"/>
-                      <a:chOff x="0" y="0"/>
-                      <a:chExt cx="6696710" cy="330200"/>
-                    </a:xfrm>
-                  </wpg:grpSpPr>
-                  <wps:wsp>
-                    <wps:cNvPr id="73" name="institution-72-background"/>
-                    <wps:cNvSpPr/>
-                    <wps:spPr>
-                      <a:xfrm>
-                        <a:off x="0" y="0"/>
-                        <a:ext cx="6696710" cy="330200"/>
-                      </a:xfrm>
-                      <a:prstGeom prst="rect">
-                        <a:avLst/>
-                      </a:prstGeom>
-                      <a:solidFill>
-                        <a:srgbClr val="2F6FBA">
-                          <a:alpha val="10000"/>
-                        </a:srgbClr>
-                      </a:solidFill>
-                      <a:ln>
-                        <a:noFill/>
-                      </a:ln>
-                    </wps:spPr>
-                    <wps:bodyPr/>
-                  </wps:wsp>
-                  <pic:pic xmlns:pic="http://schemas.openxmlformats.org/drawingml/2006/picture">
-                    <pic:nvPicPr>
-                      <pic:cNvPr id="74" name="institution-72-icon"/>
-                      <pic:cNvPicPr/>
-                    </pic:nvPicPr>
-                    <pic:blipFill>
-                      <a:blip r:embed="rId21"/>
-                      <a:stretch>
-                        <a:fillRect/>
-                      </a:stretch>
-                    </pic:blipFill>
-                    <pic:spPr>
-                      <a:xfrm>
-                        <a:off x="0" y="50800"/>
-                        <a:ext cx="228600" cy="228600"/>
-                      </a:xfrm>
-                      <a:prstGeom prst="rect"/>
-                    </pic:spPr>
-                  </pic:pic>
-                  <wps:wsp>
-                    <wps:cNvPr id="75" name="institution-72-text"/>
-                    <wps:cNvSpPr txBox="1"/>
-                    <wps:spPr>
-                      <a:xfrm>
-                        <a:off x="0" y="0"/>
-                        <a:ext cx="6696710" cy="330200"/>
-                      </a:xfrm>
-                      <a:prstGeom prst="rect">
-                        <a:avLst/>
-                      </a:prstGeom>
-                      <a:noFill/>
-                      <a:ln>
-                        <a:noFill/>
-                      </a:ln>
-                    </wps:spPr>
-                    <wps:txbx>
-                      <w:txbxContent>
-                        <w:p>
-                          <w:pPr>
-                            <w:tabs>
-                              <w:tab w:val="left" w:pos="3680"/>
-                              <w:tab w:val="left" w:pos="7100"/>
-                              <w:tab w:val="right" w:pos="10486"/>
-                            </w:tabs>
-                            <w:snapToGrid w:val="0"/>
-                            <w:spacing w:before="0" w:after="0" w:line="320" w:lineRule="exact"/>
-                            <w:ind w:left="440" w:hanging="0"/>
-                            <w:jc w:val="left"/>
-                          </w:pPr>
-                          <w:r>
-                            <w:rPr>
-                              <w:b/>
-                              <w:i w:val="0"/>
-                              <w:color w:val="265995"/>
-                              <w:sz w:val="22"/>
-                              <w:u w:val="none"/>
-                              <w:rFonts w:ascii="Times New Roman" w:hAnsi="Times New Roman" w:cs="Times New Roman" w:eastAsia="KaiTi"/>
-                              <w:szCs w:val="22"/>
-                            </w:rPr>
-                            <w:t>澄星研究院（虚构）</w:t>
-                            <w:tab/>
-                            <w:t>智能系统研究组</w:t>
-                            <w:tab/>
-                            <w:t>研究助理</w:t>
-                            <w:tab/>
-                            <w:t>2024.10—2025.06</w:t>
-                          </w:r>
-                        </w:p>
-                      </w:txbxContent>
-                    </wps:txbx>
-                    <wps:bodyPr rot="0" vert="horz" wrap="square" lIns="0" rIns="0" tIns="0" bIns="0" anchor="ctr">
-                      <a:noAutofit/>
-                    </wps:bodyPr>
-                  </wps:wsp>
-                </wpg:wgp>
-              </a:graphicData>
-            </a:graphic>
-          </wp:anchor>
-        </w:drawing>
-      </w:r>
-      <w:r>
-        <w:drawing>
-          <wp:anchor distT="0" distB="0" distL="0" distR="0" simplePos="0" relativeHeight="251660078" behindDoc="0" locked="0" layoutInCell="1" allowOverlap="1">
-            <wp:simplePos x="0" y="0"/>
-            <wp:positionH relativeFrom="page">
-              <wp:posOffset>431800</wp:posOffset>
-            </wp:positionH>
-            <wp:positionV relativeFrom="page">
-              <wp:posOffset>1130300</wp:posOffset>
-            </wp:positionV>
-            <wp:extent cx="6696710" cy="304800"/>
-            <wp:effectExtent l="0" t="0" r="0" b="0"/>
-            <wp:wrapNone/>
-            <wp:docPr id="78" name="project_header-78"/>
-            <wp:cNvGraphicFramePr/>
-            <a:graphic xmlns:a="http://schemas.openxmlformats.org/drawingml/2006/main">
-              <a:graphicData uri="http://schemas.microsoft.com/office/word/2010/wordprocessingShape">
-                <wps:wsp>
-                  <wps:cNvPr id="79" name="project_header-78-text"/>
-                  <wps:cNvSpPr txBox="1"/>
-                  <wps:spPr>
-                    <a:xfrm>
-                      <a:off x="0" y="0"/>
-                      <a:ext cx="6696710" cy="304800"/>
-                    </a:xfrm>
-                    <a:prstGeom prst="rect">
-                      <a:avLst/>
-                    </a:prstGeom>
-                    <a:noFill/>
-                    <a:ln>
-                      <a:noFill/>
-                    </a:ln>
-                  </wps:spPr>
-                  <wps:txbx>
-                    <w:txbxContent>
-                      <w:p>
-                        <w:pPr>
-                          <w:tabs>
-                            <w:tab w:val="right" w:pos="10546"/>
-                          </w:tabs>
-                          <w:snapToGrid w:val="0"/>
-                          <w:spacing w:before="0" w:after="0" w:line="360" w:lineRule="exact"/>
-                          <w:jc w:val="left"/>
-                        </w:pPr>
-                        <w:r>
-                          <w:rPr>
-                            <w:b/>
-                            <w:i w:val="0"/>
-                            <w:color w:val="265995"/>
-                            <w:sz w:val="21"/>
-                            <w:u w:val="none"/>
-                            <w:rFonts w:ascii="Times New Roman" w:hAnsi="Times New Roman" w:cs="Times New Roman" w:eastAsia="KaiTi"/>
-                            <w:szCs w:val="21"/>
-                          </w:rPr>
-                          <w:t>FlexRoute：约束条件下的任务路由（虚构）</w:t>
-                        </w:r>
-                        <w:r>
-                          <w:rPr>
-                            <w:b/>
-                            <w:i w:val="0"/>
-                            <w:color w:val="265995"/>
-                            <w:sz w:val="21"/>
-                            <w:u w:val="none"/>
-                            <w:rFonts w:ascii="Times New Roman" w:hAnsi="Times New Roman" w:cs="Times New Roman" w:eastAsia="KaiTi"/>
-                            <w:szCs w:val="21"/>
-                          </w:rPr>
-                          <w:tab/>
-                        </w:r>
-                        <w:r>
-                          <w:rPr>
-                            <w:b w:val="0"/>
-                            <w:i w:val="0"/>
-                            <w:color w:val="262626"/>
-                            <w:sz w:val="21"/>
-                            <w:u w:val="none"/>
-                            <w:rFonts w:ascii="Times New Roman" w:hAnsi="Times New Roman" w:cs="Times New Roman" w:eastAsia="KaiTi"/>
-                            <w:szCs w:val="21"/>
-                            <w:position w:val="-2"/>
-                          </w:rPr>
-                          <w:drawing>
-                            <wp:inline>
-                              <wp:extent cx="139700" cy="139700"/>
-                              <wp:docPr id="77" name="inline-icon"/>
-                              <wp:cNvGraphicFramePr>
-                                <a:graphicFrameLocks noChangeAspect="1"/>
-                              </wp:cNvGraphicFramePr>
-                              <a:graphic>
-                                <a:graphicData uri="http://schemas.openxmlformats.org/drawingml/2006/picture">
-                                  <pic:pic xmlns:pic="http://schemas.openxmlformats.org/drawingml/2006/picture">
-                                    <pic:nvPicPr>
-                                      <pic:cNvPr id="76" name="inline-icon-76"/>
-                                      <pic:cNvPicPr/>
-                                    </pic:nvPicPr>
-                                    <pic:blipFill>
-                                      <a:blip r:embed="rId12"/>
-                                      <a:stretch>
-                                        <a:fillRect/>
-                                      </a:stretch>
-                                    </pic:blipFill>
-                                    <pic:spPr>
-                                      <a:xfrm>
-                                        <a:off x="0" y="0"/>
-                                        <a:ext cx="139700" cy="139700"/>
-                                      </a:xfrm>
-                                      <a:prstGeom prst="rect"/>
-                                    </pic:spPr>
-                                  </pic:pic>
-                                </a:graphicData>
-                              </a:graphic>
-                            </wp:inline>
-                          </w:drawing>
-                        </w:r>
-                        <w:hyperlink r:id="rId22">
-                          <w:r>
-                            <w:rPr>
-                              <w:b w:val="0"/>
-                              <w:i w:val="0"/>
-                              <w:color w:val="0000FF"/>
-                              <w:sz w:val="21"/>
-                              <w:u w:val="single"/>
-                              <w:rFonts w:ascii="Times New Roman" w:hAnsi="Times New Roman" w:cs="Times New Roman" w:eastAsia="KaiTi"/>
-                              <w:szCs w:val="21"/>
-                            </w:rPr>
-                            <w:t xml:space="preserve"> GitHub</w:t>
-                          </w:r>
-                        </w:hyperlink>
-                      </w:p>
-                    </w:txbxContent>
-                  </wps:txbx>
-                  <wps:bodyPr rot="0" vert="horz" wrap="square" lIns="0" rIns="0" tIns="25400" bIns="25400" anchor="t">
-                    <a:noAutofit/>
-                  </wps:bodyPr>
-                </wps:wsp>
-              </a:graphicData>
-            </a:graphic>
-          </wp:anchor>
-        </w:drawing>
-      </w:r>
-      <w:r>
-        <w:drawing>
-          <wp:anchor distT="0" distB="0" distL="0" distR="0" simplePos="0" relativeHeight="251660080" behindDoc="0" locked="0" layoutInCell="1" allowOverlap="1">
-            <wp:simplePos x="0" y="0"/>
-            <wp:positionH relativeFrom="page">
-              <wp:posOffset>431800</wp:posOffset>
-            </wp:positionH>
-            <wp:positionV relativeFrom="page">
-              <wp:posOffset>1435100</wp:posOffset>
-            </wp:positionV>
-            <wp:extent cx="6696710" cy="457200"/>
-            <wp:effectExtent l="0" t="0" r="0" b="0"/>
-            <wp:wrapNone/>
-            <wp:docPr id="80" name="body-80"/>
-            <wp:cNvGraphicFramePr/>
-            <a:graphic xmlns:a="http://schemas.openxmlformats.org/drawingml/2006/main">
-              <a:graphicData uri="http://schemas.microsoft.com/office/word/2010/wordprocessingShape">
-                <wps:wsp>
-                  <wps:cNvPr id="81" name="body-80-text"/>
-                  <wps:cNvSpPr txBox="1"/>
-                  <wps:spPr>
-                    <a:xfrm>
-                      <a:off x="0" y="0"/>
-                      <a:ext cx="6696710" cy="457200"/>
-                    </a:xfrm>
-                    <a:prstGeom prst="rect">
-                      <a:avLst/>
-                    </a:prstGeom>
-                    <a:noFill/>
-                    <a:ln>
-                      <a:noFill/>
-                    </a:ln>
-                  </wps:spPr>
-                  <wps:txbx>
-                    <w:txbxContent>
-                      <w:p>
-                        <w:pPr>
-                          <w:snapToGrid w:val="0"/>
-                          <w:spacing w:before="0" w:after="0" w:line="288" w:lineRule="auto"/>
-                          <w:jc w:val="both"/>
-                        </w:pPr>
-                        <w:r>
-                          <w:rPr>
-                            <w:b/>
-                            <w:i w:val="0"/>
-                            <w:color w:val="262626"/>
-                            <w:sz w:val="21"/>
-                            <w:u w:val="none"/>
-                            <w:rFonts w:ascii="Times New Roman" w:hAnsi="Times New Roman" w:cs="Times New Roman" w:eastAsia="KaiTi"/>
-                            <w:szCs w:val="21"/>
-                          </w:rPr>
-                          <w:t>研究背景：</w:t>
-                        </w:r>
-                        <w:r>
-                          <w:rPr>
-                            <w:b w:val="0"/>
-                            <w:i w:val="0"/>
-                            <w:color w:val="262626"/>
-                            <w:sz w:val="21"/>
-                            <w:u w:val="none"/>
-                            <w:rFonts w:ascii="Times New Roman" w:hAnsi="Times New Roman" w:cs="Times New Roman" w:eastAsia="KaiTi"/>
-                            <w:szCs w:val="21"/>
-                          </w:rPr>
-                          <w:t>面向工具成本和响应时限不同的任务，探索在资源预算内选择执行路径，避免统一路由策略造成不必要的调用。</w:t>
-                        </w:r>
-                      </w:p>
-                    </w:txbxContent>
-                  </wps:txbx>
-                  <wps:bodyPr rot="0" vert="horz" wrap="square" lIns="0" rIns="0" tIns="25400" bIns="25400" anchor="t">
-                    <a:noAutofit/>
-                  </wps:bodyPr>
-                </wps:wsp>
-              </a:graphicData>
-            </a:graphic>
-          </wp:anchor>
-        </w:drawing>
-      </w:r>
-      <w:r>
-        <w:drawing>
-          <wp:anchor distT="0" distB="0" distL="0" distR="0" simplePos="0" relativeHeight="251660082" behindDoc="0" locked="0" layoutInCell="1" allowOverlap="1">
-            <wp:simplePos x="0" y="0"/>
-            <wp:positionH relativeFrom="page">
-              <wp:posOffset>431800</wp:posOffset>
-            </wp:positionH>
-            <wp:positionV relativeFrom="page">
-              <wp:posOffset>1905000</wp:posOffset>
-            </wp:positionV>
-            <wp:extent cx="6696710" cy="254000"/>
-            <wp:effectExtent l="0" t="0" r="0" b="0"/>
-            <wp:wrapNone/>
-            <wp:docPr id="82" name="body-82"/>
-            <wp:cNvGraphicFramePr/>
-            <a:graphic xmlns:a="http://schemas.openxmlformats.org/drawingml/2006/main">
-              <a:graphicData uri="http://schemas.microsoft.com/office/word/2010/wordprocessingShape">
-                <wps:wsp>
-                  <wps:cNvPr id="83" name="body-82-text"/>
-                  <wps:cNvSpPr txBox="1"/>
-                  <wps:spPr>
-                    <a:xfrm>
-                      <a:off x="0" y="0"/>
-                      <a:ext cx="6696710" cy="254000"/>
-                    </a:xfrm>
-                    <a:prstGeom prst="rect">
-                      <a:avLst/>
-                    </a:prstGeom>
-                    <a:noFill/>
-                    <a:ln>
-                      <a:noFill/>
-                    </a:ln>
-                  </wps:spPr>
-                  <wps:txbx>
-                    <w:txbxContent>
-                      <w:p>
-                        <w:pPr>
-                          <w:snapToGrid w:val="0"/>
-                          <w:spacing w:before="0" w:after="0" w:line="288" w:lineRule="auto"/>
-                          <w:jc w:val="both"/>
-                        </w:pPr>
-                        <w:r>
-                          <w:rPr>
-                            <w:b/>
-                            <w:i w:val="0"/>
-                            <w:color w:val="262626"/>
-                            <w:sz w:val="21"/>
-                            <w:u w:val="none"/>
-                            <w:rFonts w:ascii="Times New Roman" w:hAnsi="Times New Roman" w:cs="Times New Roman" w:eastAsia="KaiTi"/>
-                            <w:szCs w:val="21"/>
-                          </w:rPr>
-                          <w:t>个人职责：</w:t>
-                        </w:r>
-                        <w:r>
-                          <w:rPr>
-                            <w:b/>
-                            <w:i w:val="0"/>
-                            <w:color w:val="262626"/>
-                            <w:sz w:val="21"/>
-                            <w:u w:val="none"/>
-                            <w:rFonts w:ascii="Times New Roman" w:hAnsi="Times New Roman" w:cs="Times New Roman" w:eastAsia="KaiTi"/>
-                            <w:szCs w:val="21"/>
-                          </w:rPr>
-                          <w:t>负责路由策略原型和评测流程，将任务约束、候选路径与失败恢复条件表示为可重复执行的配置。</w:t>
-                        </w:r>
-                      </w:p>
-                    </w:txbxContent>
-                  </wps:txbx>
-                  <wps:bodyPr rot="0" vert="horz" wrap="square" lIns="0" rIns="0" tIns="25400" bIns="25400" anchor="t">
-                    <a:noAutofit/>
-                  </wps:bodyPr>
-                </wps:wsp>
-              </a:graphicData>
-            </a:graphic>
-          </wp:anchor>
-        </w:drawing>
-      </w:r>
-      <w:r>
-        <w:drawing>
-          <wp:anchor distT="0" distB="0" distL="0" distR="0" simplePos="0" relativeHeight="251660084" behindDoc="0" locked="0" layoutInCell="1" allowOverlap="1">
-            <wp:simplePos x="0" y="0"/>
-            <wp:positionH relativeFrom="page">
-              <wp:posOffset>431800</wp:posOffset>
-            </wp:positionH>
-            <wp:positionV relativeFrom="page">
-              <wp:posOffset>2171700</wp:posOffset>
-            </wp:positionV>
-            <wp:extent cx="6696710" cy="254000"/>
-            <wp:effectExtent l="0" t="0" r="0" b="0"/>
-            <wp:wrapNone/>
-            <wp:docPr id="84" name="bullet-84"/>
-            <wp:cNvGraphicFramePr/>
-            <a:graphic xmlns:a="http://schemas.openxmlformats.org/drawingml/2006/main">
-              <a:graphicData uri="http://schemas.microsoft.com/office/word/2010/wordprocessingShape">
-                <wps:wsp>
-                  <wps:cNvPr id="85" name="bullet-84-text"/>
-                  <wps:cNvSpPr txBox="1"/>
-                  <wps:spPr>
-                    <a:xfrm>
-                      <a:off x="0" y="0"/>
-                      <a:ext cx="6696710" cy="254000"/>
+                      <a:ext cx="6696710" cy="433996"/>
                     </a:xfrm>
                     <a:prstGeom prst="rect">
                       <a:avLst/>
@@ -2927,7 +2313,89 @@
                             <w:rFonts w:ascii="Times New Roman" w:hAnsi="Times New Roman" w:cs="Times New Roman" w:eastAsia="KaiTi"/>
                             <w:szCs w:val="21"/>
                           </w:rPr>
-                          <w:t>方法设计：</w:t>
+                          <w:t>项目职责：</w:t>
+                        </w:r>
+                        <w:r>
+                          <w:rPr>
+                            <w:b/>
+                            <w:i w:val="0"/>
+                            <w:color w:val="262626"/>
+                            <w:sz w:val="21"/>
+                            <w:u w:val="none"/>
+                            <w:rFonts w:ascii="Times New Roman" w:hAnsi="Times New Roman" w:cs="Times New Roman" w:eastAsia="KaiTi"/>
+                            <w:szCs w:val="21"/>
+                          </w:rPr>
+                          <w:t>作为项目 Owner，负责事件模型、关联接口与分析页面的设计，明确证据保留要求，组织端到端联调及边界条件验证。</w:t>
+                        </w:r>
+                      </w:p>
+                    </w:txbxContent>
+                  </wps:txbx>
+                  <wps:bodyPr rot="0" vert="horz" wrap="square" lIns="0" rIns="0" tIns="25400" bIns="12700" anchor="t">
+                    <a:noAutofit/>
+                  </wps:bodyPr>
+                </wps:wsp>
+              </a:graphicData>
+            </a:graphic>
+          </wp:anchor>
+        </w:drawing>
+      </w:r>
+      <w:r>
+        <w:drawing>
+          <wp:anchor distT="0" distB="0" distL="0" distR="0" simplePos="0" relativeHeight="251660067" behindDoc="0" locked="0" layoutInCell="1" allowOverlap="1">
+            <wp:simplePos x="0" y="0"/>
+            <wp:positionH relativeFrom="page">
+              <wp:posOffset>431800</wp:posOffset>
+            </wp:positionH>
+            <wp:positionV relativeFrom="page">
+              <wp:posOffset>8677253</wp:posOffset>
+            </wp:positionV>
+            <wp:extent cx="6696710" cy="433735"/>
+            <wp:effectExtent l="0" t="0" r="0" b="0"/>
+            <wp:wrapNone/>
+            <wp:docPr id="67" name="bullet-67"/>
+            <wp:cNvGraphicFramePr/>
+            <a:graphic xmlns:a="http://schemas.openxmlformats.org/drawingml/2006/main">
+              <a:graphicData uri="http://schemas.microsoft.com/office/word/2010/wordprocessingShape">
+                <wps:wsp>
+                  <wps:cNvPr id="68" name="bullet-67-text"/>
+                  <wps:cNvSpPr txBox="1"/>
+                  <wps:spPr>
+                    <a:xfrm>
+                      <a:off x="0" y="0"/>
+                      <a:ext cx="6696710" cy="433735"/>
+                    </a:xfrm>
+                    <a:prstGeom prst="rect">
+                      <a:avLst/>
+                    </a:prstGeom>
+                    <a:noFill/>
+                    <a:ln>
+                      <a:noFill/>
+                    </a:ln>
+                  </wps:spPr>
+                  <wps:txbx>
+                    <w:txbxContent>
+                      <w:p>
+                        <w:pPr>
+                          <w:numPr>
+                            <w:ilvl w:val="1"/>
+                            <w:numId w:val="10"/>
+                          </w:numPr>
+                          <w:snapToGrid w:val="0"/>
+                          <w:spacing w:before="0" w:after="0" w:line="288" w:lineRule="auto"/>
+                          <w:ind w:left="255" w:hanging="142"/>
+                          <w:jc w:val="both"/>
+                        </w:pPr>
+                        <w:r>
+                          <w:rPr>
+                            <w:b/>
+                            <w:i w:val="0"/>
+                            <w:color w:val="262626"/>
+                            <w:sz w:val="21"/>
+                            <w:u w:val="none"/>
+                            <w:rFonts w:ascii="Times New Roman" w:hAnsi="Times New Roman" w:cs="Times New Roman" w:eastAsia="KaiTi"/>
+                            <w:szCs w:val="21"/>
+                          </w:rPr>
+                          <w:t>事件接入：</w:t>
                         </w:r>
                         <w:r>
                           <w:rPr>
@@ -2939,12 +2407,12 @@
                             <w:rFonts w:ascii="Times New Roman" w:hAnsi="Times New Roman" w:cs="Times New Roman" w:eastAsia="KaiTi"/>
                             <w:szCs w:val="21"/>
                           </w:rPr>
-                          <w:t>按任务难度与可用工具建立分层决策过程，对比静态规则与动态选择，并保留路径选择的解释信息。</w:t>
+                          <w:t>使用 Go 接入事件流，通过 Kafka 处理异步消息；统一时间、主体和来源字段，以关联标识连接原始记录、检索结果与调查对象。</w:t>
                         </w:r>
                       </w:p>
                     </w:txbxContent>
                   </wps:txbx>
-                  <wps:bodyPr rot="0" vert="horz" wrap="square" lIns="0" rIns="0" tIns="25400" bIns="25400" anchor="t">
+                  <wps:bodyPr rot="0" vert="horz" wrap="square" lIns="0" rIns="0" tIns="25400" bIns="12700" anchor="t">
                     <a:noAutofit/>
                   </wps:bodyPr>
                 </wps:wsp>
@@ -2955,28 +2423,192 @@
       </w:r>
       <w:r>
         <w:drawing>
-          <wp:anchor distT="0" distB="0" distL="0" distR="0" simplePos="0" relativeHeight="251660086" behindDoc="0" locked="0" layoutInCell="1" allowOverlap="1">
+          <wp:anchor distT="0" distB="0" distL="0" distR="0" simplePos="0" relativeHeight="251660069" behindDoc="0" locked="0" layoutInCell="1" allowOverlap="1">
             <wp:simplePos x="0" y="0"/>
             <wp:positionH relativeFrom="page">
               <wp:posOffset>431800</wp:posOffset>
             </wp:positionH>
             <wp:positionV relativeFrom="page">
-              <wp:posOffset>2438400</wp:posOffset>
+              <wp:posOffset>9117338</wp:posOffset>
             </wp:positionV>
-            <wp:extent cx="6696710" cy="457200"/>
+            <wp:extent cx="6696710" cy="434109"/>
             <wp:effectExtent l="0" t="0" r="0" b="0"/>
             <wp:wrapNone/>
-            <wp:docPr id="86" name="bullet-86"/>
+            <wp:docPr id="69" name="bullet-69"/>
             <wp:cNvGraphicFramePr/>
             <a:graphic xmlns:a="http://schemas.openxmlformats.org/drawingml/2006/main">
               <a:graphicData uri="http://schemas.microsoft.com/office/word/2010/wordprocessingShape">
                 <wps:wsp>
-                  <wps:cNvPr id="87" name="bullet-86-text"/>
+                  <wps:cNvPr id="70" name="bullet-69-text"/>
                   <wps:cNvSpPr txBox="1"/>
                   <wps:spPr>
                     <a:xfrm>
                       <a:off x="0" y="0"/>
-                      <a:ext cx="6696710" cy="457200"/>
+                      <a:ext cx="6696710" cy="434109"/>
+                    </a:xfrm>
+                    <a:prstGeom prst="rect">
+                      <a:avLst/>
+                    </a:prstGeom>
+                    <a:noFill/>
+                    <a:ln>
+                      <a:noFill/>
+                    </a:ln>
+                  </wps:spPr>
+                  <wps:txbx>
+                    <w:txbxContent>
+                      <w:p>
+                        <w:pPr>
+                          <w:numPr>
+                            <w:ilvl w:val="1"/>
+                            <w:numId w:val="10"/>
+                          </w:numPr>
+                          <w:snapToGrid w:val="0"/>
+                          <w:spacing w:before="0" w:after="0" w:line="288" w:lineRule="auto"/>
+                          <w:ind w:left="255" w:hanging="142"/>
+                          <w:jc w:val="both"/>
+                        </w:pPr>
+                        <w:r>
+                          <w:rPr>
+                            <w:b/>
+                            <w:i w:val="0"/>
+                            <w:color w:val="262626"/>
+                            <w:sz w:val="21"/>
+                            <w:u w:val="none"/>
+                            <w:rFonts w:ascii="Times New Roman" w:hAnsi="Times New Roman" w:cs="Times New Roman" w:eastAsia="KaiTi"/>
+                            <w:szCs w:val="21"/>
+                          </w:rPr>
+                          <w:t>证据呈现：</w:t>
+                        </w:r>
+                        <w:r>
+                          <w:rPr>
+                            <w:b w:val="0"/>
+                            <w:i w:val="0"/>
+                            <w:color w:val="262626"/>
+                            <w:sz w:val="21"/>
+                            <w:u w:val="none"/>
+                            <w:rFonts w:ascii="Times New Roman" w:hAnsi="Times New Roman" w:cs="Times New Roman" w:eastAsia="KaiTi"/>
+                            <w:szCs w:val="21"/>
+                          </w:rPr>
+                          <w:t>以 React 构建事件时间线和证据详情页，将分析结论与对应来源一并展示；保留查询条件和原始记录入口，便于复核关联依据。</w:t>
+                        </w:r>
+                      </w:p>
+                    </w:txbxContent>
+                  </wps:txbx>
+                  <wps:bodyPr rot="0" vert="horz" wrap="square" lIns="0" rIns="0" tIns="25400" bIns="12700" anchor="t">
+                    <a:noAutofit/>
+                  </wps:bodyPr>
+                </wps:wsp>
+              </a:graphicData>
+            </a:graphic>
+          </wp:anchor>
+        </w:drawing>
+      </w:r>
+      <w:r>
+        <w:drawing>
+          <wp:anchor distT="0" distB="0" distL="0" distR="0" simplePos="0" relativeHeight="251660071" behindDoc="0" locked="0" layoutInCell="1" allowOverlap="1">
+            <wp:simplePos x="0" y="0"/>
+            <wp:positionH relativeFrom="page">
+              <wp:posOffset>431800</wp:posOffset>
+            </wp:positionH>
+            <wp:positionV relativeFrom="page">
+              <wp:posOffset>9557797</wp:posOffset>
+            </wp:positionV>
+            <wp:extent cx="6696710" cy="433848"/>
+            <wp:effectExtent l="0" t="0" r="0" b="0"/>
+            <wp:wrapNone/>
+            <wp:docPr id="71" name="bullet-71"/>
+            <wp:cNvGraphicFramePr/>
+            <a:graphic xmlns:a="http://schemas.openxmlformats.org/drawingml/2006/main">
+              <a:graphicData uri="http://schemas.microsoft.com/office/word/2010/wordprocessingShape">
+                <wps:wsp>
+                  <wps:cNvPr id="72" name="bullet-71-text"/>
+                  <wps:cNvSpPr txBox="1"/>
+                  <wps:spPr>
+                    <a:xfrm>
+                      <a:off x="0" y="0"/>
+                      <a:ext cx="6696710" cy="433848"/>
+                    </a:xfrm>
+                    <a:prstGeom prst="rect">
+                      <a:avLst/>
+                    </a:prstGeom>
+                    <a:noFill/>
+                    <a:ln>
+                      <a:noFill/>
+                    </a:ln>
+                  </wps:spPr>
+                  <wps:txbx>
+                    <w:txbxContent>
+                      <w:p>
+                        <w:pPr>
+                          <w:numPr>
+                            <w:ilvl w:val="1"/>
+                            <w:numId w:val="10"/>
+                          </w:numPr>
+                          <w:snapToGrid w:val="0"/>
+                          <w:spacing w:before="0" w:after="0" w:line="288" w:lineRule="auto"/>
+                          <w:ind w:left="255" w:hanging="142"/>
+                          <w:jc w:val="both"/>
+                        </w:pPr>
+                        <w:r>
+                          <w:rPr>
+                            <w:b/>
+                            <w:i w:val="0"/>
+                            <w:color w:val="262626"/>
+                            <w:sz w:val="21"/>
+                            <w:u w:val="none"/>
+                            <w:rFonts w:ascii="Times New Roman" w:hAnsi="Times New Roman" w:cs="Times New Roman" w:eastAsia="KaiTi"/>
+                            <w:szCs w:val="21"/>
+                          </w:rPr>
+                          <w:t>工程验证：</w:t>
+                        </w:r>
+                        <w:r>
+                          <w:rPr>
+                            <w:b w:val="0"/>
+                            <w:i w:val="0"/>
+                            <w:color w:val="262626"/>
+                            <w:sz w:val="21"/>
+                            <w:u w:val="none"/>
+                            <w:rFonts w:ascii="Times New Roman" w:hAnsi="Times New Roman" w:cs="Times New Roman" w:eastAsia="KaiTi"/>
+                            <w:szCs w:val="21"/>
+                          </w:rPr>
+                          <w:t>针对迟到消息、重复事件和缺失字段构造测试样例，核对检索结果及页面展示的一致性；整理异常处理规则与数据接入约束。</w:t>
+                        </w:r>
+                      </w:p>
+                    </w:txbxContent>
+                  </wps:txbx>
+                  <wps:bodyPr rot="0" vert="horz" wrap="square" lIns="0" rIns="0" tIns="25400" bIns="12700" anchor="t">
+                    <a:noAutofit/>
+                  </wps:bodyPr>
+                </wps:wsp>
+              </a:graphicData>
+            </a:graphic>
+          </wp:anchor>
+        </w:drawing>
+      </w:r>
+      <w:r>
+        <w:drawing>
+          <wp:anchor distT="0" distB="0" distL="0" distR="0" simplePos="0" relativeHeight="251660073" behindDoc="0" locked="0" layoutInCell="1" allowOverlap="1">
+            <wp:simplePos x="0" y="0"/>
+            <wp:positionH relativeFrom="page">
+              <wp:posOffset>431800</wp:posOffset>
+            </wp:positionH>
+            <wp:positionV relativeFrom="page">
+              <wp:posOffset>9997995</wp:posOffset>
+            </wp:positionV>
+            <wp:extent cx="6696710" cy="434222"/>
+            <wp:effectExtent l="0" t="0" r="0" b="0"/>
+            <wp:wrapNone/>
+            <wp:docPr id="73" name="bullet-73"/>
+            <wp:cNvGraphicFramePr/>
+            <a:graphic xmlns:a="http://schemas.openxmlformats.org/drawingml/2006/main">
+              <a:graphicData uri="http://schemas.microsoft.com/office/word/2010/wordprocessingShape">
+                <wps:wsp>
+                  <wps:cNvPr id="74" name="bullet-73-text"/>
+                  <wps:cNvSpPr txBox="1"/>
+                  <wps:spPr>
+                    <a:xfrm>
+                      <a:off x="0" y="0"/>
+                      <a:ext cx="6696710" cy="434222"/>
                     </a:xfrm>
                     <a:prstGeom prst="rect">
                       <a:avLst/>
@@ -3009,7 +2641,7 @@
                             <w:rFonts w:ascii="Times New Roman" w:hAnsi="Times New Roman" w:cs="Times New Roman" w:eastAsia="KaiTi"/>
                             <w:szCs w:val="21"/>
                           </w:rPr>
-                          <w:t>实验分析：</w:t>
+                          <w:t>项目产出：</w:t>
                         </w:r>
                         <w:r>
                           <w:rPr>
@@ -3021,912 +2653,12 @@
                             <w:rFonts w:ascii="Times New Roman" w:hAnsi="Times New Roman" w:cs="Times New Roman" w:eastAsia="KaiTi"/>
                             <w:szCs w:val="21"/>
                           </w:rPr>
-                          <w:t>固定数据划分、调用预算和评估脚本，分别分析完成率、耗时与调用成本，定位收益来自哪些任务类型。</w:t>
+                          <w:t>完成事件检索与证据回溯原型，提交数据接入说明和可复现验证样例；以事件时间线串联调查过程，支持分析人员复核证据及交接结论。</w:t>
                         </w:r>
                       </w:p>
                     </w:txbxContent>
                   </wps:txbx>
-                  <wps:bodyPr rot="0" vert="horz" wrap="square" lIns="0" rIns="0" tIns="25400" bIns="25400" anchor="t">
-                    <a:noAutofit/>
-                  </wps:bodyPr>
-                </wps:wsp>
-              </a:graphicData>
-            </a:graphic>
-          </wp:anchor>
-        </w:drawing>
-      </w:r>
-      <w:r>
-        <w:drawing>
-          <wp:anchor distT="0" distB="0" distL="0" distR="0" simplePos="0" relativeHeight="251660088" behindDoc="0" locked="0" layoutInCell="1" allowOverlap="1">
-            <wp:simplePos x="0" y="0"/>
-            <wp:positionH relativeFrom="page">
-              <wp:posOffset>431800</wp:posOffset>
-            </wp:positionH>
-            <wp:positionV relativeFrom="page">
-              <wp:posOffset>2908300</wp:posOffset>
-            </wp:positionV>
-            <wp:extent cx="6696710" cy="254000"/>
-            <wp:effectExtent l="0" t="0" r="0" b="0"/>
-            <wp:wrapNone/>
-            <wp:docPr id="88" name="body-88"/>
-            <wp:cNvGraphicFramePr/>
-            <a:graphic xmlns:a="http://schemas.openxmlformats.org/drawingml/2006/main">
-              <a:graphicData uri="http://schemas.microsoft.com/office/word/2010/wordprocessingShape">
-                <wps:wsp>
-                  <wps:cNvPr id="89" name="body-88-text"/>
-                  <wps:cNvSpPr txBox="1"/>
-                  <wps:spPr>
-                    <a:xfrm>
-                      <a:off x="0" y="0"/>
-                      <a:ext cx="6696710" cy="254000"/>
-                    </a:xfrm>
-                    <a:prstGeom prst="rect">
-                      <a:avLst/>
-                    </a:prstGeom>
-                    <a:noFill/>
-                    <a:ln>
-                      <a:noFill/>
-                    </a:ln>
-                  </wps:spPr>
-                  <wps:txbx>
-                    <w:txbxContent>
-                      <w:p>
-                        <w:pPr>
-                          <w:snapToGrid w:val="0"/>
-                          <w:spacing w:before="0" w:after="0" w:line="288" w:lineRule="auto"/>
-                          <w:jc w:val="both"/>
-                        </w:pPr>
-                        <w:r>
-                          <w:rPr>
-                            <w:b/>
-                            <w:i w:val="0"/>
-                            <w:color w:val="262626"/>
-                            <w:sz w:val="21"/>
-                            <w:u w:val="none"/>
-                            <w:rFonts w:ascii="Times New Roman" w:hAnsi="Times New Roman" w:cs="Times New Roman" w:eastAsia="KaiTi"/>
-                            <w:szCs w:val="21"/>
-                          </w:rPr>
-                          <w:t>研究产出：</w:t>
-                        </w:r>
-                        <w:r>
-                          <w:rPr>
-                            <w:b w:val="0"/>
-                            <w:i w:val="0"/>
-                            <w:color w:val="262626"/>
-                            <w:sz w:val="21"/>
-                            <w:u w:val="none"/>
-                            <w:rFonts w:ascii="Times New Roman" w:hAnsi="Times New Roman" w:cs="Times New Roman" w:eastAsia="KaiTi"/>
-                            <w:szCs w:val="21"/>
-                          </w:rPr>
-                          <w:t>整理实验配置、失败案例和消融结论，形成内部研究报告与可复现实验包。</w:t>
-                        </w:r>
-                      </w:p>
-                    </w:txbxContent>
-                  </wps:txbx>
-                  <wps:bodyPr rot="0" vert="horz" wrap="square" lIns="0" rIns="0" tIns="25400" bIns="25400" anchor="t">
-                    <a:noAutofit/>
-                  </wps:bodyPr>
-                </wps:wsp>
-              </a:graphicData>
-            </a:graphic>
-          </wp:anchor>
-        </w:drawing>
-      </w:r>
-      <w:r>
-        <w:drawing>
-          <wp:anchor distT="0" distB="0" distL="0" distR="0" simplePos="0" relativeHeight="251660092" behindDoc="0" locked="0" layoutInCell="1" allowOverlap="1">
-            <wp:simplePos x="0" y="0"/>
-            <wp:positionH relativeFrom="page">
-              <wp:posOffset>431800</wp:posOffset>
-            </wp:positionH>
-            <wp:positionV relativeFrom="page">
-              <wp:posOffset>3289300</wp:posOffset>
-            </wp:positionV>
-            <wp:extent cx="6696710" cy="304800"/>
-            <wp:effectExtent l="0" t="0" r="0" b="0"/>
-            <wp:wrapNone/>
-            <wp:docPr id="92" name="project_header-92"/>
-            <wp:cNvGraphicFramePr/>
-            <a:graphic xmlns:a="http://schemas.openxmlformats.org/drawingml/2006/main">
-              <a:graphicData uri="http://schemas.microsoft.com/office/word/2010/wordprocessingShape">
-                <wps:wsp>
-                  <wps:cNvPr id="93" name="project_header-92-text"/>
-                  <wps:cNvSpPr txBox="1"/>
-                  <wps:spPr>
-                    <a:xfrm>
-                      <a:off x="0" y="0"/>
-                      <a:ext cx="6696710" cy="304800"/>
-                    </a:xfrm>
-                    <a:prstGeom prst="rect">
-                      <a:avLst/>
-                    </a:prstGeom>
-                    <a:noFill/>
-                    <a:ln>
-                      <a:noFill/>
-                    </a:ln>
-                  </wps:spPr>
-                  <wps:txbx>
-                    <w:txbxContent>
-                      <w:p>
-                        <w:pPr>
-                          <w:tabs>
-                            <w:tab w:val="right" w:pos="10546"/>
-                          </w:tabs>
-                          <w:snapToGrid w:val="0"/>
-                          <w:spacing w:before="0" w:after="0" w:line="360" w:lineRule="exact"/>
-                          <w:jc w:val="left"/>
-                        </w:pPr>
-                        <w:r>
-                          <w:rPr>
-                            <w:b/>
-                            <w:i w:val="0"/>
-                            <w:color w:val="265995"/>
-                            <w:sz w:val="21"/>
-                            <w:u w:val="none"/>
-                            <w:rFonts w:ascii="Times New Roman" w:hAnsi="Times New Roman" w:cs="Times New Roman" w:eastAsia="KaiTi"/>
-                            <w:szCs w:val="21"/>
-                          </w:rPr>
-                          <w:t>CacheWeave：多阶段检索缓存（虚构）</w:t>
-                        </w:r>
-                        <w:r>
-                          <w:rPr>
-                            <w:b/>
-                            <w:i w:val="0"/>
-                            <w:color w:val="265995"/>
-                            <w:sz w:val="21"/>
-                            <w:u w:val="none"/>
-                            <w:rFonts w:ascii="Times New Roman" w:hAnsi="Times New Roman" w:cs="Times New Roman" w:eastAsia="KaiTi"/>
-                            <w:szCs w:val="21"/>
-                          </w:rPr>
-                          <w:tab/>
-                        </w:r>
-                        <w:r>
-                          <w:rPr>
-                            <w:b w:val="0"/>
-                            <w:i w:val="0"/>
-                            <w:color w:val="262626"/>
-                            <w:sz w:val="21"/>
-                            <w:u w:val="none"/>
-                            <w:rFonts w:ascii="Times New Roman" w:hAnsi="Times New Roman" w:cs="Times New Roman" w:eastAsia="KaiTi"/>
-                            <w:szCs w:val="21"/>
-                            <w:position w:val="-2"/>
-                          </w:rPr>
-                          <w:drawing>
-                            <wp:inline>
-                              <wp:extent cx="139700" cy="139700"/>
-                              <wp:docPr id="91" name="inline-icon"/>
-                              <wp:cNvGraphicFramePr>
-                                <a:graphicFrameLocks noChangeAspect="1"/>
-                              </wp:cNvGraphicFramePr>
-                              <a:graphic>
-                                <a:graphicData uri="http://schemas.openxmlformats.org/drawingml/2006/picture">
-                                  <pic:pic xmlns:pic="http://schemas.openxmlformats.org/drawingml/2006/picture">
-                                    <pic:nvPicPr>
-                                      <pic:cNvPr id="90" name="inline-icon-90"/>
-                                      <pic:cNvPicPr/>
-                                    </pic:nvPicPr>
-                                    <pic:blipFill>
-                                      <a:blip r:embed="rId12"/>
-                                      <a:stretch>
-                                        <a:fillRect/>
-                                      </a:stretch>
-                                    </pic:blipFill>
-                                    <pic:spPr>
-                                      <a:xfrm>
-                                        <a:off x="0" y="0"/>
-                                        <a:ext cx="139700" cy="139700"/>
-                                      </a:xfrm>
-                                      <a:prstGeom prst="rect"/>
-                                    </pic:spPr>
-                                  </pic:pic>
-                                </a:graphicData>
-                              </a:graphic>
-                            </wp:inline>
-                          </w:drawing>
-                        </w:r>
-                        <w:hyperlink r:id="rId23">
-                          <w:r>
-                            <w:rPr>
-                              <w:b w:val="0"/>
-                              <w:i w:val="0"/>
-                              <w:color w:val="0000FF"/>
-                              <w:sz w:val="21"/>
-                              <w:u w:val="single"/>
-                              <w:rFonts w:ascii="Times New Roman" w:hAnsi="Times New Roman" w:cs="Times New Roman" w:eastAsia="KaiTi"/>
-                              <w:szCs w:val="21"/>
-                            </w:rPr>
-                            <w:t xml:space="preserve"> GitHub</w:t>
-                          </w:r>
-                        </w:hyperlink>
-                      </w:p>
-                    </w:txbxContent>
-                  </wps:txbx>
-                  <wps:bodyPr rot="0" vert="horz" wrap="square" lIns="0" rIns="0" tIns="25400" bIns="25400" anchor="t">
-                    <a:noAutofit/>
-                  </wps:bodyPr>
-                </wps:wsp>
-              </a:graphicData>
-            </a:graphic>
-          </wp:anchor>
-        </w:drawing>
-      </w:r>
-      <w:r>
-        <w:drawing>
-          <wp:anchor distT="0" distB="0" distL="0" distR="0" simplePos="0" relativeHeight="251660094" behindDoc="0" locked="0" layoutInCell="1" allowOverlap="1">
-            <wp:simplePos x="0" y="0"/>
-            <wp:positionH relativeFrom="page">
-              <wp:posOffset>431800</wp:posOffset>
-            </wp:positionH>
-            <wp:positionV relativeFrom="page">
-              <wp:posOffset>3594100</wp:posOffset>
-            </wp:positionV>
-            <wp:extent cx="6696710" cy="457200"/>
-            <wp:effectExtent l="0" t="0" r="0" b="0"/>
-            <wp:wrapNone/>
-            <wp:docPr id="94" name="body-94"/>
-            <wp:cNvGraphicFramePr/>
-            <a:graphic xmlns:a="http://schemas.openxmlformats.org/drawingml/2006/main">
-              <a:graphicData uri="http://schemas.microsoft.com/office/word/2010/wordprocessingShape">
-                <wps:wsp>
-                  <wps:cNvPr id="95" name="body-94-text"/>
-                  <wps:cNvSpPr txBox="1"/>
-                  <wps:spPr>
-                    <a:xfrm>
-                      <a:off x="0" y="0"/>
-                      <a:ext cx="6696710" cy="457200"/>
-                    </a:xfrm>
-                    <a:prstGeom prst="rect">
-                      <a:avLst/>
-                    </a:prstGeom>
-                    <a:noFill/>
-                    <a:ln>
-                      <a:noFill/>
-                    </a:ln>
-                  </wps:spPr>
-                  <wps:txbx>
-                    <w:txbxContent>
-                      <w:p>
-                        <w:pPr>
-                          <w:snapToGrid w:val="0"/>
-                          <w:spacing w:before="0" w:after="0" w:line="288" w:lineRule="auto"/>
-                          <w:jc w:val="both"/>
-                        </w:pPr>
-                        <w:r>
-                          <w:rPr>
-                            <w:b/>
-                            <w:i w:val="0"/>
-                            <w:color w:val="262626"/>
-                            <w:sz w:val="21"/>
-                            <w:u w:val="none"/>
-                            <w:rFonts w:ascii="Times New Roman" w:hAnsi="Times New Roman" w:cs="Times New Roman" w:eastAsia="KaiTi"/>
-                            <w:szCs w:val="21"/>
-                          </w:rPr>
-                          <w:t>研究背景：</w:t>
-                        </w:r>
-                        <w:r>
-                          <w:rPr>
-                            <w:b w:val="0"/>
-                            <w:i w:val="0"/>
-                            <w:color w:val="262626"/>
-                            <w:sz w:val="21"/>
-                            <w:u w:val="none"/>
-                            <w:rFonts w:ascii="Times New Roman" w:hAnsi="Times New Roman" w:cs="Times New Roman" w:eastAsia="KaiTi"/>
-                            <w:szCs w:val="21"/>
-                          </w:rPr>
-                          <w:t>针对连续查询中重复检索和上下文重建的开销，探索可复用中间结果及其失效条件，兼顾响应效率与结果一致性。</w:t>
-                        </w:r>
-                      </w:p>
-                    </w:txbxContent>
-                  </wps:txbx>
-                  <wps:bodyPr rot="0" vert="horz" wrap="square" lIns="0" rIns="0" tIns="25400" bIns="25400" anchor="t">
-                    <a:noAutofit/>
-                  </wps:bodyPr>
-                </wps:wsp>
-              </a:graphicData>
-            </a:graphic>
-          </wp:anchor>
-        </w:drawing>
-      </w:r>
-      <w:r>
-        <w:drawing>
-          <wp:anchor distT="0" distB="0" distL="0" distR="0" simplePos="0" relativeHeight="251660096" behindDoc="0" locked="0" layoutInCell="1" allowOverlap="1">
-            <wp:simplePos x="0" y="0"/>
-            <wp:positionH relativeFrom="page">
-              <wp:posOffset>431800</wp:posOffset>
-            </wp:positionH>
-            <wp:positionV relativeFrom="page">
-              <wp:posOffset>4064000</wp:posOffset>
-            </wp:positionV>
-            <wp:extent cx="6696710" cy="254000"/>
-            <wp:effectExtent l="0" t="0" r="0" b="0"/>
-            <wp:wrapNone/>
-            <wp:docPr id="96" name="body-96"/>
-            <wp:cNvGraphicFramePr/>
-            <a:graphic xmlns:a="http://schemas.openxmlformats.org/drawingml/2006/main">
-              <a:graphicData uri="http://schemas.microsoft.com/office/word/2010/wordprocessingShape">
-                <wps:wsp>
-                  <wps:cNvPr id="97" name="body-96-text"/>
-                  <wps:cNvSpPr txBox="1"/>
-                  <wps:spPr>
-                    <a:xfrm>
-                      <a:off x="0" y="0"/>
-                      <a:ext cx="6696710" cy="254000"/>
-                    </a:xfrm>
-                    <a:prstGeom prst="rect">
-                      <a:avLst/>
-                    </a:prstGeom>
-                    <a:noFill/>
-                    <a:ln>
-                      <a:noFill/>
-                    </a:ln>
-                  </wps:spPr>
-                  <wps:txbx>
-                    <w:txbxContent>
-                      <w:p>
-                        <w:pPr>
-                          <w:snapToGrid w:val="0"/>
-                          <w:spacing w:before="0" w:after="0" w:line="288" w:lineRule="auto"/>
-                          <w:jc w:val="both"/>
-                        </w:pPr>
-                        <w:r>
-                          <w:rPr>
-                            <w:b/>
-                            <w:i w:val="0"/>
-                            <w:color w:val="262626"/>
-                            <w:sz w:val="21"/>
-                            <w:u w:val="none"/>
-                            <w:rFonts w:ascii="Times New Roman" w:hAnsi="Times New Roman" w:cs="Times New Roman" w:eastAsia="KaiTi"/>
-                            <w:szCs w:val="21"/>
-                          </w:rPr>
-                          <w:t>个人职责：</w:t>
-                        </w:r>
-                        <w:r>
-                          <w:rPr>
-                            <w:b/>
-                            <w:i w:val="0"/>
-                            <w:color w:val="262626"/>
-                            <w:sz w:val="21"/>
-                            <w:u w:val="none"/>
-                            <w:rFonts w:ascii="Times New Roman" w:hAnsi="Times New Roman" w:cs="Times New Roman" w:eastAsia="KaiTi"/>
-                            <w:szCs w:val="21"/>
-                          </w:rPr>
-                          <w:t>负责缓存键设计和一致性验证，分析数据更新、查询变化与中间结果复用之间的约束关系。</w:t>
-                        </w:r>
-                      </w:p>
-                    </w:txbxContent>
-                  </wps:txbx>
-                  <wps:bodyPr rot="0" vert="horz" wrap="square" lIns="0" rIns="0" tIns="25400" bIns="25400" anchor="t">
-                    <a:noAutofit/>
-                  </wps:bodyPr>
-                </wps:wsp>
-              </a:graphicData>
-            </a:graphic>
-          </wp:anchor>
-        </w:drawing>
-      </w:r>
-      <w:r>
-        <w:drawing>
-          <wp:anchor distT="0" distB="0" distL="0" distR="0" simplePos="0" relativeHeight="251660098" behindDoc="0" locked="0" layoutInCell="1" allowOverlap="1">
-            <wp:simplePos x="0" y="0"/>
-            <wp:positionH relativeFrom="page">
-              <wp:posOffset>431800</wp:posOffset>
-            </wp:positionH>
-            <wp:positionV relativeFrom="page">
-              <wp:posOffset>4330700</wp:posOffset>
-            </wp:positionV>
-            <wp:extent cx="6696710" cy="457200"/>
-            <wp:effectExtent l="0" t="0" r="0" b="0"/>
-            <wp:wrapNone/>
-            <wp:docPr id="98" name="bullet-98"/>
-            <wp:cNvGraphicFramePr/>
-            <a:graphic xmlns:a="http://schemas.openxmlformats.org/drawingml/2006/main">
-              <a:graphicData uri="http://schemas.microsoft.com/office/word/2010/wordprocessingShape">
-                <wps:wsp>
-                  <wps:cNvPr id="99" name="bullet-98-text"/>
-                  <wps:cNvSpPr txBox="1"/>
-                  <wps:spPr>
-                    <a:xfrm>
-                      <a:off x="0" y="0"/>
-                      <a:ext cx="6696710" cy="457200"/>
-                    </a:xfrm>
-                    <a:prstGeom prst="rect">
-                      <a:avLst/>
-                    </a:prstGeom>
-                    <a:noFill/>
-                    <a:ln>
-                      <a:noFill/>
-                    </a:ln>
-                  </wps:spPr>
-                  <wps:txbx>
-                    <w:txbxContent>
-                      <w:p>
-                        <w:pPr>
-                          <w:numPr>
-                            <w:ilvl w:val="0"/>
-                            <w:numId w:val="10"/>
-                          </w:numPr>
-                          <w:snapToGrid w:val="0"/>
-                          <w:spacing w:before="0" w:after="0" w:line="288" w:lineRule="auto"/>
-                          <w:ind w:left="142" w:hanging="142"/>
-                          <w:jc w:val="both"/>
-                        </w:pPr>
-                        <w:r>
-                          <w:rPr>
-                            <w:b/>
-                            <w:i w:val="0"/>
-                            <w:color w:val="262626"/>
-                            <w:sz w:val="21"/>
-                            <w:u w:val="none"/>
-                            <w:rFonts w:ascii="Times New Roman" w:hAnsi="Times New Roman" w:cs="Times New Roman" w:eastAsia="KaiTi"/>
-                            <w:szCs w:val="21"/>
-                          </w:rPr>
-                          <w:t>系统实现：</w:t>
-                        </w:r>
-                        <w:r>
-                          <w:rPr>
-                            <w:b w:val="0"/>
-                            <w:i w:val="0"/>
-                            <w:color w:val="262626"/>
-                            <w:sz w:val="21"/>
-                            <w:u w:val="none"/>
-                            <w:rFonts w:ascii="Times New Roman" w:hAnsi="Times New Roman" w:cs="Times New Roman" w:eastAsia="KaiTi"/>
-                            <w:szCs w:val="21"/>
-                          </w:rPr>
-                          <w:t>按检索阶段组织缓存记录，保留来源版本与依赖关系；在数据变化时失效关联条目，并记录命中与重算原因。</w:t>
-                        </w:r>
-                      </w:p>
-                    </w:txbxContent>
-                  </wps:txbx>
-                  <wps:bodyPr rot="0" vert="horz" wrap="square" lIns="0" rIns="0" tIns="25400" bIns="25400" anchor="t">
-                    <a:noAutofit/>
-                  </wps:bodyPr>
-                </wps:wsp>
-              </a:graphicData>
-            </a:graphic>
-          </wp:anchor>
-        </w:drawing>
-      </w:r>
-      <w:r>
-        <w:drawing>
-          <wp:anchor distT="0" distB="0" distL="0" distR="0" simplePos="0" relativeHeight="251660100" behindDoc="0" locked="0" layoutInCell="1" allowOverlap="1">
-            <wp:simplePos x="0" y="0"/>
-            <wp:positionH relativeFrom="page">
-              <wp:posOffset>431800</wp:posOffset>
-            </wp:positionH>
-            <wp:positionV relativeFrom="page">
-              <wp:posOffset>4800600</wp:posOffset>
-            </wp:positionV>
-            <wp:extent cx="6696710" cy="457200"/>
-            <wp:effectExtent l="0" t="0" r="0" b="0"/>
-            <wp:wrapNone/>
-            <wp:docPr id="100" name="bullet-100"/>
-            <wp:cNvGraphicFramePr/>
-            <a:graphic xmlns:a="http://schemas.openxmlformats.org/drawingml/2006/main">
-              <a:graphicData uri="http://schemas.microsoft.com/office/word/2010/wordprocessingShape">
-                <wps:wsp>
-                  <wps:cNvPr id="101" name="bullet-100-text"/>
-                  <wps:cNvSpPr txBox="1"/>
-                  <wps:spPr>
-                    <a:xfrm>
-                      <a:off x="0" y="0"/>
-                      <a:ext cx="6696710" cy="457200"/>
-                    </a:xfrm>
-                    <a:prstGeom prst="rect">
-                      <a:avLst/>
-                    </a:prstGeom>
-                    <a:noFill/>
-                    <a:ln>
-                      <a:noFill/>
-                    </a:ln>
-                  </wps:spPr>
-                  <wps:txbx>
-                    <w:txbxContent>
-                      <w:p>
-                        <w:pPr>
-                          <w:numPr>
-                            <w:ilvl w:val="0"/>
-                            <w:numId w:val="10"/>
-                          </w:numPr>
-                          <w:snapToGrid w:val="0"/>
-                          <w:spacing w:before="0" w:after="0" w:line="288" w:lineRule="auto"/>
-                          <w:ind w:left="142" w:hanging="142"/>
-                          <w:jc w:val="both"/>
-                        </w:pPr>
-                        <w:r>
-                          <w:rPr>
-                            <w:b/>
-                            <w:i w:val="0"/>
-                            <w:color w:val="262626"/>
-                            <w:sz w:val="21"/>
-                            <w:u w:val="none"/>
-                            <w:rFonts w:ascii="Times New Roman" w:hAnsi="Times New Roman" w:cs="Times New Roman" w:eastAsia="KaiTi"/>
-                            <w:szCs w:val="21"/>
-                          </w:rPr>
-                          <w:t>验证方式：</w:t>
-                        </w:r>
-                        <w:r>
-                          <w:rPr>
-                            <w:b w:val="0"/>
-                            <w:i w:val="0"/>
-                            <w:color w:val="262626"/>
-                            <w:sz w:val="21"/>
-                            <w:u w:val="none"/>
-                            <w:rFonts w:ascii="Times New Roman" w:hAnsi="Times New Roman" w:cs="Times New Roman" w:eastAsia="KaiTi"/>
-                            <w:szCs w:val="21"/>
-                          </w:rPr>
-                          <w:t>构造重复查询、数据更新及并发访问样例，对照无缓存路径核对结果一致性，输出可定位的差异记录。</w:t>
-                        </w:r>
-                      </w:p>
-                    </w:txbxContent>
-                  </wps:txbx>
-                  <wps:bodyPr rot="0" vert="horz" wrap="square" lIns="0" rIns="0" tIns="25400" bIns="25400" anchor="t">
-                    <a:noAutofit/>
-                  </wps:bodyPr>
-                </wps:wsp>
-              </a:graphicData>
-            </a:graphic>
-          </wp:anchor>
-        </w:drawing>
-      </w:r>
-      <w:r>
-        <w:drawing>
-          <wp:anchor distT="0" distB="0" distL="0" distR="0" simplePos="0" relativeHeight="251660102" behindDoc="0" locked="0" layoutInCell="1" allowOverlap="1">
-            <wp:simplePos x="0" y="0"/>
-            <wp:positionH relativeFrom="page">
-              <wp:posOffset>431800</wp:posOffset>
-            </wp:positionH>
-            <wp:positionV relativeFrom="page">
-              <wp:posOffset>5410200</wp:posOffset>
-            </wp:positionV>
-            <wp:extent cx="6696710" cy="330200"/>
-            <wp:effectExtent l="0" t="0" r="0" b="0"/>
-            <wp:wrapNone/>
-            <wp:docPr id="102" name="section-102"/>
-            <wp:cNvGraphicFramePr/>
-            <a:graphic xmlns:a="http://schemas.openxmlformats.org/drawingml/2006/main">
-              <a:graphicData uri="http://schemas.microsoft.com/office/word/2010/wordprocessingGroup">
-                <wpg:wgp>
-                  <wpg:cNvGrpSpPr/>
-                  <wpg:grpSpPr>
-                    <a:xfrm>
-                      <a:off x="0" y="0"/>
-                      <a:ext cx="6696710" cy="330200"/>
-                      <a:chOff x="0" y="0"/>
-                      <a:chExt cx="6696710" cy="330200"/>
-                    </a:xfrm>
-                  </wpg:grpSpPr>
-                  <wps:wsp>
-                    <wps:cNvPr id="103" name="section-102-title"/>
-                    <wps:cNvSpPr txBox="1"/>
-                    <wps:spPr>
-                      <a:xfrm>
-                        <a:off x="0" y="0"/>
-                        <a:ext cx="6696710" cy="330200"/>
-                      </a:xfrm>
-                      <a:prstGeom prst="rect">
-                        <a:avLst/>
-                      </a:prstGeom>
-                      <a:noFill/>
-                      <a:ln>
-                        <a:noFill/>
-                      </a:ln>
-                    </wps:spPr>
-                    <wps:txbx>
-                      <w:txbxContent>
-                        <w:p>
-                          <w:pPr>
-                            <w:snapToGrid w:val="0"/>
-                            <w:spacing w:before="0" w:after="0" w:line="360" w:lineRule="exact"/>
-                            <w:jc w:val="left"/>
-                          </w:pPr>
-                          <w:r>
-                            <w:rPr>
-                              <w:b/>
-                              <w:i w:val="0"/>
-                              <w:color w:val="2F6FBA"/>
-                              <w:sz w:val="28"/>
-                              <w:u w:val="none"/>
-                              <w:rFonts w:ascii="Times New Roman" w:hAnsi="Times New Roman" w:cs="Times New Roman" w:eastAsia="KaiTi"/>
-                              <w:szCs w:val="28"/>
-                            </w:rPr>
-                            <w:t>论文与研究记录</w:t>
-                          </w:r>
-                        </w:p>
-                      </w:txbxContent>
-                    </wps:txbx>
-                    <wps:bodyPr rot="0" vert="horz" wrap="square" lIns="0" rIns="0" tIns="25400" bIns="25400" anchor="t">
-                      <a:noAutofit/>
-                    </wps:bodyPr>
-                  </wps:wsp>
-                  <wps:wsp>
-                    <wps:cNvPr id="104" name="section-102-rule"/>
-                    <wps:cNvSpPr/>
-                    <wps:spPr>
-                      <a:xfrm>
-                        <a:off x="0" y="234950"/>
-                        <a:ext cx="6696710" cy="19050"/>
-                      </a:xfrm>
-                      <a:prstGeom prst="rect">
-                        <a:avLst/>
-                      </a:prstGeom>
-                      <a:solidFill>
-                        <a:srgbClr val="2F6FBA"/>
-                      </a:solidFill>
-                      <a:ln>
-                        <a:noFill/>
-                      </a:ln>
-                    </wps:spPr>
-                    <wps:bodyPr/>
-                  </wps:wsp>
-                </wpg:wgp>
-              </a:graphicData>
-            </a:graphic>
-          </wp:anchor>
-        </w:drawing>
-      </w:r>
-      <w:r>
-        <w:drawing>
-          <wp:anchor distT="0" distB="0" distL="0" distR="0" simplePos="0" relativeHeight="251660105" behindDoc="0" locked="0" layoutInCell="1" allowOverlap="1">
-            <wp:simplePos x="0" y="0"/>
-            <wp:positionH relativeFrom="page">
-              <wp:posOffset>431800</wp:posOffset>
-            </wp:positionH>
-            <wp:positionV relativeFrom="page">
-              <wp:posOffset>5778500</wp:posOffset>
-            </wp:positionV>
-            <wp:extent cx="6696710" cy="279400"/>
-            <wp:effectExtent l="0" t="0" r="0" b="0"/>
-            <wp:wrapNone/>
-            <wp:docPr id="105" name="citation-105"/>
-            <wp:cNvGraphicFramePr/>
-            <a:graphic xmlns:a="http://schemas.openxmlformats.org/drawingml/2006/main">
-              <a:graphicData uri="http://schemas.microsoft.com/office/word/2010/wordprocessingShape">
-                <wps:wsp>
-                  <wps:cNvPr id="106" name="citation-105-text"/>
-                  <wps:cNvSpPr txBox="1"/>
-                  <wps:spPr>
-                    <a:xfrm>
-                      <a:off x="0" y="0"/>
-                      <a:ext cx="6696710" cy="279400"/>
-                    </a:xfrm>
-                    <a:prstGeom prst="rect">
-                      <a:avLst/>
-                    </a:prstGeom>
-                    <a:noFill/>
-                    <a:ln>
-                      <a:noFill/>
-                    </a:ln>
-                  </wps:spPr>
-                  <wps:txbx>
-                    <w:txbxContent>
-                      <w:p>
-                        <w:pPr>
-                          <w:snapToGrid w:val="0"/>
-                          <w:spacing w:before="0" w:after="0" w:line="288" w:lineRule="auto"/>
-                          <w:jc w:val="both"/>
-                        </w:pPr>
-                        <w:r>
-                          <w:rPr>
-                            <w:b w:val="0"/>
-                            <w:i/>
-                            <w:color w:val="262626"/>
-                            <w:sz w:val="21"/>
-                            <w:u w:val="none"/>
-                            <w:rFonts w:ascii="Times New Roman" w:hAnsi="Times New Roman" w:cs="Times New Roman" w:eastAsia="KaiTi"/>
-                            <w:szCs w:val="21"/>
-                          </w:rPr>
-                          <w:t xml:space="preserve">[1] </w:t>
-                        </w:r>
-                        <w:r>
-                          <w:rPr>
-                            <w:b/>
-                            <w:i/>
-                            <w:color w:val="2F6FBA"/>
-                            <w:sz w:val="21"/>
-                            <w:u w:val="none"/>
-                            <w:rFonts w:ascii="Times New Roman" w:hAnsi="Times New Roman" w:cs="Times New Roman" w:eastAsia="KaiTi"/>
-                            <w:szCs w:val="21"/>
-                          </w:rPr>
-                          <w:t>Lin Zhiyao</w:t>
-                        </w:r>
-                        <w:r>
-                          <w:rPr>
-                            <w:b w:val="0"/>
-                            <w:i/>
-                            <w:color w:val="262626"/>
-                            <w:sz w:val="21"/>
-                            <w:u w:val="none"/>
-                            <w:rFonts w:ascii="Times New Roman" w:hAnsi="Times New Roman" w:cs="Times New Roman" w:eastAsia="KaiTi"/>
-                            <w:szCs w:val="21"/>
-                          </w:rPr>
-                          <w:t>, Zhou Zhiheng. FlexRoute: Budget-Aware Task Routing. 虚构研究报告，2025。</w:t>
-                        </w:r>
-                        <w:hyperlink r:id="rId24">
-                          <w:r>
-                            <w:rPr>
-                              <w:b w:val="0"/>
-                              <w:i/>
-                              <w:color w:val="0000FF"/>
-                              <w:sz w:val="21"/>
-                              <w:u w:val="single"/>
-                              <w:rFonts w:ascii="Times New Roman" w:hAnsi="Times New Roman" w:cs="Times New Roman" w:eastAsia="KaiTi"/>
-                              <w:szCs w:val="21"/>
-                            </w:rPr>
-                            <w:t xml:space="preserve"> 链接</w:t>
-                          </w:r>
-                        </w:hyperlink>
-                      </w:p>
-                    </w:txbxContent>
-                  </wps:txbx>
-                  <wps:bodyPr rot="0" vert="horz" wrap="square" lIns="0" rIns="0" tIns="25400" bIns="25400" anchor="t">
-                    <a:noAutofit/>
-                  </wps:bodyPr>
-                </wps:wsp>
-              </a:graphicData>
-            </a:graphic>
-          </wp:anchor>
-        </w:drawing>
-      </w:r>
-      <w:r>
-        <w:drawing>
-          <wp:anchor distT="0" distB="0" distL="0" distR="0" simplePos="0" relativeHeight="251660107" behindDoc="0" locked="0" layoutInCell="1" allowOverlap="1">
-            <wp:simplePos x="0" y="0"/>
-            <wp:positionH relativeFrom="page">
-              <wp:posOffset>431800</wp:posOffset>
-            </wp:positionH>
-            <wp:positionV relativeFrom="page">
-              <wp:posOffset>6083300</wp:posOffset>
-            </wp:positionV>
-            <wp:extent cx="6696710" cy="279400"/>
-            <wp:effectExtent l="0" t="0" r="0" b="0"/>
-            <wp:wrapNone/>
-            <wp:docPr id="107" name="citation-107"/>
-            <wp:cNvGraphicFramePr/>
-            <a:graphic xmlns:a="http://schemas.openxmlformats.org/drawingml/2006/main">
-              <a:graphicData uri="http://schemas.microsoft.com/office/word/2010/wordprocessingShape">
-                <wps:wsp>
-                  <wps:cNvPr id="108" name="citation-107-text"/>
-                  <wps:cNvSpPr txBox="1"/>
-                  <wps:spPr>
-                    <a:xfrm>
-                      <a:off x="0" y="0"/>
-                      <a:ext cx="6696710" cy="279400"/>
-                    </a:xfrm>
-                    <a:prstGeom prst="rect">
-                      <a:avLst/>
-                    </a:prstGeom>
-                    <a:noFill/>
-                    <a:ln>
-                      <a:noFill/>
-                    </a:ln>
-                  </wps:spPr>
-                  <wps:txbx>
-                    <w:txbxContent>
-                      <w:p>
-                        <w:pPr>
-                          <w:snapToGrid w:val="0"/>
-                          <w:spacing w:before="0" w:after="0" w:line="288" w:lineRule="auto"/>
-                          <w:jc w:val="both"/>
-                        </w:pPr>
-                        <w:r>
-                          <w:rPr>
-                            <w:b w:val="0"/>
-                            <w:i/>
-                            <w:color w:val="262626"/>
-                            <w:sz w:val="21"/>
-                            <w:u w:val="none"/>
-                            <w:rFonts w:ascii="Times New Roman" w:hAnsi="Times New Roman" w:cs="Times New Roman" w:eastAsia="KaiTi"/>
-                            <w:szCs w:val="21"/>
-                          </w:rPr>
-                          <w:t xml:space="preserve">[2] </w:t>
-                        </w:r>
-                        <w:r>
-                          <w:rPr>
-                            <w:b/>
-                            <w:i/>
-                            <w:color w:val="2F6FBA"/>
-                            <w:sz w:val="21"/>
-                            <w:u w:val="none"/>
-                            <w:rFonts w:ascii="Times New Roman" w:hAnsi="Times New Roman" w:cs="Times New Roman" w:eastAsia="KaiTi"/>
-                            <w:szCs w:val="21"/>
-                          </w:rPr>
-                          <w:t>Lin Zhiyao</w:t>
-                        </w:r>
-                        <w:r>
-                          <w:rPr>
-                            <w:b w:val="0"/>
-                            <w:i/>
-                            <w:color w:val="262626"/>
-                            <w:sz w:val="21"/>
-                            <w:u w:val="none"/>
-                            <w:rFonts w:ascii="Times New Roman" w:hAnsi="Times New Roman" w:cs="Times New Roman" w:eastAsia="KaiTi"/>
-                            <w:szCs w:val="21"/>
-                          </w:rPr>
-                          <w:t>, Chen Shuyi. CacheWeave: Reusable Retrieval States. 虚构研究报告，2025。</w:t>
-                        </w:r>
-                        <w:hyperlink r:id="rId25">
-                          <w:r>
-                            <w:rPr>
-                              <w:b w:val="0"/>
-                              <w:i/>
-                              <w:color w:val="0000FF"/>
-                              <w:sz w:val="21"/>
-                              <w:u w:val="single"/>
-                              <w:rFonts w:ascii="Times New Roman" w:hAnsi="Times New Roman" w:cs="Times New Roman" w:eastAsia="KaiTi"/>
-                              <w:szCs w:val="21"/>
-                            </w:rPr>
-                            <w:t xml:space="preserve"> 链接</w:t>
-                          </w:r>
-                        </w:hyperlink>
-                      </w:p>
-                    </w:txbxContent>
-                  </wps:txbx>
-                  <wps:bodyPr rot="0" vert="horz" wrap="square" lIns="0" rIns="0" tIns="25400" bIns="25400" anchor="t">
-                    <a:noAutofit/>
-                  </wps:bodyPr>
-                </wps:wsp>
-              </a:graphicData>
-            </a:graphic>
-          </wp:anchor>
-        </w:drawing>
-      </w:r>
-      <w:r>
-        <w:drawing>
-          <wp:anchor distT="0" distB="0" distL="0" distR="0" simplePos="0" relativeHeight="251660109" behindDoc="0" locked="0" layoutInCell="1" allowOverlap="1">
-            <wp:simplePos x="0" y="0"/>
-            <wp:positionH relativeFrom="page">
-              <wp:posOffset>431800</wp:posOffset>
-            </wp:positionH>
-            <wp:positionV relativeFrom="page">
-              <wp:posOffset>6489700</wp:posOffset>
-            </wp:positionV>
-            <wp:extent cx="6696710" cy="457200"/>
-            <wp:effectExtent l="0" t="0" r="0" b="0"/>
-            <wp:wrapNone/>
-            <wp:docPr id="109" name="body-109"/>
-            <wp:cNvGraphicFramePr/>
-            <a:graphic xmlns:a="http://schemas.openxmlformats.org/drawingml/2006/main">
-              <a:graphicData uri="http://schemas.microsoft.com/office/word/2010/wordprocessingShape">
-                <wps:wsp>
-                  <wps:cNvPr id="110" name="body-109-text"/>
-                  <wps:cNvSpPr txBox="1"/>
-                  <wps:spPr>
-                    <a:xfrm>
-                      <a:off x="0" y="0"/>
-                      <a:ext cx="6696710" cy="457200"/>
-                    </a:xfrm>
-                    <a:prstGeom prst="rect">
-                      <a:avLst/>
-                    </a:prstGeom>
-                    <a:noFill/>
-                    <a:ln>
-                      <a:noFill/>
-                    </a:ln>
-                  </wps:spPr>
-                  <wps:txbx>
-                    <w:txbxContent>
-                      <w:p>
-                        <w:pPr>
-                          <w:snapToGrid w:val="0"/>
-                          <w:spacing w:before="0" w:after="0" w:line="288" w:lineRule="auto"/>
-                          <w:jc w:val="both"/>
-                        </w:pPr>
-                        <w:r>
-                          <w:rPr>
-                            <w:b w:val="0"/>
-                            <w:i w:val="0"/>
-                            <w:color w:val="666666"/>
-                            <w:sz w:val="21"/>
-                            <w:u w:val="none"/>
-                            <w:rFonts w:ascii="Times New Roman" w:hAnsi="Times New Roman" w:cs="Times New Roman" w:eastAsia="KaiTi"/>
-                            <w:szCs w:val="21"/>
-                          </w:rPr>
-                          <w:t>说明：本样例的全部资料与标识均为虚构，仅供版式参考；正式简历应使用真实资料和机构图标。</w:t>
-                        </w:r>
-                      </w:p>
-                    </w:txbxContent>
-                  </wps:txbx>
-                  <wps:bodyPr rot="0" vert="horz" wrap="square" lIns="0" rIns="0" tIns="25400" bIns="25400" anchor="t">
+                  <wps:bodyPr rot="0" vert="horz" wrap="square" lIns="0" rIns="0" tIns="25400" bIns="12700" anchor="t">
                     <a:noAutofit/>
                   </wps:bodyPr>
                 </wps:wsp>

</xml_diff>

<commit_message>
Deepen technical writing and enforce Chinese line-break rules
</commit_message>
<xml_diff>
--- a/assets/layout-reference.docx
+++ b/assets/layout-reference.docx
@@ -43,6 +43,9 @@
                     <w:txbxContent>
                       <w:p>
                         <w:pPr>
+                          <w:kinsoku w:val="1"/>
+                          <w:wordWrap w:val="1"/>
+                          <w:overflowPunct w:val="0"/>
                           <w:snapToGrid w:val="0"/>
                           <w:spacing w:before="0" w:after="0" w:line="288" w:lineRule="auto"/>
                           <w:jc w:val="left"/>
@@ -56,6 +59,7 @@
                             <w:u w:val="none"/>
                             <w:rFonts w:ascii="Times New Roman" w:hAnsi="Times New Roman" w:cs="Times New Roman" w:eastAsia="KaiTi"/>
                             <w:szCs w:val="40"/>
+                            <w:lang w:val="en-US" w:eastAsia="zh-CN"/>
                           </w:rPr>
                           <w:t>林知遥（虚构样例）</w:t>
                         </w:r>
@@ -110,6 +114,9 @@
                     <w:txbxContent>
                       <w:p>
                         <w:pPr>
+                          <w:kinsoku w:val="1"/>
+                          <w:wordWrap w:val="1"/>
+                          <w:overflowPunct w:val="0"/>
                           <w:snapToGrid w:val="0"/>
                           <w:spacing w:before="0" w:after="0" w:line="288" w:lineRule="auto"/>
                           <w:jc w:val="center"/>
@@ -123,6 +130,7 @@
                             <w:u w:val="none"/>
                             <w:rFonts w:ascii="Times New Roman" w:hAnsi="Times New Roman" w:cs="Times New Roman" w:eastAsia="KaiTi"/>
                             <w:szCs w:val="22"/>
+                            <w:lang w:val="en-US" w:eastAsia="zh-CN"/>
                           </w:rPr>
                           <w:t>照片占位</w:t>
                         </w:r>
@@ -175,6 +183,9 @@
                     <w:txbxContent>
                       <w:p>
                         <w:pPr>
+                          <w:kinsoku w:val="1"/>
+                          <w:wordWrap w:val="1"/>
+                          <w:overflowPunct w:val="0"/>
                           <w:snapToGrid w:val="0"/>
                           <w:spacing w:before="0" w:after="0" w:line="360" w:lineRule="exact"/>
                           <w:jc w:val="left"/>
@@ -189,6 +200,7 @@
                             <w:rFonts w:ascii="Times New Roman" w:hAnsi="Times New Roman" w:cs="Times New Roman" w:eastAsia="KaiTi"/>
                             <w:szCs w:val="22"/>
                             <w:position w:val="-2"/>
+                            <w:lang w:val="en-US" w:eastAsia="zh-CN"/>
                           </w:rPr>
                           <w:drawing>
                             <wp:inline>
@@ -232,6 +244,7 @@
                             <w:u w:val="none"/>
                             <w:rFonts w:ascii="Times New Roman" w:hAnsi="Times New Roman" w:cs="Times New Roman" w:eastAsia="KaiTi"/>
                             <w:szCs w:val="22"/>
+                            <w:lang w:val="en-US" w:eastAsia="zh-CN"/>
                           </w:rPr>
                           <w:t xml:space="preserve"> 000-0000-0000</w:t>
                         </w:r>
@@ -244,6 +257,7 @@
                             <w:u w:val="none"/>
                             <w:rFonts w:ascii="Times New Roman" w:hAnsi="Times New Roman" w:cs="Times New Roman" w:eastAsia="KaiTi"/>
                             <w:szCs w:val="22"/>
+                            <w:lang w:val="en-US" w:eastAsia="zh-CN"/>
                           </w:rPr>
                           <w:t xml:space="preserve"> ｜ </w:t>
                         </w:r>
@@ -257,6 +271,7 @@
                             <w:rFonts w:ascii="Times New Roman" w:hAnsi="Times New Roman" w:cs="Times New Roman" w:eastAsia="KaiTi"/>
                             <w:szCs w:val="22"/>
                             <w:position w:val="-2"/>
+                            <w:lang w:val="en-US" w:eastAsia="zh-CN"/>
                           </w:rPr>
                           <w:drawing>
                             <wp:inline>
@@ -301,6 +316,7 @@
                               <w:u w:val="single"/>
                               <w:rFonts w:ascii="Times New Roman" w:hAnsi="Times New Roman" w:cs="Times New Roman" w:eastAsia="KaiTi"/>
                               <w:szCs w:val="22"/>
+                              <w:lang w:val="en-US" w:eastAsia="zh-CN"/>
                             </w:rPr>
                             <w:t xml:space="preserve"> lin@example.com</w:t>
                           </w:r>
@@ -314,6 +330,7 @@
                             <w:u w:val="none"/>
                             <w:rFonts w:ascii="Times New Roman" w:hAnsi="Times New Roman" w:cs="Times New Roman" w:eastAsia="KaiTi"/>
                             <w:szCs w:val="22"/>
+                            <w:lang w:val="en-US" w:eastAsia="zh-CN"/>
                           </w:rPr>
                           <w:t xml:space="preserve"> ｜ </w:t>
                         </w:r>
@@ -327,6 +344,7 @@
                             <w:rFonts w:ascii="Times New Roman" w:hAnsi="Times New Roman" w:cs="Times New Roman" w:eastAsia="KaiTi"/>
                             <w:szCs w:val="22"/>
                             <w:position w:val="-2"/>
+                            <w:lang w:val="en-US" w:eastAsia="zh-CN"/>
                           </w:rPr>
                           <w:drawing>
                             <wp:inline>
@@ -371,6 +389,7 @@
                               <w:u w:val="single"/>
                               <w:rFonts w:ascii="Times New Roman" w:hAnsi="Times New Roman" w:cs="Times New Roman" w:eastAsia="KaiTi"/>
                               <w:szCs w:val="22"/>
+                              <w:lang w:val="en-US" w:eastAsia="zh-CN"/>
                             </w:rPr>
                             <w:t xml:space="preserve"> GitHub</w:t>
                           </w:r>
@@ -424,6 +443,9 @@
                     <w:txbxContent>
                       <w:p>
                         <w:pPr>
+                          <w:kinsoku w:val="1"/>
+                          <w:wordWrap w:val="1"/>
+                          <w:overflowPunct w:val="0"/>
                           <w:snapToGrid w:val="0"/>
                           <w:spacing w:before="0" w:after="0" w:line="360" w:lineRule="exact"/>
                           <w:jc w:val="left"/>
@@ -438,6 +460,7 @@
                             <w:rFonts w:ascii="Times New Roman" w:hAnsi="Times New Roman" w:cs="Times New Roman" w:eastAsia="KaiTi"/>
                             <w:szCs w:val="21"/>
                             <w:position w:val="-2"/>
+                            <w:lang w:val="en-US" w:eastAsia="zh-CN"/>
                           </w:rPr>
                           <w:drawing>
                             <wp:inline>
@@ -481,6 +504,7 @@
                             <w:u w:val="none"/>
                             <w:rFonts w:ascii="Times New Roman" w:hAnsi="Times New Roman" w:cs="Times New Roman" w:eastAsia="KaiTi"/>
                             <w:szCs w:val="21"/>
+                            <w:lang w:val="en-US" w:eastAsia="zh-CN"/>
                           </w:rPr>
                           <w:t xml:space="preserve"> </w:t>
                         </w:r>
@@ -493,6 +517,7 @@
                             <w:u w:val="none"/>
                             <w:rFonts w:ascii="Times New Roman" w:hAnsi="Times New Roman" w:cs="Times New Roman" w:eastAsia="KaiTi"/>
                             <w:szCs w:val="22"/>
+                            <w:lang w:val="en-US" w:eastAsia="zh-CN"/>
                           </w:rPr>
                           <w:t>技术栈：</w:t>
                         </w:r>
@@ -505,6 +530,7 @@
                             <w:u w:val="none"/>
                             <w:rFonts w:ascii="Times New Roman" w:hAnsi="Times New Roman" w:cs="Times New Roman" w:eastAsia="KaiTi"/>
                             <w:szCs w:val="21"/>
+                            <w:lang w:val="en-US" w:eastAsia="zh-CN"/>
                           </w:rPr>
                           <w:t>Python / Go｜FastAPI · React · Kafka</w:t>
                         </w:r>
@@ -567,6 +593,9 @@
                       <w:txbxContent>
                         <w:p>
                           <w:pPr>
+                            <w:kinsoku w:val="1"/>
+                            <w:wordWrap w:val="1"/>
+                            <w:overflowPunct w:val="0"/>
                             <w:snapToGrid w:val="0"/>
                             <w:spacing w:before="0" w:after="0" w:line="360" w:lineRule="exact"/>
                             <w:jc w:val="left"/>
@@ -580,6 +609,7 @@
                               <w:u w:val="none"/>
                               <w:rFonts w:ascii="Times New Roman" w:hAnsi="Times New Roman" w:cs="Times New Roman" w:eastAsia="KaiTi"/>
                               <w:szCs w:val="28"/>
+                              <w:lang w:val="en-US" w:eastAsia="zh-CN"/>
                             </w:rPr>
                             <w:t>教育背景</w:t>
                           </w:r>
@@ -709,6 +739,9 @@
                               <w:tab w:val="left" w:pos="7100"/>
                               <w:tab w:val="right" w:pos="10486"/>
                             </w:tabs>
+                            <w:kinsoku w:val="1"/>
+                            <w:wordWrap w:val="1"/>
+                            <w:overflowPunct w:val="0"/>
                             <w:snapToGrid w:val="0"/>
                             <w:spacing w:before="0" w:after="0" w:line="320" w:lineRule="exact"/>
                             <w:ind w:left="440" w:hanging="0"/>
@@ -723,6 +756,7 @@
                               <w:u w:val="none"/>
                               <w:rFonts w:ascii="Times New Roman" w:hAnsi="Times New Roman" w:cs="Times New Roman" w:eastAsia="KaiTi"/>
                               <w:szCs w:val="22"/>
+                              <w:lang w:val="en-US" w:eastAsia="zh-CN"/>
                             </w:rPr>
                             <w:t>星澜大学（虚构）</w:t>
                             <w:tab/>
@@ -782,6 +816,9 @@
                     <w:txbxContent>
                       <w:p>
                         <w:pPr>
+                          <w:kinsoku w:val="1"/>
+                          <w:wordWrap w:val="1"/>
+                          <w:overflowPunct w:val="0"/>
                           <w:snapToGrid w:val="0"/>
                           <w:spacing w:before="0" w:after="0" w:line="320" w:lineRule="exact"/>
                           <w:jc w:val="both"/>
@@ -795,6 +832,7 @@
                             <w:u w:val="none"/>
                             <w:rFonts w:ascii="Times New Roman" w:hAnsi="Times New Roman" w:cs="Times New Roman" w:eastAsia="KaiTi"/>
                             <w:szCs w:val="21"/>
+                            <w:lang w:val="en-US" w:eastAsia="zh-CN"/>
                           </w:rPr>
                           <w:t>导师 / 研究方向：</w:t>
                         </w:r>
@@ -807,6 +845,7 @@
                             <w:u w:val="none"/>
                             <w:rFonts w:ascii="Times New Roman" w:hAnsi="Times New Roman" w:cs="Times New Roman" w:eastAsia="KaiTi"/>
                             <w:szCs w:val="21"/>
+                            <w:lang w:val="en-US" w:eastAsia="zh-CN"/>
                           </w:rPr>
                           <w:t xml:space="preserve"> </w:t>
                         </w:r>
@@ -832,7 +871,7 @@
             <wp:positionV relativeFrom="page">
               <wp:posOffset>2477371</wp:posOffset>
             </wp:positionV>
-            <wp:extent cx="6696710" cy="236220"/>
+            <wp:extent cx="6696710" cy="235821"/>
             <wp:effectExtent l="0" t="0" r="0" b="0"/>
             <wp:wrapNone/>
             <wp:docPr id="26" name="body-26"/>
@@ -845,7 +884,7 @@
                   <wps:spPr>
                     <a:xfrm>
                       <a:off x="0" y="0"/>
-                      <a:ext cx="6696710" cy="236220"/>
+                      <a:ext cx="6696710" cy="235821"/>
                     </a:xfrm>
                     <a:prstGeom prst="rect">
                       <a:avLst/>
@@ -859,6 +898,9 @@
                     <w:txbxContent>
                       <w:p>
                         <w:pPr>
+                          <w:kinsoku w:val="1"/>
+                          <w:wordWrap w:val="1"/>
+                          <w:overflowPunct w:val="0"/>
                           <w:snapToGrid w:val="0"/>
                           <w:spacing w:before="0" w:after="0" w:line="320" w:lineRule="exact"/>
                           <w:jc w:val="both"/>
@@ -872,6 +914,7 @@
                             <w:u w:val="none"/>
                             <w:rFonts w:ascii="Times New Roman" w:hAnsi="Times New Roman" w:cs="Times New Roman" w:eastAsia="KaiTi"/>
                             <w:szCs w:val="21"/>
+                            <w:lang w:val="en-US" w:eastAsia="zh-CN"/>
                           </w:rPr>
                           <w:t>在校活动 / 荣誉：</w:t>
                         </w:r>
@@ -884,6 +927,7 @@
                             <w:u w:val="none"/>
                             <w:rFonts w:ascii="Times New Roman" w:hAnsi="Times New Roman" w:cs="Times New Roman" w:eastAsia="KaiTi"/>
                             <w:szCs w:val="21"/>
+                            <w:lang w:val="en-US" w:eastAsia="zh-CN"/>
                           </w:rPr>
                           <w:t xml:space="preserve"> </w:t>
                         </w:r>
@@ -907,7 +951,7 @@
               <wp:posOffset>431800</wp:posOffset>
             </wp:positionH>
             <wp:positionV relativeFrom="page">
-              <wp:posOffset>2802491</wp:posOffset>
+              <wp:posOffset>2802092</wp:posOffset>
             </wp:positionV>
             <wp:extent cx="6696710" cy="330200"/>
             <wp:effectExtent l="0" t="0" r="0" b="0"/>
@@ -992,6 +1036,9 @@
                               <w:tab w:val="left" w:pos="7100"/>
                               <w:tab w:val="right" w:pos="10486"/>
                             </w:tabs>
+                            <w:kinsoku w:val="1"/>
+                            <w:wordWrap w:val="1"/>
+                            <w:overflowPunct w:val="0"/>
                             <w:snapToGrid w:val="0"/>
                             <w:spacing w:before="0" w:after="0" w:line="320" w:lineRule="exact"/>
                             <w:ind w:left="440" w:hanging="0"/>
@@ -1006,6 +1053,7 @@
                               <w:u w:val="none"/>
                               <w:rFonts w:ascii="Times New Roman" w:hAnsi="Times New Roman" w:cs="Times New Roman" w:eastAsia="KaiTi"/>
                               <w:szCs w:val="22"/>
+                              <w:lang w:val="en-US" w:eastAsia="zh-CN"/>
                             </w:rPr>
                             <w:t>星澜大学（虚构）</w:t>
                             <w:tab/>
@@ -1036,9 +1084,9 @@
               <wp:posOffset>431800</wp:posOffset>
             </wp:positionH>
             <wp:positionV relativeFrom="page">
-              <wp:posOffset>3145391</wp:posOffset>
+              <wp:posOffset>3144992</wp:posOffset>
             </wp:positionV>
-            <wp:extent cx="6696710" cy="235984"/>
+            <wp:extent cx="6696710" cy="235821"/>
             <wp:effectExtent l="0" t="0" r="0" b="0"/>
             <wp:wrapNone/>
             <wp:docPr id="32" name="body-32"/>
@@ -1051,7 +1099,7 @@
                   <wps:spPr>
                     <a:xfrm>
                       <a:off x="0" y="0"/>
-                      <a:ext cx="6696710" cy="235984"/>
+                      <a:ext cx="6696710" cy="235821"/>
                     </a:xfrm>
                     <a:prstGeom prst="rect">
                       <a:avLst/>
@@ -1065,6 +1113,9 @@
                     <w:txbxContent>
                       <w:p>
                         <w:pPr>
+                          <w:kinsoku w:val="1"/>
+                          <w:wordWrap w:val="1"/>
+                          <w:overflowPunct w:val="0"/>
                           <w:snapToGrid w:val="0"/>
                           <w:spacing w:before="0" w:after="0" w:line="320" w:lineRule="exact"/>
                           <w:jc w:val="both"/>
@@ -1078,6 +1129,7 @@
                             <w:u w:val="none"/>
                             <w:rFonts w:ascii="Times New Roman" w:hAnsi="Times New Roman" w:cs="Times New Roman" w:eastAsia="KaiTi"/>
                             <w:szCs w:val="21"/>
+                            <w:lang w:val="en-US" w:eastAsia="zh-CN"/>
                           </w:rPr>
                           <w:t>毕业设计 / 指导教师：</w:t>
                         </w:r>
@@ -1090,6 +1142,7 @@
                             <w:u w:val="none"/>
                             <w:rFonts w:ascii="Times New Roman" w:hAnsi="Times New Roman" w:cs="Times New Roman" w:eastAsia="KaiTi"/>
                             <w:szCs w:val="21"/>
+                            <w:lang w:val="en-US" w:eastAsia="zh-CN"/>
                           </w:rPr>
                           <w:t xml:space="preserve"> </w:t>
                         </w:r>
@@ -1113,9 +1166,9 @@
               <wp:posOffset>431800</wp:posOffset>
             </wp:positionH>
             <wp:positionV relativeFrom="page">
-              <wp:posOffset>3387725</wp:posOffset>
+              <wp:posOffset>3387163</wp:posOffset>
             </wp:positionV>
-            <wp:extent cx="6696710" cy="235748"/>
+            <wp:extent cx="6696710" cy="235821"/>
             <wp:effectExtent l="0" t="0" r="0" b="0"/>
             <wp:wrapNone/>
             <wp:docPr id="34" name="body-34"/>
@@ -1128,7 +1181,7 @@
                   <wps:spPr>
                     <a:xfrm>
                       <a:off x="0" y="0"/>
-                      <a:ext cx="6696710" cy="235748"/>
+                      <a:ext cx="6696710" cy="235821"/>
                     </a:xfrm>
                     <a:prstGeom prst="rect">
                       <a:avLst/>
@@ -1142,6 +1195,9 @@
                     <w:txbxContent>
                       <w:p>
                         <w:pPr>
+                          <w:kinsoku w:val="1"/>
+                          <w:wordWrap w:val="1"/>
+                          <w:overflowPunct w:val="0"/>
                           <w:snapToGrid w:val="0"/>
                           <w:spacing w:before="0" w:after="0" w:line="320" w:lineRule="exact"/>
                           <w:jc w:val="both"/>
@@ -1155,6 +1211,7 @@
                             <w:u w:val="none"/>
                             <w:rFonts w:ascii="Times New Roman" w:hAnsi="Times New Roman" w:cs="Times New Roman" w:eastAsia="KaiTi"/>
                             <w:szCs w:val="21"/>
+                            <w:lang w:val="en-US" w:eastAsia="zh-CN"/>
                           </w:rPr>
                           <w:t>在校活动 / 荣誉：</w:t>
                         </w:r>
@@ -1167,6 +1224,7 @@
                             <w:u w:val="none"/>
                             <w:rFonts w:ascii="Times New Roman" w:hAnsi="Times New Roman" w:cs="Times New Roman" w:eastAsia="KaiTi"/>
                             <w:szCs w:val="21"/>
+                            <w:lang w:val="en-US" w:eastAsia="zh-CN"/>
                           </w:rPr>
                           <w:t xml:space="preserve"> </w:t>
                         </w:r>
@@ -1190,7 +1248,7 @@
               <wp:posOffset>431800</wp:posOffset>
             </wp:positionH>
             <wp:positionV relativeFrom="page">
-              <wp:posOffset>3750473</wp:posOffset>
+              <wp:posOffset>3749984</wp:posOffset>
             </wp:positionV>
             <wp:extent cx="6696710" cy="330200"/>
             <wp:effectExtent l="0" t="0" r="0" b="0"/>
@@ -1229,6 +1287,9 @@
                       <w:txbxContent>
                         <w:p>
                           <w:pPr>
+                            <w:kinsoku w:val="1"/>
+                            <w:wordWrap w:val="1"/>
+                            <w:overflowPunct w:val="0"/>
                             <w:snapToGrid w:val="0"/>
                             <w:spacing w:before="0" w:after="0" w:line="360" w:lineRule="exact"/>
                             <w:jc w:val="left"/>
@@ -1242,6 +1303,7 @@
                               <w:u w:val="none"/>
                               <w:rFonts w:ascii="Times New Roman" w:hAnsi="Times New Roman" w:cs="Times New Roman" w:eastAsia="KaiTi"/>
                               <w:szCs w:val="28"/>
+                              <w:lang w:val="en-US" w:eastAsia="zh-CN"/>
                             </w:rPr>
                             <w:t>项目经历</w:t>
                           </w:r>
@@ -1286,7 +1348,7 @@
               <wp:posOffset>431800</wp:posOffset>
             </wp:positionH>
             <wp:positionV relativeFrom="page">
-              <wp:posOffset>4131473</wp:posOffset>
+              <wp:posOffset>4130984</wp:posOffset>
             </wp:positionV>
             <wp:extent cx="6696710" cy="330200"/>
             <wp:effectExtent l="0" t="0" r="0" b="0"/>
@@ -1371,6 +1433,9 @@
                               <w:tab w:val="left" w:pos="7100"/>
                               <w:tab w:val="right" w:pos="10486"/>
                             </w:tabs>
+                            <w:kinsoku w:val="1"/>
+                            <w:wordWrap w:val="1"/>
+                            <w:overflowPunct w:val="0"/>
                             <w:snapToGrid w:val="0"/>
                             <w:spacing w:before="0" w:after="0" w:line="320" w:lineRule="exact"/>
                             <w:ind w:left="440" w:hanging="0"/>
@@ -1385,6 +1450,7 @@
                               <w:u w:val="none"/>
                               <w:rFonts w:ascii="Times New Roman" w:hAnsi="Times New Roman" w:cs="Times New Roman" w:eastAsia="KaiTi"/>
                               <w:szCs w:val="22"/>
+                              <w:lang w:val="en-US" w:eastAsia="zh-CN"/>
                             </w:rPr>
                             <w:t>云舟科技（虚构）</w:t>
                             <w:tab/>
@@ -1415,7 +1481,7 @@
               <wp:posOffset>431800</wp:posOffset>
             </wp:positionH>
             <wp:positionV relativeFrom="page">
-              <wp:posOffset>4499773</wp:posOffset>
+              <wp:posOffset>4499284</wp:posOffset>
             </wp:positionV>
             <wp:extent cx="6696710" cy="279400"/>
             <wp:effectExtent l="0" t="0" r="0" b="0"/>
@@ -1447,6 +1513,9 @@
                           <w:tabs>
                             <w:tab w:val="right" w:pos="10546"/>
                           </w:tabs>
+                          <w:kinsoku w:val="1"/>
+                          <w:wordWrap w:val="1"/>
+                          <w:overflowPunct w:val="0"/>
                           <w:snapToGrid w:val="0"/>
                           <w:spacing w:before="0" w:after="0" w:line="360" w:lineRule="exact"/>
                           <w:jc w:val="left"/>
@@ -1460,6 +1529,7 @@
                             <w:u w:val="none"/>
                             <w:rFonts w:ascii="Times New Roman" w:hAnsi="Times New Roman" w:cs="Times New Roman" w:eastAsia="KaiTi"/>
                             <w:szCs w:val="21"/>
+                            <w:lang w:val="en-US" w:eastAsia="zh-CN"/>
                           </w:rPr>
                           <w:t>AtlasFlow：研发任务协作平台（虚构）</w:t>
                         </w:r>
@@ -1472,6 +1542,7 @@
                             <w:u w:val="none"/>
                             <w:rFonts w:ascii="Times New Roman" w:hAnsi="Times New Roman" w:cs="Times New Roman" w:eastAsia="KaiTi"/>
                             <w:szCs w:val="21"/>
+                            <w:lang w:val="en-US" w:eastAsia="zh-CN"/>
                           </w:rPr>
                           <w:tab/>
                         </w:r>
@@ -1485,6 +1556,7 @@
                             <w:rFonts w:ascii="Times New Roman" w:hAnsi="Times New Roman" w:cs="Times New Roman" w:eastAsia="KaiTi"/>
                             <w:szCs w:val="21"/>
                             <w:position w:val="-2"/>
+                            <w:lang w:val="en-US" w:eastAsia="zh-CN"/>
                           </w:rPr>
                           <w:drawing>
                             <wp:inline>
@@ -1529,6 +1601,7 @@
                               <w:u w:val="single"/>
                               <w:rFonts w:ascii="Times New Roman" w:hAnsi="Times New Roman" w:cs="Times New Roman" w:eastAsia="KaiTi"/>
                               <w:szCs w:val="21"/>
+                              <w:lang w:val="en-US" w:eastAsia="zh-CN"/>
                             </w:rPr>
                             <w:t xml:space="preserve"> GitHub</w:t>
                           </w:r>
@@ -1553,9 +1626,9 @@
               <wp:posOffset>431800</wp:posOffset>
             </wp:positionH>
             <wp:positionV relativeFrom="page">
-              <wp:posOffset>4785523</wp:posOffset>
+              <wp:posOffset>4785034</wp:posOffset>
             </wp:positionV>
-            <wp:extent cx="6696710" cy="433657"/>
+            <wp:extent cx="6696710" cy="434340"/>
             <wp:effectExtent l="0" t="0" r="0" b="0"/>
             <wp:wrapNone/>
             <wp:docPr id="47" name="bullet-47"/>
@@ -1568,7 +1641,7 @@
                   <wps:spPr>
                     <a:xfrm>
                       <a:off x="0" y="0"/>
-                      <a:ext cx="6696710" cy="433657"/>
+                      <a:ext cx="6696710" cy="434340"/>
                     </a:xfrm>
                     <a:prstGeom prst="rect">
                       <a:avLst/>
@@ -1586,10 +1659,13 @@
                             <w:ilvl w:val="0"/>
                             <w:numId w:val="10"/>
                           </w:numPr>
+                          <w:kinsoku w:val="1"/>
+                          <w:wordWrap w:val="1"/>
+                          <w:overflowPunct w:val="0"/>
                           <w:snapToGrid w:val="0"/>
                           <w:spacing w:before="0" w:after="0" w:line="288" w:lineRule="auto"/>
                           <w:ind w:left="142" w:hanging="142"/>
-                          <w:jc w:val="both"/>
+                          <w:jc w:val="left"/>
                         </w:pPr>
                         <w:r>
                           <w:rPr>
@@ -1600,6 +1676,7 @@
                             <w:u w:val="none"/>
                             <w:rFonts w:ascii="Times New Roman" w:hAnsi="Times New Roman" w:cs="Times New Roman" w:eastAsia="KaiTi"/>
                             <w:szCs w:val="21"/>
+                            <w:lang w:val="en-US" w:eastAsia="zh-CN"/>
                           </w:rPr>
                           <w:t>项目背景：</w:t>
                         </w:r>
@@ -1612,13 +1689,14 @@
                             <w:u w:val="none"/>
                             <w:rFonts w:ascii="Times New Roman" w:hAnsi="Times New Roman" w:cs="Times New Roman" w:eastAsia="KaiTi"/>
                             <w:szCs w:val="21"/>
+                            <w:lang w:val="en-US" w:eastAsia="zh-CN"/>
                           </w:rPr>
                           <w:t>面向跨角色研发任务中信息分散、状态难以同步和交接成本高的问题，构建连接任务拆解、执行跟踪与结果归档的协作工作流。</w:t>
                         </w:r>
                       </w:p>
                     </w:txbxContent>
                   </wps:txbx>
-                  <wps:bodyPr rot="0" vert="horz" wrap="square" lIns="0" rIns="0" tIns="25400" bIns="12700" anchor="t">
+                  <wps:bodyPr rot="0" vert="horz" wrap="square" lIns="0" rIns="0" tIns="25400" bIns="25400" anchor="t">
                     <a:noAutofit/>
                   </wps:bodyPr>
                 </wps:wsp>
@@ -1635,9 +1713,9 @@
               <wp:posOffset>431800</wp:posOffset>
             </wp:positionH>
             <wp:positionV relativeFrom="page">
-              <wp:posOffset>5225530</wp:posOffset>
+              <wp:posOffset>5225724</wp:posOffset>
             </wp:positionV>
-            <wp:extent cx="6696710" cy="434031"/>
+            <wp:extent cx="6696710" cy="434340"/>
             <wp:effectExtent l="0" t="0" r="0" b="0"/>
             <wp:wrapNone/>
             <wp:docPr id="49" name="bullet-49"/>
@@ -1650,7 +1728,7 @@
                   <wps:spPr>
                     <a:xfrm>
                       <a:off x="0" y="0"/>
-                      <a:ext cx="6696710" cy="434031"/>
+                      <a:ext cx="6696710" cy="434340"/>
                     </a:xfrm>
                     <a:prstGeom prst="rect">
                       <a:avLst/>
@@ -1668,10 +1746,13 @@
                             <w:ilvl w:val="0"/>
                             <w:numId w:val="10"/>
                           </w:numPr>
+                          <w:kinsoku w:val="1"/>
+                          <w:wordWrap w:val="1"/>
+                          <w:overflowPunct w:val="0"/>
                           <w:snapToGrid w:val="0"/>
                           <w:spacing w:before="0" w:after="0" w:line="288" w:lineRule="auto"/>
                           <w:ind w:left="142" w:hanging="142"/>
-                          <w:jc w:val="both"/>
+                          <w:jc w:val="left"/>
                         </w:pPr>
                         <w:r>
                           <w:rPr>
@@ -1682,6 +1763,7 @@
                             <w:u w:val="none"/>
                             <w:rFonts w:ascii="Times New Roman" w:hAnsi="Times New Roman" w:cs="Times New Roman" w:eastAsia="KaiTi"/>
                             <w:szCs w:val="21"/>
+                            <w:lang w:val="en-US" w:eastAsia="zh-CN"/>
                           </w:rPr>
                           <w:t>项目职责：</w:t>
                         </w:r>
@@ -1694,13 +1776,14 @@
                             <w:u w:val="none"/>
                             <w:rFonts w:ascii="Times New Roman" w:hAnsi="Times New Roman" w:cs="Times New Roman" w:eastAsia="KaiTi"/>
                             <w:szCs w:val="21"/>
+                            <w:lang w:val="en-US" w:eastAsia="zh-CN"/>
                           </w:rPr>
                           <w:t>作为项目 Owner，负责流程建模与服务接口设计，拆解客户端和执行服务的接口边界，组织联调与异常场景验收。</w:t>
                         </w:r>
                       </w:p>
                     </w:txbxContent>
                   </wps:txbx>
-                  <wps:bodyPr rot="0" vert="horz" wrap="square" lIns="0" rIns="0" tIns="25400" bIns="12700" anchor="t">
+                  <wps:bodyPr rot="0" vert="horz" wrap="square" lIns="0" rIns="0" tIns="25400" bIns="25400" anchor="t">
                     <a:noAutofit/>
                   </wps:bodyPr>
                 </wps:wsp>
@@ -1717,9 +1800,9 @@
               <wp:posOffset>431800</wp:posOffset>
             </wp:positionH>
             <wp:positionV relativeFrom="page">
-              <wp:posOffset>5665911</wp:posOffset>
+              <wp:posOffset>5666414</wp:posOffset>
             </wp:positionV>
-            <wp:extent cx="6696710" cy="434405"/>
+            <wp:extent cx="6696710" cy="886460"/>
             <wp:effectExtent l="0" t="0" r="0" b="0"/>
             <wp:wrapNone/>
             <wp:docPr id="51" name="bullet-51"/>
@@ -1732,7 +1815,7 @@
                   <wps:spPr>
                     <a:xfrm>
                       <a:off x="0" y="0"/>
-                      <a:ext cx="6696710" cy="434405"/>
+                      <a:ext cx="6696710" cy="886460"/>
                     </a:xfrm>
                     <a:prstGeom prst="rect">
                       <a:avLst/>
@@ -1750,10 +1833,13 @@
                             <w:ilvl w:val="1"/>
                             <w:numId w:val="10"/>
                           </w:numPr>
+                          <w:kinsoku w:val="1"/>
+                          <w:wordWrap w:val="1"/>
+                          <w:overflowPunct w:val="0"/>
                           <w:snapToGrid w:val="0"/>
                           <w:spacing w:before="0" w:after="0" w:line="288" w:lineRule="auto"/>
                           <w:ind w:left="255" w:hanging="142"/>
-                          <w:jc w:val="both"/>
+                          <w:jc w:val="left"/>
                         </w:pPr>
                         <w:r>
                           <w:rPr>
@@ -1764,8 +1850,9 @@
                             <w:u w:val="none"/>
                             <w:rFonts w:ascii="Times New Roman" w:hAnsi="Times New Roman" w:cs="Times New Roman" w:eastAsia="KaiTi"/>
                             <w:szCs w:val="21"/>
+                            <w:lang w:val="en-US" w:eastAsia="zh-CN"/>
                           </w:rPr>
-                          <w:t>执行编排：</w:t>
+                          <w:t>任务状态与失败恢复：</w:t>
                         </w:r>
                         <w:r>
                           <w:rPr>
@@ -1776,13 +1863,14 @@
                             <w:u w:val="none"/>
                             <w:rFonts w:ascii="Times New Roman" w:hAnsi="Times New Roman" w:cs="Times New Roman" w:eastAsia="KaiTi"/>
                             <w:szCs w:val="21"/>
+                            <w:lang w:val="en-US" w:eastAsia="zh-CN"/>
                           </w:rPr>
-                          <w:t>以任务状态机串联规划、执行和复核环节，通过消息事件传递进度与执行结果；对中断任务保留检查点，支持恢复后继续执行。</w:t>
+                          <w:t>针对超时重试、重复回调和阶段失败造成的状态不一致，以任务标识关联执行记录，先核对事件是否处理，再按允许的迁移推进任务，避免重复通知再次触发已完成阶段。失败时保留阶段产物与检查点，从最近成功阶段之后继续执行。通过重复回调、回调迟到和中断恢复样例，逐项核对状态迁移与产物引用，检查是否重复执行或丢失历史结果。</w:t>
                         </w:r>
                       </w:p>
                     </w:txbxContent>
                   </wps:txbx>
-                  <wps:bodyPr rot="0" vert="horz" wrap="square" lIns="0" rIns="0" tIns="25400" bIns="12700" anchor="t">
+                  <wps:bodyPr rot="0" vert="horz" wrap="square" lIns="0" rIns="0" tIns="25400" bIns="25400" anchor="t">
                     <a:noAutofit/>
                   </wps:bodyPr>
                 </wps:wsp>
@@ -1799,9 +1887,9 @@
               <wp:posOffset>431800</wp:posOffset>
             </wp:positionH>
             <wp:positionV relativeFrom="page">
-              <wp:posOffset>6106666</wp:posOffset>
+              <wp:posOffset>6559224</wp:posOffset>
             </wp:positionV>
-            <wp:extent cx="6696710" cy="434144"/>
+            <wp:extent cx="6696710" cy="660400"/>
             <wp:effectExtent l="0" t="0" r="0" b="0"/>
             <wp:wrapNone/>
             <wp:docPr id="53" name="bullet-53"/>
@@ -1814,7 +1902,7 @@
                   <wps:spPr>
                     <a:xfrm>
                       <a:off x="0" y="0"/>
-                      <a:ext cx="6696710" cy="434144"/>
+                      <a:ext cx="6696710" cy="660400"/>
                     </a:xfrm>
                     <a:prstGeom prst="rect">
                       <a:avLst/>
@@ -1832,10 +1920,13 @@
                             <w:ilvl w:val="1"/>
                             <w:numId w:val="10"/>
                           </w:numPr>
+                          <w:kinsoku w:val="1"/>
+                          <w:wordWrap w:val="1"/>
+                          <w:overflowPunct w:val="0"/>
                           <w:snapToGrid w:val="0"/>
                           <w:spacing w:before="0" w:after="0" w:line="288" w:lineRule="auto"/>
                           <w:ind w:left="255" w:hanging="142"/>
-                          <w:jc w:val="both"/>
+                          <w:jc w:val="left"/>
                         </w:pPr>
                         <w:r>
                           <w:rPr>
@@ -1846,8 +1937,9 @@
                             <w:u w:val="none"/>
                             <w:rFonts w:ascii="Times New Roman" w:hAnsi="Times New Roman" w:cs="Times New Roman" w:eastAsia="KaiTi"/>
                             <w:szCs w:val="21"/>
+                            <w:lang w:val="en-US" w:eastAsia="zh-CN"/>
                           </w:rPr>
-                          <w:t>接口设计：</w:t>
+                          <w:t>接口契约与结果追溯：</w:t>
                         </w:r>
                         <w:r>
                           <w:rPr>
@@ -1858,13 +1950,14 @@
                             <w:u w:val="none"/>
                             <w:rFonts w:ascii="Times New Roman" w:hAnsi="Times New Roman" w:cs="Times New Roman" w:eastAsia="KaiTi"/>
                             <w:szCs w:val="21"/>
+                            <w:lang w:val="en-US" w:eastAsia="zh-CN"/>
                           </w:rPr>
-                          <w:t>使用 Python 与 FastAPI 封装任务及工具接口，以统一标识关联输入、执行日志和产物；为客户端提供状态查询及结果回溯能力。</w:t>
+                          <w:t>围绕客户端、任务服务与执行器之间的交接，使用 FastAPI 定义任务创建、阶段回调和结果查询接口，以任务标识、阶段编号及产物位置建立统一的数据契约。将失败状态与执行日志关联返回，使调用方可区分尚未完成与执行失败，并沿同一标识定位对应阶段和复现输入。</w:t>
                         </w:r>
                       </w:p>
                     </w:txbxContent>
                   </wps:txbx>
-                  <wps:bodyPr rot="0" vert="horz" wrap="square" lIns="0" rIns="0" tIns="25400" bIns="12700" anchor="t">
+                  <wps:bodyPr rot="0" vert="horz" wrap="square" lIns="0" rIns="0" tIns="25400" bIns="25400" anchor="t">
                     <a:noAutofit/>
                   </wps:bodyPr>
                 </wps:wsp>
@@ -1881,9 +1974,9 @@
               <wp:posOffset>431800</wp:posOffset>
             </wp:positionH>
             <wp:positionV relativeFrom="page">
-              <wp:posOffset>6547160</wp:posOffset>
+              <wp:posOffset>7225974</wp:posOffset>
             </wp:positionV>
-            <wp:extent cx="6696710" cy="433883"/>
+            <wp:extent cx="6696710" cy="434340"/>
             <wp:effectExtent l="0" t="0" r="0" b="0"/>
             <wp:wrapNone/>
             <wp:docPr id="55" name="bullet-55"/>
@@ -1896,89 +1989,7 @@
                   <wps:spPr>
                     <a:xfrm>
                       <a:off x="0" y="0"/>
-                      <a:ext cx="6696710" cy="433883"/>
-                    </a:xfrm>
-                    <a:prstGeom prst="rect">
-                      <a:avLst/>
-                    </a:prstGeom>
-                    <a:noFill/>
-                    <a:ln>
-                      <a:noFill/>
-                    </a:ln>
-                  </wps:spPr>
-                  <wps:txbx>
-                    <w:txbxContent>
-                      <w:p>
-                        <w:pPr>
-                          <w:numPr>
-                            <w:ilvl w:val="1"/>
-                            <w:numId w:val="10"/>
-                          </w:numPr>
-                          <w:snapToGrid w:val="0"/>
-                          <w:spacing w:before="0" w:after="0" w:line="288" w:lineRule="auto"/>
-                          <w:ind w:left="255" w:hanging="142"/>
-                          <w:jc w:val="both"/>
-                        </w:pPr>
-                        <w:r>
-                          <w:rPr>
-                            <w:b/>
-                            <w:i w:val="0"/>
-                            <w:color w:val="262626"/>
-                            <w:sz w:val="21"/>
-                            <w:u w:val="none"/>
-                            <w:rFonts w:ascii="Times New Roman" w:hAnsi="Times New Roman" w:cs="Times New Roman" w:eastAsia="KaiTi"/>
-                            <w:szCs w:val="21"/>
-                          </w:rPr>
-                          <w:t>质量验证：</w:t>
-                        </w:r>
-                        <w:r>
-                          <w:rPr>
-                            <w:b w:val="0"/>
-                            <w:i w:val="0"/>
-                            <w:color w:val="262626"/>
-                            <w:sz w:val="21"/>
-                            <w:u w:val="none"/>
-                            <w:rFonts w:ascii="Times New Roman" w:hAnsi="Times New Roman" w:cs="Times New Roman" w:eastAsia="KaiTi"/>
-                            <w:szCs w:val="21"/>
-                          </w:rPr>
-                          <w:t>建立固定任务集与失败分类，覆盖超时重试、重复事件和中断恢复；对照预期状态检查执行链路，并以日志定位交接环节的问题。</w:t>
-                        </w:r>
-                      </w:p>
-                    </w:txbxContent>
-                  </wps:txbx>
-                  <wps:bodyPr rot="0" vert="horz" wrap="square" lIns="0" rIns="0" tIns="25400" bIns="12700" anchor="t">
-                    <a:noAutofit/>
-                  </wps:bodyPr>
-                </wps:wsp>
-              </a:graphicData>
-            </a:graphic>
-          </wp:anchor>
-        </w:drawing>
-      </w:r>
-      <w:r>
-        <w:drawing>
-          <wp:anchor distT="0" distB="0" distL="0" distR="0" simplePos="0" relativeHeight="251660057" behindDoc="0" locked="0" layoutInCell="1" allowOverlap="1">
-            <wp:simplePos x="0" y="0"/>
-            <wp:positionH relativeFrom="page">
-              <wp:posOffset>431800</wp:posOffset>
-            </wp:positionH>
-            <wp:positionV relativeFrom="page">
-              <wp:posOffset>6987393</wp:posOffset>
-            </wp:positionV>
-            <wp:extent cx="6696710" cy="434257"/>
-            <wp:effectExtent l="0" t="0" r="0" b="0"/>
-            <wp:wrapNone/>
-            <wp:docPr id="57" name="bullet-57"/>
-            <wp:cNvGraphicFramePr/>
-            <a:graphic xmlns:a="http://schemas.openxmlformats.org/drawingml/2006/main">
-              <a:graphicData uri="http://schemas.microsoft.com/office/word/2010/wordprocessingShape">
-                <wps:wsp>
-                  <wps:cNvPr id="58" name="bullet-57-text"/>
-                  <wps:cNvSpPr txBox="1"/>
-                  <wps:spPr>
-                    <a:xfrm>
-                      <a:off x="0" y="0"/>
-                      <a:ext cx="6696710" cy="434257"/>
+                      <a:ext cx="6696710" cy="434340"/>
                     </a:xfrm>
                     <a:prstGeom prst="rect">
                       <a:avLst/>
@@ -1996,10 +2007,13 @@
                             <w:ilvl w:val="0"/>
                             <w:numId w:val="10"/>
                           </w:numPr>
+                          <w:kinsoku w:val="1"/>
+                          <w:wordWrap w:val="1"/>
+                          <w:overflowPunct w:val="0"/>
                           <w:snapToGrid w:val="0"/>
                           <w:spacing w:before="0" w:after="0" w:line="288" w:lineRule="auto"/>
                           <w:ind w:left="142" w:hanging="142"/>
-                          <w:jc w:val="both"/>
+                          <w:jc w:val="left"/>
                         </w:pPr>
                         <w:r>
                           <w:rPr>
@@ -2010,6 +2024,7 @@
                             <w:u w:val="none"/>
                             <w:rFonts w:ascii="Times New Roman" w:hAnsi="Times New Roman" w:cs="Times New Roman" w:eastAsia="KaiTi"/>
                             <w:szCs w:val="21"/>
+                            <w:lang w:val="en-US" w:eastAsia="zh-CN"/>
                           </w:rPr>
                           <w:t>项目产出：</w:t>
                         </w:r>
@@ -2022,13 +2037,14 @@
                             <w:u w:val="none"/>
                             <w:rFonts w:ascii="Times New Roman" w:hAnsi="Times New Roman" w:cs="Times New Roman" w:eastAsia="KaiTi"/>
                             <w:szCs w:val="21"/>
+                            <w:lang w:val="en-US" w:eastAsia="zh-CN"/>
                           </w:rPr>
                           <w:t>交付可运行原型、接口说明与复现脚本；将联调中的失败样例沉淀为回归用例，为接入新工具和迭代流程提供可重复的验收基线。</w:t>
                         </w:r>
                       </w:p>
                     </w:txbxContent>
                   </wps:txbx>
-                  <wps:bodyPr rot="0" vert="horz" wrap="square" lIns="0" rIns="0" tIns="25400" bIns="12700" anchor="t">
+                  <wps:bodyPr rot="0" vert="horz" wrap="square" lIns="0" rIns="0" tIns="25400" bIns="25400" anchor="t">
                     <a:noAutofit/>
                   </wps:bodyPr>
                 </wps:wsp>
@@ -2039,23 +2055,23 @@
       </w:r>
       <w:r>
         <w:drawing>
-          <wp:anchor distT="0" distB="0" distL="0" distR="0" simplePos="0" relativeHeight="251660061" behindDoc="0" locked="0" layoutInCell="1" allowOverlap="1">
+          <wp:anchor distT="0" distB="0" distL="0" distR="0" simplePos="0" relativeHeight="251660059" behindDoc="0" locked="0" layoutInCell="1" allowOverlap="1">
             <wp:simplePos x="0" y="0"/>
             <wp:positionH relativeFrom="page">
               <wp:posOffset>431800</wp:posOffset>
             </wp:positionH>
             <wp:positionV relativeFrom="page">
-              <wp:posOffset>7510550</wp:posOffset>
+              <wp:posOffset>7749214</wp:posOffset>
             </wp:positionV>
             <wp:extent cx="6696710" cy="279400"/>
             <wp:effectExtent l="0" t="0" r="0" b="0"/>
             <wp:wrapNone/>
-            <wp:docPr id="61" name="project_header-61"/>
+            <wp:docPr id="59" name="project_header-59"/>
             <wp:cNvGraphicFramePr/>
             <a:graphic xmlns:a="http://schemas.openxmlformats.org/drawingml/2006/main">
               <a:graphicData uri="http://schemas.microsoft.com/office/word/2010/wordprocessingShape">
                 <wps:wsp>
-                  <wps:cNvPr id="62" name="project_header-61-text"/>
+                  <wps:cNvPr id="60" name="project_header-59-text"/>
                   <wps:cNvSpPr txBox="1"/>
                   <wps:spPr>
                     <a:xfrm>
@@ -2077,6 +2093,9 @@
                           <w:tabs>
                             <w:tab w:val="right" w:pos="10546"/>
                           </w:tabs>
+                          <w:kinsoku w:val="1"/>
+                          <w:wordWrap w:val="1"/>
+                          <w:overflowPunct w:val="0"/>
                           <w:snapToGrid w:val="0"/>
                           <w:spacing w:before="0" w:after="0" w:line="360" w:lineRule="exact"/>
                           <w:jc w:val="left"/>
@@ -2090,6 +2109,7 @@
                             <w:u w:val="none"/>
                             <w:rFonts w:ascii="Times New Roman" w:hAnsi="Times New Roman" w:cs="Times New Roman" w:eastAsia="KaiTi"/>
                             <w:szCs w:val="21"/>
+                            <w:lang w:val="en-US" w:eastAsia="zh-CN"/>
                           </w:rPr>
                           <w:t>TraceNest：安全事件关联工具（虚构）</w:t>
                         </w:r>
@@ -2102,6 +2122,7 @@
                             <w:u w:val="none"/>
                             <w:rFonts w:ascii="Times New Roman" w:hAnsi="Times New Roman" w:cs="Times New Roman" w:eastAsia="KaiTi"/>
                             <w:szCs w:val="21"/>
+                            <w:lang w:val="en-US" w:eastAsia="zh-CN"/>
                           </w:rPr>
                           <w:tab/>
                         </w:r>
@@ -2115,11 +2136,12 @@
                             <w:rFonts w:ascii="Times New Roman" w:hAnsi="Times New Roman" w:cs="Times New Roman" w:eastAsia="KaiTi"/>
                             <w:szCs w:val="21"/>
                             <w:position w:val="-2"/>
+                            <w:lang w:val="en-US" w:eastAsia="zh-CN"/>
                           </w:rPr>
                           <w:drawing>
                             <wp:inline>
                               <wp:extent cx="139700" cy="139700"/>
-                              <wp:docPr id="60" name="inline-icon"/>
+                              <wp:docPr id="58" name="inline-icon"/>
                               <wp:cNvGraphicFramePr>
                                 <a:graphicFrameLocks noChangeAspect="1"/>
                               </wp:cNvGraphicFramePr>
@@ -2127,7 +2149,7 @@
                                 <a:graphicData uri="http://schemas.openxmlformats.org/drawingml/2006/picture">
                                   <pic:pic xmlns:pic="http://schemas.openxmlformats.org/drawingml/2006/picture">
                                     <pic:nvPicPr>
-                                      <pic:cNvPr id="59" name="inline-icon-59"/>
+                                      <pic:cNvPr id="57" name="inline-icon-57"/>
                                       <pic:cNvPicPr/>
                                     </pic:nvPicPr>
                                     <pic:blipFill>
@@ -2159,10 +2181,98 @@
                               <w:u w:val="single"/>
                               <w:rFonts w:ascii="Times New Roman" w:hAnsi="Times New Roman" w:cs="Times New Roman" w:eastAsia="KaiTi"/>
                               <w:szCs w:val="21"/>
+                              <w:lang w:val="en-US" w:eastAsia="zh-CN"/>
                             </w:rPr>
                             <w:t xml:space="preserve"> GitHub</w:t>
                           </w:r>
                         </w:hyperlink>
+                      </w:p>
+                    </w:txbxContent>
+                  </wps:txbx>
+                  <wps:bodyPr rot="0" vert="horz" wrap="square" lIns="0" rIns="0" tIns="25400" bIns="25400" anchor="t">
+                    <a:noAutofit/>
+                  </wps:bodyPr>
+                </wps:wsp>
+              </a:graphicData>
+            </a:graphic>
+          </wp:anchor>
+        </w:drawing>
+      </w:r>
+      <w:r>
+        <w:drawing>
+          <wp:anchor distT="0" distB="0" distL="0" distR="0" simplePos="0" relativeHeight="251660061" behindDoc="0" locked="0" layoutInCell="1" allowOverlap="1">
+            <wp:simplePos x="0" y="0"/>
+            <wp:positionH relativeFrom="page">
+              <wp:posOffset>431800</wp:posOffset>
+            </wp:positionH>
+            <wp:positionV relativeFrom="page">
+              <wp:posOffset>8034964</wp:posOffset>
+            </wp:positionV>
+            <wp:extent cx="6696710" cy="434340"/>
+            <wp:effectExtent l="0" t="0" r="0" b="0"/>
+            <wp:wrapNone/>
+            <wp:docPr id="61" name="bullet-61"/>
+            <wp:cNvGraphicFramePr/>
+            <a:graphic xmlns:a="http://schemas.openxmlformats.org/drawingml/2006/main">
+              <a:graphicData uri="http://schemas.microsoft.com/office/word/2010/wordprocessingShape">
+                <wps:wsp>
+                  <wps:cNvPr id="62" name="bullet-61-text"/>
+                  <wps:cNvSpPr txBox="1"/>
+                  <wps:spPr>
+                    <a:xfrm>
+                      <a:off x="0" y="0"/>
+                      <a:ext cx="6696710" cy="434340"/>
+                    </a:xfrm>
+                    <a:prstGeom prst="rect">
+                      <a:avLst/>
+                    </a:prstGeom>
+                    <a:noFill/>
+                    <a:ln>
+                      <a:noFill/>
+                    </a:ln>
+                  </wps:spPr>
+                  <wps:txbx>
+                    <w:txbxContent>
+                      <w:p>
+                        <w:pPr>
+                          <w:numPr>
+                            <w:ilvl w:val="0"/>
+                            <w:numId w:val="10"/>
+                          </w:numPr>
+                          <w:kinsoku w:val="1"/>
+                          <w:wordWrap w:val="1"/>
+                          <w:overflowPunct w:val="0"/>
+                          <w:snapToGrid w:val="0"/>
+                          <w:spacing w:before="0" w:after="0" w:line="288" w:lineRule="auto"/>
+                          <w:ind w:left="142" w:hanging="142"/>
+                          <w:jc w:val="left"/>
+                        </w:pPr>
+                        <w:r>
+                          <w:rPr>
+                            <w:b/>
+                            <w:i w:val="0"/>
+                            <w:color w:val="262626"/>
+                            <w:sz w:val="21"/>
+                            <w:u w:val="none"/>
+                            <w:rFonts w:ascii="Times New Roman" w:hAnsi="Times New Roman" w:cs="Times New Roman" w:eastAsia="KaiTi"/>
+                            <w:szCs w:val="21"/>
+                            <w:lang w:val="en-US" w:eastAsia="zh-CN"/>
+                          </w:rPr>
+                          <w:t>项目背景：</w:t>
+                        </w:r>
+                        <w:r>
+                          <w:rPr>
+                            <w:b w:val="0"/>
+                            <w:i w:val="0"/>
+                            <w:color w:val="262626"/>
+                            <w:sz w:val="21"/>
+                            <w:u w:val="none"/>
+                            <w:rFonts w:ascii="Times New Roman" w:hAnsi="Times New Roman" w:cs="Times New Roman" w:eastAsia="KaiTi"/>
+                            <w:szCs w:val="21"/>
+                            <w:lang w:val="en-US" w:eastAsia="zh-CN"/>
+                          </w:rPr>
+                          <w:t>针对告警上下文分散、重复人工检索和证据交接困难的问题，聚合主机与网络事件，为分析人员提供可追溯的事件调查视图。</w:t>
+                        </w:r>
                       </w:p>
                     </w:txbxContent>
                   </wps:txbx>
@@ -2183,9 +2293,9 @@
               <wp:posOffset>431800</wp:posOffset>
             </wp:positionH>
             <wp:positionV relativeFrom="page">
-              <wp:posOffset>7796300</wp:posOffset>
+              <wp:posOffset>8475654</wp:posOffset>
             </wp:positionV>
-            <wp:extent cx="6696710" cy="434257"/>
+            <wp:extent cx="6696710" cy="434340"/>
             <wp:effectExtent l="0" t="0" r="0" b="0"/>
             <wp:wrapNone/>
             <wp:docPr id="63" name="bullet-63"/>
@@ -2198,7 +2308,7 @@
                   <wps:spPr>
                     <a:xfrm>
                       <a:off x="0" y="0"/>
-                      <a:ext cx="6696710" cy="434257"/>
+                      <a:ext cx="6696710" cy="434340"/>
                     </a:xfrm>
                     <a:prstGeom prst="rect">
                       <a:avLst/>
@@ -2216,10 +2326,13 @@
                             <w:ilvl w:val="0"/>
                             <w:numId w:val="10"/>
                           </w:numPr>
+                          <w:kinsoku w:val="1"/>
+                          <w:wordWrap w:val="1"/>
+                          <w:overflowPunct w:val="0"/>
                           <w:snapToGrid w:val="0"/>
                           <w:spacing w:before="0" w:after="0" w:line="288" w:lineRule="auto"/>
                           <w:ind w:left="142" w:hanging="142"/>
-                          <w:jc w:val="both"/>
+                          <w:jc w:val="left"/>
                         </w:pPr>
                         <w:r>
                           <w:rPr>
@@ -2230,25 +2343,27 @@
                             <w:u w:val="none"/>
                             <w:rFonts w:ascii="Times New Roman" w:hAnsi="Times New Roman" w:cs="Times New Roman" w:eastAsia="KaiTi"/>
                             <w:szCs w:val="21"/>
+                            <w:lang w:val="en-US" w:eastAsia="zh-CN"/>
                           </w:rPr>
-                          <w:t>项目背景：</w:t>
+                          <w:t>项目职责：</w:t>
                         </w:r>
                         <w:r>
                           <w:rPr>
-                            <w:b w:val="0"/>
+                            <w:b/>
                             <w:i w:val="0"/>
                             <w:color w:val="262626"/>
                             <w:sz w:val="21"/>
                             <w:u w:val="none"/>
                             <w:rFonts w:ascii="Times New Roman" w:hAnsi="Times New Roman" w:cs="Times New Roman" w:eastAsia="KaiTi"/>
                             <w:szCs w:val="21"/>
+                            <w:lang w:val="en-US" w:eastAsia="zh-CN"/>
                           </w:rPr>
-                          <w:t>针对告警上下文分散、重复人工检索和证据交接困难的问题，聚合主机与网络事件，为分析人员提供可追溯的事件调查视图。</w:t>
+                          <w:t>作为项目 Owner，负责事件模型、关联接口与分析页面的设计，明确证据保留要求，组织端到端联调及边界条件验证。</w:t>
                         </w:r>
                       </w:p>
                     </w:txbxContent>
                   </wps:txbx>
-                  <wps:bodyPr rot="0" vert="horz" wrap="square" lIns="0" rIns="0" tIns="25400" bIns="12700" anchor="t">
+                  <wps:bodyPr rot="0" vert="horz" wrap="square" lIns="0" rIns="0" tIns="25400" bIns="25400" anchor="t">
                     <a:noAutofit/>
                   </wps:bodyPr>
                 </wps:wsp>
@@ -2265,9 +2380,9 @@
               <wp:posOffset>431800</wp:posOffset>
             </wp:positionH>
             <wp:positionV relativeFrom="page">
-              <wp:posOffset>8236907</wp:posOffset>
+              <wp:posOffset>8916344</wp:posOffset>
             </wp:positionV>
-            <wp:extent cx="6696710" cy="433996"/>
+            <wp:extent cx="6696710" cy="660400"/>
             <wp:effectExtent l="0" t="0" r="0" b="0"/>
             <wp:wrapNone/>
             <wp:docPr id="65" name="bullet-65"/>
@@ -2280,7 +2395,181 @@
                   <wps:spPr>
                     <a:xfrm>
                       <a:off x="0" y="0"/>
-                      <a:ext cx="6696710" cy="433996"/>
+                      <a:ext cx="6696710" cy="660400"/>
+                    </a:xfrm>
+                    <a:prstGeom prst="rect">
+                      <a:avLst/>
+                    </a:prstGeom>
+                    <a:noFill/>
+                    <a:ln>
+                      <a:noFill/>
+                    </a:ln>
+                  </wps:spPr>
+                  <wps:txbx>
+                    <w:txbxContent>
+                      <w:p>
+                        <w:pPr>
+                          <w:numPr>
+                            <w:ilvl w:val="1"/>
+                            <w:numId w:val="10"/>
+                          </w:numPr>
+                          <w:kinsoku w:val="1"/>
+                          <w:wordWrap w:val="1"/>
+                          <w:overflowPunct w:val="0"/>
+                          <w:snapToGrid w:val="0"/>
+                          <w:spacing w:before="0" w:after="0" w:line="288" w:lineRule="auto"/>
+                          <w:ind w:left="255" w:hanging="142"/>
+                          <w:jc w:val="left"/>
+                        </w:pPr>
+                        <w:r>
+                          <w:rPr>
+                            <w:b/>
+                            <w:i w:val="0"/>
+                            <w:color w:val="262626"/>
+                            <w:sz w:val="21"/>
+                            <w:u w:val="none"/>
+                            <w:rFonts w:ascii="Times New Roman" w:hAnsi="Times New Roman" w:cs="Times New Roman" w:eastAsia="KaiTi"/>
+                            <w:szCs w:val="21"/>
+                            <w:lang w:val="en-US" w:eastAsia="zh-CN"/>
+                          </w:rPr>
+                          <w:t>事件归一化与重复输入：</w:t>
+                        </w:r>
+                        <w:r>
+                          <w:rPr>
+                            <w:b w:val="0"/>
+                            <w:i w:val="0"/>
+                            <w:color w:val="262626"/>
+                            <w:sz w:val="21"/>
+                            <w:u w:val="none"/>
+                            <w:rFonts w:ascii="Times New Roman" w:hAnsi="Times New Roman" w:cs="Times New Roman" w:eastAsia="KaiTi"/>
+                            <w:szCs w:val="21"/>
+                            <w:lang w:val="en-US" w:eastAsia="zh-CN"/>
+                          </w:rPr>
+                          <w:t>针对不同来源的时间、主体及事件标识不一致，使用 Go 统一字段并保留原始记录位置，经 Kafka 向检索侧传递标准事件。以来源标识关联归一化结果和调查对象，结合重复、迟到与缺失字段样例核对记录及检索展示，避免清洗后丢失回溯依据。</w:t>
+                        </w:r>
+                      </w:p>
+                    </w:txbxContent>
+                  </wps:txbx>
+                  <wps:bodyPr rot="0" vert="horz" wrap="square" lIns="0" rIns="0" tIns="25400" bIns="25400" anchor="t">
+                    <a:noAutofit/>
+                  </wps:bodyPr>
+                </wps:wsp>
+              </a:graphicData>
+            </a:graphic>
+          </wp:anchor>
+        </w:drawing>
+      </w:r>
+      <w:r>
+        <w:drawing>
+          <wp:anchor distT="0" distB="0" distL="0" distR="0" simplePos="0" relativeHeight="251660067" behindDoc="0" locked="0" layoutInCell="1" allowOverlap="1">
+            <wp:simplePos x="0" y="0"/>
+            <wp:positionH relativeFrom="page">
+              <wp:posOffset>431800</wp:posOffset>
+            </wp:positionH>
+            <wp:positionV relativeFrom="page">
+              <wp:posOffset>9583094</wp:posOffset>
+            </wp:positionV>
+            <wp:extent cx="6696710" cy="434340"/>
+            <wp:effectExtent l="0" t="0" r="0" b="0"/>
+            <wp:wrapNone/>
+            <wp:docPr id="67" name="bullet-67"/>
+            <wp:cNvGraphicFramePr/>
+            <a:graphic xmlns:a="http://schemas.openxmlformats.org/drawingml/2006/main">
+              <a:graphicData uri="http://schemas.microsoft.com/office/word/2010/wordprocessingShape">
+                <wps:wsp>
+                  <wps:cNvPr id="68" name="bullet-67-text"/>
+                  <wps:cNvSpPr txBox="1"/>
+                  <wps:spPr>
+                    <a:xfrm>
+                      <a:off x="0" y="0"/>
+                      <a:ext cx="6696710" cy="434340"/>
+                    </a:xfrm>
+                    <a:prstGeom prst="rect">
+                      <a:avLst/>
+                    </a:prstGeom>
+                    <a:noFill/>
+                    <a:ln>
+                      <a:noFill/>
+                    </a:ln>
+                  </wps:spPr>
+                  <wps:txbx>
+                    <w:txbxContent>
+                      <w:p>
+                        <w:pPr>
+                          <w:numPr>
+                            <w:ilvl w:val="1"/>
+                            <w:numId w:val="10"/>
+                          </w:numPr>
+                          <w:kinsoku w:val="1"/>
+                          <w:wordWrap w:val="1"/>
+                          <w:overflowPunct w:val="0"/>
+                          <w:snapToGrid w:val="0"/>
+                          <w:spacing w:before="0" w:after="0" w:line="288" w:lineRule="auto"/>
+                          <w:ind w:left="255" w:hanging="142"/>
+                          <w:jc w:val="left"/>
+                        </w:pPr>
+                        <w:r>
+                          <w:rPr>
+                            <w:b/>
+                            <w:i w:val="0"/>
+                            <w:color w:val="262626"/>
+                            <w:sz w:val="21"/>
+                            <w:u w:val="none"/>
+                            <w:rFonts w:ascii="Times New Roman" w:hAnsi="Times New Roman" w:cs="Times New Roman" w:eastAsia="KaiTi"/>
+                            <w:szCs w:val="21"/>
+                            <w:lang w:val="en-US" w:eastAsia="zh-CN"/>
+                          </w:rPr>
+                          <w:t>调查证据与来源关联：</w:t>
+                        </w:r>
+                        <w:r>
+                          <w:rPr>
+                            <w:b w:val="0"/>
+                            <w:i w:val="0"/>
+                            <w:color w:val="262626"/>
+                            <w:sz w:val="21"/>
+                            <w:u w:val="none"/>
+                            <w:rFonts w:ascii="Times New Roman" w:hAnsi="Times New Roman" w:cs="Times New Roman" w:eastAsia="KaiTi"/>
+                            <w:szCs w:val="21"/>
+                            <w:lang w:val="en-US" w:eastAsia="zh-CN"/>
+                          </w:rPr>
+                          <w:t>通过 React 时间线组织调查记录，将结论与对应原始事件、查询条件一起呈现。复核时可沿来源标识返回证据记录，区分当前分析结论与原始事实，支持调查过程交接。</w:t>
+                        </w:r>
+                      </w:p>
+                    </w:txbxContent>
+                  </wps:txbx>
+                  <wps:bodyPr rot="0" vert="horz" wrap="square" lIns="0" rIns="0" tIns="25400" bIns="25400" anchor="t">
+                    <a:noAutofit/>
+                  </wps:bodyPr>
+                </wps:wsp>
+              </a:graphicData>
+            </a:graphic>
+          </wp:anchor>
+        </w:drawing>
+      </w:r>
+      <w:r>
+        <w:drawing>
+          <wp:anchor distT="0" distB="0" distL="0" distR="0" simplePos="0" relativeHeight="251660069" behindDoc="0" locked="0" layoutInCell="1" allowOverlap="1">
+            <wp:simplePos x="0" y="0"/>
+            <wp:positionH relativeFrom="page">
+              <wp:posOffset>431800</wp:posOffset>
+            </wp:positionH>
+            <wp:positionV relativeFrom="page">
+              <wp:posOffset>10023784</wp:posOffset>
+            </wp:positionV>
+            <wp:extent cx="6696710" cy="434340"/>
+            <wp:effectExtent l="0" t="0" r="0" b="0"/>
+            <wp:wrapNone/>
+            <wp:docPr id="69" name="bullet-69"/>
+            <wp:cNvGraphicFramePr/>
+            <a:graphic xmlns:a="http://schemas.openxmlformats.org/drawingml/2006/main">
+              <a:graphicData uri="http://schemas.microsoft.com/office/word/2010/wordprocessingShape">
+                <wps:wsp>
+                  <wps:cNvPr id="70" name="bullet-69-text"/>
+                  <wps:cNvSpPr txBox="1"/>
+                  <wps:spPr>
+                    <a:xfrm>
+                      <a:off x="0" y="0"/>
+                      <a:ext cx="6696710" cy="434340"/>
                     </a:xfrm>
                     <a:prstGeom prst="rect">
                       <a:avLst/>
@@ -2298,10 +2587,13 @@
                             <w:ilvl w:val="0"/>
                             <w:numId w:val="10"/>
                           </w:numPr>
+                          <w:kinsoku w:val="1"/>
+                          <w:wordWrap w:val="1"/>
+                          <w:overflowPunct w:val="0"/>
                           <w:snapToGrid w:val="0"/>
                           <w:spacing w:before="0" w:after="0" w:line="288" w:lineRule="auto"/>
                           <w:ind w:left="142" w:hanging="142"/>
-                          <w:jc w:val="both"/>
+                          <w:jc w:val="left"/>
                         </w:pPr>
                         <w:r>
                           <w:rPr>
@@ -2312,334 +2604,7 @@
                             <w:u w:val="none"/>
                             <w:rFonts w:ascii="Times New Roman" w:hAnsi="Times New Roman" w:cs="Times New Roman" w:eastAsia="KaiTi"/>
                             <w:szCs w:val="21"/>
-                          </w:rPr>
-                          <w:t>项目职责：</w:t>
-                        </w:r>
-                        <w:r>
-                          <w:rPr>
-                            <w:b/>
-                            <w:i w:val="0"/>
-                            <w:color w:val="262626"/>
-                            <w:sz w:val="21"/>
-                            <w:u w:val="none"/>
-                            <w:rFonts w:ascii="Times New Roman" w:hAnsi="Times New Roman" w:cs="Times New Roman" w:eastAsia="KaiTi"/>
-                            <w:szCs w:val="21"/>
-                          </w:rPr>
-                          <w:t>作为项目 Owner，负责事件模型、关联接口与分析页面的设计，明确证据保留要求，组织端到端联调及边界条件验证。</w:t>
-                        </w:r>
-                      </w:p>
-                    </w:txbxContent>
-                  </wps:txbx>
-                  <wps:bodyPr rot="0" vert="horz" wrap="square" lIns="0" rIns="0" tIns="25400" bIns="12700" anchor="t">
-                    <a:noAutofit/>
-                  </wps:bodyPr>
-                </wps:wsp>
-              </a:graphicData>
-            </a:graphic>
-          </wp:anchor>
-        </w:drawing>
-      </w:r>
-      <w:r>
-        <w:drawing>
-          <wp:anchor distT="0" distB="0" distL="0" distR="0" simplePos="0" relativeHeight="251660067" behindDoc="0" locked="0" layoutInCell="1" allowOverlap="1">
-            <wp:simplePos x="0" y="0"/>
-            <wp:positionH relativeFrom="page">
-              <wp:posOffset>431800</wp:posOffset>
-            </wp:positionH>
-            <wp:positionV relativeFrom="page">
-              <wp:posOffset>8677253</wp:posOffset>
-            </wp:positionV>
-            <wp:extent cx="6696710" cy="433735"/>
-            <wp:effectExtent l="0" t="0" r="0" b="0"/>
-            <wp:wrapNone/>
-            <wp:docPr id="67" name="bullet-67"/>
-            <wp:cNvGraphicFramePr/>
-            <a:graphic xmlns:a="http://schemas.openxmlformats.org/drawingml/2006/main">
-              <a:graphicData uri="http://schemas.microsoft.com/office/word/2010/wordprocessingShape">
-                <wps:wsp>
-                  <wps:cNvPr id="68" name="bullet-67-text"/>
-                  <wps:cNvSpPr txBox="1"/>
-                  <wps:spPr>
-                    <a:xfrm>
-                      <a:off x="0" y="0"/>
-                      <a:ext cx="6696710" cy="433735"/>
-                    </a:xfrm>
-                    <a:prstGeom prst="rect">
-                      <a:avLst/>
-                    </a:prstGeom>
-                    <a:noFill/>
-                    <a:ln>
-                      <a:noFill/>
-                    </a:ln>
-                  </wps:spPr>
-                  <wps:txbx>
-                    <w:txbxContent>
-                      <w:p>
-                        <w:pPr>
-                          <w:numPr>
-                            <w:ilvl w:val="1"/>
-                            <w:numId w:val="10"/>
-                          </w:numPr>
-                          <w:snapToGrid w:val="0"/>
-                          <w:spacing w:before="0" w:after="0" w:line="288" w:lineRule="auto"/>
-                          <w:ind w:left="255" w:hanging="142"/>
-                          <w:jc w:val="both"/>
-                        </w:pPr>
-                        <w:r>
-                          <w:rPr>
-                            <w:b/>
-                            <w:i w:val="0"/>
-                            <w:color w:val="262626"/>
-                            <w:sz w:val="21"/>
-                            <w:u w:val="none"/>
-                            <w:rFonts w:ascii="Times New Roman" w:hAnsi="Times New Roman" w:cs="Times New Roman" w:eastAsia="KaiTi"/>
-                            <w:szCs w:val="21"/>
-                          </w:rPr>
-                          <w:t>事件接入：</w:t>
-                        </w:r>
-                        <w:r>
-                          <w:rPr>
-                            <w:b w:val="0"/>
-                            <w:i w:val="0"/>
-                            <w:color w:val="262626"/>
-                            <w:sz w:val="21"/>
-                            <w:u w:val="none"/>
-                            <w:rFonts w:ascii="Times New Roman" w:hAnsi="Times New Roman" w:cs="Times New Roman" w:eastAsia="KaiTi"/>
-                            <w:szCs w:val="21"/>
-                          </w:rPr>
-                          <w:t>使用 Go 接入事件流，通过 Kafka 处理异步消息；统一时间、主体和来源字段，以关联标识连接原始记录、检索结果与调查对象。</w:t>
-                        </w:r>
-                      </w:p>
-                    </w:txbxContent>
-                  </wps:txbx>
-                  <wps:bodyPr rot="0" vert="horz" wrap="square" lIns="0" rIns="0" tIns="25400" bIns="12700" anchor="t">
-                    <a:noAutofit/>
-                  </wps:bodyPr>
-                </wps:wsp>
-              </a:graphicData>
-            </a:graphic>
-          </wp:anchor>
-        </w:drawing>
-      </w:r>
-      <w:r>
-        <w:drawing>
-          <wp:anchor distT="0" distB="0" distL="0" distR="0" simplePos="0" relativeHeight="251660069" behindDoc="0" locked="0" layoutInCell="1" allowOverlap="1">
-            <wp:simplePos x="0" y="0"/>
-            <wp:positionH relativeFrom="page">
-              <wp:posOffset>431800</wp:posOffset>
-            </wp:positionH>
-            <wp:positionV relativeFrom="page">
-              <wp:posOffset>9117338</wp:posOffset>
-            </wp:positionV>
-            <wp:extent cx="6696710" cy="434109"/>
-            <wp:effectExtent l="0" t="0" r="0" b="0"/>
-            <wp:wrapNone/>
-            <wp:docPr id="69" name="bullet-69"/>
-            <wp:cNvGraphicFramePr/>
-            <a:graphic xmlns:a="http://schemas.openxmlformats.org/drawingml/2006/main">
-              <a:graphicData uri="http://schemas.microsoft.com/office/word/2010/wordprocessingShape">
-                <wps:wsp>
-                  <wps:cNvPr id="70" name="bullet-69-text"/>
-                  <wps:cNvSpPr txBox="1"/>
-                  <wps:spPr>
-                    <a:xfrm>
-                      <a:off x="0" y="0"/>
-                      <a:ext cx="6696710" cy="434109"/>
-                    </a:xfrm>
-                    <a:prstGeom prst="rect">
-                      <a:avLst/>
-                    </a:prstGeom>
-                    <a:noFill/>
-                    <a:ln>
-                      <a:noFill/>
-                    </a:ln>
-                  </wps:spPr>
-                  <wps:txbx>
-                    <w:txbxContent>
-                      <w:p>
-                        <w:pPr>
-                          <w:numPr>
-                            <w:ilvl w:val="1"/>
-                            <w:numId w:val="10"/>
-                          </w:numPr>
-                          <w:snapToGrid w:val="0"/>
-                          <w:spacing w:before="0" w:after="0" w:line="288" w:lineRule="auto"/>
-                          <w:ind w:left="255" w:hanging="142"/>
-                          <w:jc w:val="both"/>
-                        </w:pPr>
-                        <w:r>
-                          <w:rPr>
-                            <w:b/>
-                            <w:i w:val="0"/>
-                            <w:color w:val="262626"/>
-                            <w:sz w:val="21"/>
-                            <w:u w:val="none"/>
-                            <w:rFonts w:ascii="Times New Roman" w:hAnsi="Times New Roman" w:cs="Times New Roman" w:eastAsia="KaiTi"/>
-                            <w:szCs w:val="21"/>
-                          </w:rPr>
-                          <w:t>证据呈现：</w:t>
-                        </w:r>
-                        <w:r>
-                          <w:rPr>
-                            <w:b w:val="0"/>
-                            <w:i w:val="0"/>
-                            <w:color w:val="262626"/>
-                            <w:sz w:val="21"/>
-                            <w:u w:val="none"/>
-                            <w:rFonts w:ascii="Times New Roman" w:hAnsi="Times New Roman" w:cs="Times New Roman" w:eastAsia="KaiTi"/>
-                            <w:szCs w:val="21"/>
-                          </w:rPr>
-                          <w:t>以 React 构建事件时间线和证据详情页，将分析结论与对应来源一并展示；保留查询条件和原始记录入口，便于复核关联依据。</w:t>
-                        </w:r>
-                      </w:p>
-                    </w:txbxContent>
-                  </wps:txbx>
-                  <wps:bodyPr rot="0" vert="horz" wrap="square" lIns="0" rIns="0" tIns="25400" bIns="12700" anchor="t">
-                    <a:noAutofit/>
-                  </wps:bodyPr>
-                </wps:wsp>
-              </a:graphicData>
-            </a:graphic>
-          </wp:anchor>
-        </w:drawing>
-      </w:r>
-      <w:r>
-        <w:drawing>
-          <wp:anchor distT="0" distB="0" distL="0" distR="0" simplePos="0" relativeHeight="251660071" behindDoc="0" locked="0" layoutInCell="1" allowOverlap="1">
-            <wp:simplePos x="0" y="0"/>
-            <wp:positionH relativeFrom="page">
-              <wp:posOffset>431800</wp:posOffset>
-            </wp:positionH>
-            <wp:positionV relativeFrom="page">
-              <wp:posOffset>9557797</wp:posOffset>
-            </wp:positionV>
-            <wp:extent cx="6696710" cy="433848"/>
-            <wp:effectExtent l="0" t="0" r="0" b="0"/>
-            <wp:wrapNone/>
-            <wp:docPr id="71" name="bullet-71"/>
-            <wp:cNvGraphicFramePr/>
-            <a:graphic xmlns:a="http://schemas.openxmlformats.org/drawingml/2006/main">
-              <a:graphicData uri="http://schemas.microsoft.com/office/word/2010/wordprocessingShape">
-                <wps:wsp>
-                  <wps:cNvPr id="72" name="bullet-71-text"/>
-                  <wps:cNvSpPr txBox="1"/>
-                  <wps:spPr>
-                    <a:xfrm>
-                      <a:off x="0" y="0"/>
-                      <a:ext cx="6696710" cy="433848"/>
-                    </a:xfrm>
-                    <a:prstGeom prst="rect">
-                      <a:avLst/>
-                    </a:prstGeom>
-                    <a:noFill/>
-                    <a:ln>
-                      <a:noFill/>
-                    </a:ln>
-                  </wps:spPr>
-                  <wps:txbx>
-                    <w:txbxContent>
-                      <w:p>
-                        <w:pPr>
-                          <w:numPr>
-                            <w:ilvl w:val="1"/>
-                            <w:numId w:val="10"/>
-                          </w:numPr>
-                          <w:snapToGrid w:val="0"/>
-                          <w:spacing w:before="0" w:after="0" w:line="288" w:lineRule="auto"/>
-                          <w:ind w:left="255" w:hanging="142"/>
-                          <w:jc w:val="both"/>
-                        </w:pPr>
-                        <w:r>
-                          <w:rPr>
-                            <w:b/>
-                            <w:i w:val="0"/>
-                            <w:color w:val="262626"/>
-                            <w:sz w:val="21"/>
-                            <w:u w:val="none"/>
-                            <w:rFonts w:ascii="Times New Roman" w:hAnsi="Times New Roman" w:cs="Times New Roman" w:eastAsia="KaiTi"/>
-                            <w:szCs w:val="21"/>
-                          </w:rPr>
-                          <w:t>工程验证：</w:t>
-                        </w:r>
-                        <w:r>
-                          <w:rPr>
-                            <w:b w:val="0"/>
-                            <w:i w:val="0"/>
-                            <w:color w:val="262626"/>
-                            <w:sz w:val="21"/>
-                            <w:u w:val="none"/>
-                            <w:rFonts w:ascii="Times New Roman" w:hAnsi="Times New Roman" w:cs="Times New Roman" w:eastAsia="KaiTi"/>
-                            <w:szCs w:val="21"/>
-                          </w:rPr>
-                          <w:t>针对迟到消息、重复事件和缺失字段构造测试样例，核对检索结果及页面展示的一致性；整理异常处理规则与数据接入约束。</w:t>
-                        </w:r>
-                      </w:p>
-                    </w:txbxContent>
-                  </wps:txbx>
-                  <wps:bodyPr rot="0" vert="horz" wrap="square" lIns="0" rIns="0" tIns="25400" bIns="12700" anchor="t">
-                    <a:noAutofit/>
-                  </wps:bodyPr>
-                </wps:wsp>
-              </a:graphicData>
-            </a:graphic>
-          </wp:anchor>
-        </w:drawing>
-      </w:r>
-      <w:r>
-        <w:drawing>
-          <wp:anchor distT="0" distB="0" distL="0" distR="0" simplePos="0" relativeHeight="251660073" behindDoc="0" locked="0" layoutInCell="1" allowOverlap="1">
-            <wp:simplePos x="0" y="0"/>
-            <wp:positionH relativeFrom="page">
-              <wp:posOffset>431800</wp:posOffset>
-            </wp:positionH>
-            <wp:positionV relativeFrom="page">
-              <wp:posOffset>9997995</wp:posOffset>
-            </wp:positionV>
-            <wp:extent cx="6696710" cy="434222"/>
-            <wp:effectExtent l="0" t="0" r="0" b="0"/>
-            <wp:wrapNone/>
-            <wp:docPr id="73" name="bullet-73"/>
-            <wp:cNvGraphicFramePr/>
-            <a:graphic xmlns:a="http://schemas.openxmlformats.org/drawingml/2006/main">
-              <a:graphicData uri="http://schemas.microsoft.com/office/word/2010/wordprocessingShape">
-                <wps:wsp>
-                  <wps:cNvPr id="74" name="bullet-73-text"/>
-                  <wps:cNvSpPr txBox="1"/>
-                  <wps:spPr>
-                    <a:xfrm>
-                      <a:off x="0" y="0"/>
-                      <a:ext cx="6696710" cy="434222"/>
-                    </a:xfrm>
-                    <a:prstGeom prst="rect">
-                      <a:avLst/>
-                    </a:prstGeom>
-                    <a:noFill/>
-                    <a:ln>
-                      <a:noFill/>
-                    </a:ln>
-                  </wps:spPr>
-                  <wps:txbx>
-                    <w:txbxContent>
-                      <w:p>
-                        <w:pPr>
-                          <w:numPr>
-                            <w:ilvl w:val="0"/>
-                            <w:numId w:val="10"/>
-                          </w:numPr>
-                          <w:snapToGrid w:val="0"/>
-                          <w:spacing w:before="0" w:after="0" w:line="288" w:lineRule="auto"/>
-                          <w:ind w:left="142" w:hanging="142"/>
-                          <w:jc w:val="both"/>
-                        </w:pPr>
-                        <w:r>
-                          <w:rPr>
-                            <w:b/>
-                            <w:i w:val="0"/>
-                            <w:color w:val="262626"/>
-                            <w:sz w:val="21"/>
-                            <w:u w:val="none"/>
-                            <w:rFonts w:ascii="Times New Roman" w:hAnsi="Times New Roman" w:cs="Times New Roman" w:eastAsia="KaiTi"/>
-                            <w:szCs w:val="21"/>
+                            <w:lang w:val="en-US" w:eastAsia="zh-CN"/>
                           </w:rPr>
                           <w:t>项目产出：</w:t>
                         </w:r>
@@ -2652,13 +2617,14 @@
                             <w:u w:val="none"/>
                             <w:rFonts w:ascii="Times New Roman" w:hAnsi="Times New Roman" w:cs="Times New Roman" w:eastAsia="KaiTi"/>
                             <w:szCs w:val="21"/>
+                            <w:lang w:val="en-US" w:eastAsia="zh-CN"/>
                           </w:rPr>
-                          <w:t>完成事件检索与证据回溯原型，提交数据接入说明和可复现验证样例；以事件时间线串联调查过程，支持分析人员复核证据及交接结论。</w:t>
+                          <w:t>交付事件检索与证据回溯原型，并整理字段映射、异常处理约定及验证样例，供新增来源按统一接口接入。</w:t>
                         </w:r>
                       </w:p>
                     </w:txbxContent>
                   </wps:txbx>
-                  <wps:bodyPr rot="0" vert="horz" wrap="square" lIns="0" rIns="0" tIns="25400" bIns="12700" anchor="t">
+                  <wps:bodyPr rot="0" vert="horz" wrap="square" lIns="0" rIns="0" tIns="25400" bIns="25400" anchor="t">
                     <a:noAutofit/>
                   </wps:bodyPr>
                 </wps:wsp>
@@ -2923,11 +2889,14 @@
         <w:rFonts w:asciiTheme="minorHAnsi" w:eastAsiaTheme="minorEastAsia" w:hAnsiTheme="minorHAnsi" w:cstheme="minorBidi"/>
         <w:sz w:val="22"/>
         <w:szCs w:val="22"/>
-        <w:lang w:val="en-US" w:eastAsia="en-US" w:bidi="ar-SA"/>
+        <w:lang w:val="en-US" w:eastAsia="zh-CN" w:bidi="ar-SA"/>
       </w:rPr>
     </w:rPrDefault>
     <w:pPrDefault>
       <w:pPr>
+        <w:kinsoku w:val="1"/>
+        <w:wordWrap w:val="1"/>
+        <w:overflowPunct w:val="0"/>
         <w:spacing w:after="200" w:line="276" w:lineRule="auto"/>
       </w:pPr>
     </w:pPrDefault>
@@ -3076,11 +3045,15 @@
     <w:qFormat/>
     <w:rsid w:val="00FC693F"/>
     <w:pPr>
+      <w:kinsoku w:val="1"/>
+      <w:wordWrap w:val="1"/>
+      <w:overflowPunct w:val="0"/>
       <w:spacing w:before="0" w:after="0" w:line="288" w:lineRule="auto"/>
     </w:pPr>
     <w:rPr>
       <w:sz w:val="21"/>
       <w:rFonts w:ascii="Times New Roman" w:hAnsi="Times New Roman" w:cs="Times New Roman" w:eastAsia="KaiTi"/>
+      <w:lang w:val="en-US" w:eastAsia="zh-CN"/>
     </w:rPr>
   </w:style>
   <w:style w:type="paragraph" w:styleId="Header">

</xml_diff>